<commit_message>
docs(requisitos): documento de requisitos e UML v2.3 com a revisao 0047-0061
- _dados_requisitos.json: 36 tabelas reextraidas dos models (campos, coluna fisica,
  relacoes, constraints, indices); RN/RF/RNF, atores e casos de uso revistos (agenda
  unificada, link_acesso, consentimento, formulario PRONTUARIO, compra_pacote_item,
  comissao em livro-razao, trilhas, cifragem, fila de e-mail, sem Celery/API REST);
  UC29/UC30, RN46-RN49, RF35/RF36, RNF22/RNF23 e tabela de rotas
- diagramas: classes, casos de uso, sequencia, estados e componentes atualizados e
  re-renderizados (-w 1800)
- gerar_requisitos.py: v2.3 (28/10/2026), texto da introducao, secao 10.3 Rotas,
  figura cabe na pagina e sem pagina em branco entre figuras em paisagem

Co-Authored-By: Claude Opus 5.5 <noreply@anthropic.com>
</commit_message>
<xml_diff>
--- a/docs/Requisitos-ShivaZen.docx
+++ b/docs/Requisitos-ShivaZen.docx
@@ -73,7 +73,7 @@
         <w:rPr>
           <w:sz w:val="22"/>
         </w:rPr>
-        <w:t>Versão 2.2  |  23/09/2026</w:t>
+        <w:t>Versão 2.3  |  28/10/2026</w:t>
       </w:r>
     </w:p>
     <w:p>
@@ -124,7 +124,7 @@
         <w:rPr>
           <w:sz w:val="21"/>
         </w:rPr>
-        <w:t>Este documento especifica os requisitos funcionais e não funcionais, as regras de negócio e a modelagem UML do sistema Shiva Zen — plataforma web de gestão da clínica de estética Jaqueline Aranha. O conteúdo foi derivado diretamente do código-fonte da aplicação (Django 5.2, migrations até 0046), garantindo aderência ao comportamento realmente implementado.</w:t>
+        <w:t>Este documento especifica os requisitos funcionais e não funcionais, as regras de negócio e a modelagem UML do sistema Shiva Zen — plataforma web de gestão da clínica de estética Jaqueline Aranha. O conteúdo foi derivado diretamente do código-fonte da aplicação (Django 5.2, migrations até 0061), garantindo aderência ao comportamento realmente implementado.</w:t>
       </w:r>
     </w:p>
     <w:p>
@@ -140,7 +140,7 @@
         <w:rPr>
           <w:sz w:val="21"/>
         </w:rPr>
-        <w:t>O sistema cobre o agendamento online público (sem senha: a cliente é identificada pelo celular, confirmado por código OTP via SMS em todo agendamento), com aceite da Política de Privacidade, consentimento para dado de saúde e termos do procedimento; a área "Meus agendamentos"; o portal do profissional; o painel administrativo (agenda, agendamento interno, clientes, prontuário com histórico, pacotes, promoções, comissões, NPS e depoimentos, termos, auditoria); rotinas automáticas (lembrete D-1, NPS, pacotes, aniversário, limpeza de status, retenção LGPD) e integrações externas (SMS Zenvia, WhatsApp Meta, e-mail, Google Calendar, Cloudflare Turnstile, Sentry).</w:t>
+        <w:t>O sistema cobre o agendamento online público (sem senha: a cliente é identificada pelo celular, confirmado por código OTP via SMS em todo agendamento), com aceite da Política de Privacidade, consentimento para dado de saúde, termos do procedimento e autorizações de comunicação com histórico; a área "Meus agendamentos" (reagendar e cancelar); o portal do profissional; o painel administrativo (agenda com grade e exceções, agendamento interno, clientes, prontuário com histórico, pacotes, promoções, comissões em livro-razão, NPS e depoimentos, termos, auditoria); rotinas automáticas (fila de e-mail, lembrete D-1, NPS, pacotes, aniversário, limpeza de status, retenção LGPD) e integrações externas (SMS Zenvia, WhatsApp Meta, e-mail, Google Calendar, Cloudflare Turnstile, Sentry).</w:t>
       </w:r>
     </w:p>
     <w:p>
@@ -156,7 +156,7 @@
         <w:rPr>
           <w:sz w:val="21"/>
         </w:rPr>
-        <w:t>Aplicação Django monolítica renderizada no servidor e servida por gunicorn (1 worker × 4 threads) em contêiner Docker no Railway, com PostgreSQL 18 como banco principal (invariantes garantidas por EXCLUDE, CHECK, UNIQUE parciais e triggers). As tarefas Celery rodam em modo síncrono (eager) e os jobs periódicos são disparados por um cron externo via HTTP autenticado; cache e sessão são locais, com Redis opcional. O front-end usa Vite, Tailwind CSS v4, Alpine.js (build CSP) e componentes django-cotton, com PWA. A regra de negócio reside em serviços, sinais de modelo e eventos de domínio (EventBus); o estado do atendimento é governado por uma máquina de estados (FSM). Detalhes nas seções 8 e 10.</w:t>
+        <w:t>Aplicação Django monolítica renderizada no servidor e servida por gunicorn (1 worker × 4 threads) em contêiner Docker no Railway, com PostgreSQL 18 como banco principal: 36 tabelas no padrão SQL, invariantes garantidas por EXCLUDE, CHECK, UNIQUE parciais e triggers, trilha de alterações por trigger, funções e views de relatório e procedures que concentram a retenção LGPD; o dado de saúde é gravado cifrado. Não há Celery: os jobs periódicos são funções disparadas por um cron externo via HTTP autenticado e o e-mail transacional é uma fila na própria tabela de notificações; cache e sessão são locais, com Redis opcional. O front-end usa Vite, Tailwind CSS v4, Alpine.js (build CSP) e componentes django-cotton, com PWA. A regra de negócio reside nos serviços — services/agenda concentra as regras de horário e services/atendimento os efeitos de cada mudança de status, aplicados na mesma transação da máquina de estados (FSM) do atendimento. Detalhes nas seções 8 e 10.</w:t>
       </w:r>
     </w:p>
     <w:p>
@@ -252,7 +252,7 @@
               <w:rPr>
                 <w:sz w:val="18"/>
               </w:rPr>
-              <w:t>Navega no site e agenda sem conta: a identidade é o celular, confirmado por código SMS em todo agendamento. Aceita a Política de Privacidade e os termos, consente o uso do dado de saúde, entra na lista de espera, responde NPS e fichas por link. Precisa ter 18 anos ou mais.</w:t>
+              <w:t>Navega no site e agenda sem conta: a identidade é o celular, confirmado por código SMS em todo agendamento. Aceita a Política de Privacidade, o consentimento para dado de saúde e os termos do procedimento, escolhe as autorizações de comunicação, entra na lista de espera e responde NPS por link. Precisa ter 18 anos ou mais.</w:t>
             </w:r>
           </w:p>
         </w:tc>
@@ -282,7 +282,7 @@
               <w:rPr>
                 <w:sz w:val="18"/>
               </w:rPr>
-              <w:t>Cliente com cadastro ativo (mesmo celular). Entra em "Meus agendamentos" por celular ou e-mail (o código vai ao celular do cadastro), reagenda (até 24 h antes), cancela, confirma presença pelo lembrete D-1 e exerce os direitos LGPD (exportar dados, descadastrar).</w:t>
+              <w:t>Cliente com cadastro ativo (mesmo celular). Entra em "Meus agendamentos" por celular ou e-mail (o código vai ao celular do cadastro), reagenda (até 24 h antes) e cancela pela sessão do portal, confirma presença pelo link do lembrete D-1, aceita termos pendentes e exerce os direitos LGPD (exportar dados, descadastrar).</w:t>
             </w:r>
           </w:p>
         </w:tc>
@@ -312,7 +312,7 @@
               <w:rPr>
                 <w:sz w:val="18"/>
               </w:rPr>
-              <w:t>Usuário PROFISSIONAL vinculado a um profissional ativo. Usa o portal /profissional/: agenda própria, aprova/rejeita os próprios pedidos, marca realizado (com termo aceito ou override auditado), anota a sessão e lê a ficha só das clientes com vínculo. Feed iCal, Google Calendar e push. 2FA opcional (obrigatório se configurado).</w:t>
+              <w:t>Usuário PROFISSIONAL vinculado a um profissional ativo, com 2FA obrigatório em produção. Usa o portal /profissional/: agenda própria, aprova/rejeita os próprios pedidos, marca realizado (com termo aceito ou override auditado), anota a sessão e lê a ficha só das clientes com vínculo. Gera o link do feed iCal, conecta o Google Calendar e ativa o push.</w:t>
             </w:r>
           </w:p>
         </w:tc>
@@ -342,7 +342,7 @@
               <w:rPr>
                 <w:sz w:val="18"/>
               </w:rPr>
-              <w:t>Usuário ADMIN (is_staff), com 2FA obrigatório. Painel completo, incluindo as tarefas de recepção: agenda, agendamento interno, aprovação, clientes e prontuário, profissionais, catálogo, pacotes, promoções, financeiro, comissões, NPS e depoimentos, lista de espera, formulários e termos, usuários, configurações, Branding e auditoria.</w:t>
+              <w:t>Usuário ADMIN (is_staff), com 2FA obrigatório. Painel completo, incluindo as tarefas de recepção: agenda, agendamento interno, aprovação, clientes, autorizações de comunicação e prontuário, profissionais e exceções de agenda, catálogo, pacotes, promoções, financeiro, comissões, NPS e depoimentos, lista de espera, formulários e termos, usuários, configurações, Branding e auditoria.</w:t>
             </w:r>
           </w:p>
         </w:tc>
@@ -372,7 +372,7 @@
               <w:rPr>
                 <w:sz w:val="18"/>
               </w:rPr>
-              <w:t>Agendador externo (cron-job.org ou Railway Cron) que chama POST /cron/run/&lt;job&gt;/ com o header X-Cron-Token: lembrete D-1, NPS, alerta de detrator, pacotes, aniversário, limpeza de status, retenção LGPD, housekeeping e feriados.</w:t>
+              <w:t>Agendador externo (cron-job.org ou Railway Cron) que chama POST /cron/run/&lt;job&gt;/ com o header X-Cron-Token, ou o comando rodar_job no servidor: fila de e-mail, lembrete D-1, NPS, alerta de detrator, pacotes, aniversário, limpeza de status, retenção LGPD, housekeeping e feriados. Sem Celery: o job roda dentro do request.</w:t>
             </w:r>
           </w:p>
         </w:tc>
@@ -614,7 +614,7 @@
               <w:rPr>
                 <w:sz w:val="18"/>
               </w:rPr>
-              <w:t>No agendamento, aceitar a Política de Privacidade e os termos do procedimento, consentir o uso do dado de saúde e responder a ficha de anamnese.</w:t>
+              <w:t>No agendamento, aceitar a Política de Privacidade e os termos do procedimento, consentir o uso do dado de saúde (termo SAÚDE), escolher as autorizações de comunicação e responder a ficha de anamnese.</w:t>
             </w:r>
           </w:p>
         </w:tc>
@@ -702,7 +702,7 @@
               <w:rPr>
                 <w:sz w:val="18"/>
               </w:rPr>
-              <w:t>Reagendar um atendimento até 24 h antes, escolhendo novo horário disponível.</w:t>
+              <w:t>Reagendar um atendimento até 24 h antes pelo portal, escolhendo novo horário disponível.</w:t>
             </w:r>
           </w:p>
         </w:tc>
@@ -746,7 +746,7 @@
               <w:rPr>
                 <w:sz w:val="18"/>
               </w:rPr>
-              <w:t>Cancelar um atendimento futuro.</w:t>
+              <w:t>Cancelar um atendimento futuro pelo portal.</w:t>
             </w:r>
           </w:p>
         </w:tc>
@@ -1010,7 +1010,7 @@
               <w:rPr>
                 <w:sz w:val="18"/>
               </w:rPr>
-              <w:t>Baixar os próprios dados (DSAR) com código SMS e descadastrar-se de marketing e pesquisas.</w:t>
+              <w:t>Baixar os próprios dados (DSAR) com código SMS, descadastrar-se de marketing e pesquisas por link e registrar o aviso de cookies.</w:t>
             </w:r>
           </w:p>
         </w:tc>
@@ -1098,7 +1098,7 @@
               <w:rPr>
                 <w:sz w:val="18"/>
               </w:rPr>
-              <w:t>Entrar com e-mail e senha, cadastrar e validar 2FA (obrigatório para ADMIN) e redefinir a senha por link.</w:t>
+              <w:t>Entrar com e-mail e senha, cadastrar e validar 2FA (obrigatório para ADMIN e PROFISSIONAL em produção), gerar códigos de backup e redefinir a senha por link.</w:t>
             </w:r>
           </w:p>
         </w:tc>
@@ -1230,7 +1230,7 @@
               <w:rPr>
                 <w:sz w:val="18"/>
               </w:rPr>
-              <w:t>Operar a agenda: lista com filtros, calendário com arrastar-e-soltar, mudança de status pela FSM, valor cobrado, link do termo e override "Realizado sem termo aceito".</w:t>
+              <w:t>Operar a agenda: lista com filtros por dia, calendário com arrastar-e-soltar (motivo detalhado da recusa), mudança de status pela FSM, valor cobrado, link do termo e override "Realizado sem termo aceito".</w:t>
             </w:r>
           </w:p>
         </w:tc>
@@ -1318,7 +1318,7 @@
               <w:rPr>
                 <w:sz w:val="18"/>
               </w:rPr>
-              <w:t>Registrar e consultar o prontuário com histórico de versões e as anotações de sessão.</w:t>
+              <w:t>Registrar e consultar o prontuário (com as perguntas do formulário PRONTUARIO) e o histórico de versões, e anotar as sessões.</w:t>
             </w:r>
           </w:p>
         </w:tc>
@@ -1362,7 +1362,7 @@
               <w:rPr>
                 <w:sz w:val="18"/>
               </w:rPr>
-              <w:t>Gerir clientes: busca, ficha com alertas, pacotes, histórico e edição validada (telefone/CPF/e-mail únicos).</w:t>
+              <w:t>Gerir clientes: busca sem acento, ficha com alertas, pacotes, histórico, autorizações de comunicação e edição validada (telefone/CPF/e-mail únicos).</w:t>
             </w:r>
           </w:p>
         </w:tc>
@@ -1406,7 +1406,7 @@
               <w:rPr>
                 <w:sz w:val="18"/>
               </w:rPr>
-              <w:t>Gerir profissionais (expediente, exceções, antecedências, novo link do feed iCal), procedimentos, preços, habilitações e bloqueios de agenda (inclusive para todos os profissionais).</w:t>
+              <w:t>Gerir profissionais (grade semanal, exceções — folga, horário diferente, bloqueio —, antecedências, novo link do feed iCal), procedimentos, preços, habilitações e bloqueios de agenda (inclusive para todos os profissionais).</w:t>
             </w:r>
           </w:p>
         </w:tc>
@@ -1450,7 +1450,7 @@
               <w:rPr>
                 <w:sz w:val="18"/>
               </w:rPr>
-              <w:t>Gerir pacotes: criar/editar, vender, acompanhar saldo e validade, cancelar com valor devolvido.</w:t>
+              <w:t>Gerir pacotes: criar/editar o catálogo, vender (itens congelados na venda), acompanhar saldo e validade, cancelar com valor devolvido.</w:t>
             </w:r>
           </w:p>
         </w:tc>
@@ -1538,7 +1538,7 @@
               <w:rPr>
                 <w:sz w:val="18"/>
               </w:rPr>
-              <w:t>Acompanhar dashboard e financeiro (faturamento, faltas, rankings), pagar comissões e exportar relatório em Excel.</w:t>
+              <w:t>Acompanhar dashboard e financeiro (faturamento, faltas, rankings), comissões em livro-razão (créditos, pagamentos, estornos e saldo por profissional), pagar comissões e exportar relatório em Excel.</w:t>
             </w:r>
           </w:p>
         </w:tc>
@@ -1670,7 +1670,7 @@
               <w:rPr>
                 <w:sz w:val="18"/>
               </w:rPr>
-              <w:t>Gerir formulários de anamnese e termos versionados, e acompanhar a conformidade dos aceites.</w:t>
+              <w:t>Gerir formulários (anamnese, pesquisa e perguntas do prontuário) e termos versionados (LGPD, saúde, procedimento), e acompanhar a conformidade dos aceites.</w:t>
             </w:r>
           </w:p>
         </w:tc>
@@ -1714,7 +1714,7 @@
               <w:rPr>
                 <w:sz w:val="18"/>
               </w:rPr>
-              <w:t>Gerir usuários da equipe, configurações, Branding (contatos e marca), notificações e consultar a auditoria.</w:t>
+              <w:t>Gerir usuários da equipe, configurações, Branding (contatos e marca), notificações, pré-visualizar e-mails e consultar a auditoria.</w:t>
             </w:r>
           </w:p>
         </w:tc>
@@ -1758,7 +1758,7 @@
               <w:rPr>
                 <w:sz w:val="18"/>
               </w:rPr>
-              <w:t>Executar jobs periódicos por cron HTTP autenticado: lembrete D-1, NPS, alerta de detrator, pacotes, aniversário, limpeza de status, retenção LGPD, housekeeping e feriados.</w:t>
+              <w:t>Executar jobs periódicos por cron HTTP autenticado ou pelo comando rodar_job: fila de e-mail, lembrete D-1, NPS, alerta de detrator, pacotes, aniversário, limpeza de status, retenção LGPD, housekeeping e feriados.</w:t>
             </w:r>
           </w:p>
         </w:tc>
@@ -1846,7 +1846,7 @@
               <w:rPr>
                 <w:sz w:val="18"/>
               </w:rPr>
-              <w:t>Calcular comissão, liberar/estornar cashback e debitar sessão de pacote automaticamente conforme as transições.</w:t>
+              <w:t>Ao mudar o status do atendimento, aplicar na mesma transação: débito de sessão de pacote, comissão (crédito/estorno), cashback, faltas, retorno e aviso à lista de espera.</w:t>
             </w:r>
           </w:p>
         </w:tc>
@@ -1934,7 +1934,7 @@
               <w:rPr>
                 <w:sz w:val="18"/>
               </w:rPr>
-              <w:t>Consultar a API REST somente leitura (profissionais, procedimentos, clientes com PII mascarada, atendimentos) e a documentação Swagger.</w:t>
+              <w:t>Na ficha da cliente, ver as autorizações de comunicação por canal, revogá-las a pedido e registrar autorização com justificativa (histórico preservado).</w:t>
             </w:r>
           </w:p>
         </w:tc>
@@ -1978,7 +1978,95 @@
               <w:rPr>
                 <w:sz w:val="18"/>
               </w:rPr>
-              <w:t>Assinar o feed iCal da própria agenda e conectar o Google Calendar.</w:t>
+              <w:t>Gerar o link do feed iCal da própria agenda (exibido uma única vez) e conectar o Google Calendar.</w:t>
+            </w:r>
+          </w:p>
+        </w:tc>
+      </w:tr>
+      <w:tr>
+        <w:tc>
+          <w:tcPr>
+            <w:tcW w:type="dxa" w:w="864"/>
+          </w:tcPr>
+          <w:p>
+            <w:r/>
+            <w:r>
+              <w:rPr>
+                <w:sz w:val="18"/>
+              </w:rPr>
+              <w:t>RF35</w:t>
+            </w:r>
+          </w:p>
+        </w:tc>
+        <w:tc>
+          <w:tcPr>
+            <w:tcW w:type="dxa" w:w="2016"/>
+          </w:tcPr>
+          <w:p>
+            <w:r/>
+            <w:r>
+              <w:rPr>
+                <w:sz w:val="18"/>
+              </w:rPr>
+              <w:t>Sistema</w:t>
+            </w:r>
+          </w:p>
+        </w:tc>
+        <w:tc>
+          <w:tcPr>
+            <w:tcW w:type="dxa" w:w="6768"/>
+          </w:tcPr>
+          <w:p>
+            <w:r/>
+            <w:r>
+              <w:rPr>
+                <w:sz w:val="18"/>
+              </w:rPr>
+              <w:t>Enfileirar os e-mails transacionais na própria notificação e reenviá-los com espera crescente até 5 tentativas.</w:t>
+            </w:r>
+          </w:p>
+        </w:tc>
+      </w:tr>
+      <w:tr>
+        <w:tc>
+          <w:tcPr>
+            <w:tcW w:type="dxa" w:w="864"/>
+          </w:tcPr>
+          <w:p>
+            <w:r/>
+            <w:r>
+              <w:rPr>
+                <w:sz w:val="18"/>
+              </w:rPr>
+              <w:t>RF36</w:t>
+            </w:r>
+          </w:p>
+        </w:tc>
+        <w:tc>
+          <w:tcPr>
+            <w:tcW w:type="dxa" w:w="2016"/>
+          </w:tcPr>
+          <w:p>
+            <w:r/>
+            <w:r>
+              <w:rPr>
+                <w:sz w:val="18"/>
+              </w:rPr>
+              <w:t>Sistema</w:t>
+            </w:r>
+          </w:p>
+        </w:tc>
+        <w:tc>
+          <w:tcPr>
+            <w:tcW w:type="dxa" w:w="6768"/>
+          </w:tcPr>
+          <w:p>
+            <w:r/>
+            <w:r>
+              <w:rPr>
+                <w:sz w:val="18"/>
+              </w:rPr>
+              <w:t>Registrar automaticamente, por trigger, toda alteração das tabelas sensíveis com autor, IP e origem.</w:t>
             </w:r>
           </w:p>
         </w:tc>
@@ -2190,7 +2278,7 @@
               <w:rPr>
                 <w:sz w:val="18"/>
               </w:rPr>
-              <w:t>2FA TOTP obrigatório para ADMIN, conferido a cada request em painel, API, Django admin e push; sem tela de login paralela; recuperação só por comando no servidor.</w:t>
+              <w:t>2FA TOTP obrigatório para ADMIN e PROFISSIONAL em produção, conferido a cada request no painel, portal, Django admin e push; códigos de backup; sem tela de login paralela; recuperação só por comando no servidor.</w:t>
             </w:r>
           </w:p>
         </w:tc>
@@ -2278,7 +2366,7 @@
               <w:rPr>
                 <w:sz w:val="18"/>
               </w:rPr>
-              <w:t>Rate-limit em camadas: cotas de SMS (telefone, IP, global), limites por IP nos endpoints públicos, django-axes no login, throttling da API; captcha Turnstile no pedido de código.</w:t>
+              <w:t>Rate-limit em camadas: cotas de SMS (telefone, IP, global), limites por IP nos endpoints públicos, django-axes no login; captcha Turnstile no pedido de código.</w:t>
             </w:r>
           </w:p>
         </w:tc>
@@ -2322,7 +2410,7 @@
               <w:rPr>
                 <w:sz w:val="18"/>
               </w:rPr>
-              <w:t>Áreas privadas sem cache no navegador (no-store), Referrer-Policy no-referrer nas rotas com token, Clear-Site-Data no logout, tokens redigidos no access log e no Sentry.</w:t>
+              <w:t>Áreas privadas sem cache no navegador (no-store), Referrer-Policy no-referrer nas rotas com token, X-Robots-Tag noindex nas privadas, Clear-Site-Data no logout; links públicos guardam só o SHA-256 do token; tokens redigidos no access log e no Sentry.</w:t>
             </w:r>
           </w:p>
         </w:tc>
@@ -2366,7 +2454,7 @@
               <w:rPr>
                 <w:sz w:val="18"/>
               </w:rPr>
-              <w:t>Segredos só em variáveis de ambiente; SECRET_KEY obrigatória fora de DEBUG; DJANGO_ENV inválido derruba o boot; system checks (aranha.W001–W009) apontam configuração de produção faltando.</w:t>
+              <w:t>Segredos só em variáveis de ambiente; SECRET_KEY obrigatória fora de DEBUG; DJANGO_ENV inválido derruba o boot; system checks (aranha.W001–W014) apontam configuração de produção faltando.</w:t>
             </w:r>
           </w:p>
         </w:tc>
@@ -2410,7 +2498,7 @@
               <w:rPr>
                 <w:sz w:val="18"/>
               </w:rPr>
-              <w:t>Canais de mensagem falham fechado: sem credencial nada é enviado nem marcado como enviado; I/O externo só após o commit.</w:t>
+              <w:t>Canais de mensagem falham fechado: sem credencial nada é enviado nem marcado como enviado; I/O externo só após o commit; e-mail transacional em fila no banco com reenvio (sem Celery, nada roda em segundo plano sem rastro).</w:t>
             </w:r>
           </w:p>
         </w:tc>
@@ -2454,7 +2542,7 @@
               <w:rPr>
                 <w:sz w:val="18"/>
               </w:rPr>
-              <w:t>Consentimentos granulares com data e IP; aceite da política e dos termos com prova (IP, navegador, SHA-256); consentimento específico para dado de saúde (art. 11).</w:t>
+              <w:t>Autorizações de comunicação por finalidade × canal em histórico append-only (texto exibido, IP, navegador, autor); aceite da política, do termo de saúde (art. 11) e dos termos do procedimento com prova (IP, navegador, SHA-256).</w:t>
             </w:r>
           </w:p>
         </w:tc>
@@ -2498,7 +2586,7 @@
               <w:rPr>
                 <w:sz w:val="18"/>
               </w:rPr>
-              <w:t>Retenção automatizada (OTP, notificações, auditoria, logs de login, clientes inativas/excluídas, fichas de pedidos não realizados, lista de espera) e direito ao esquecimento com pseudonimização.</w:t>
+              <w:t>Retenção automatizada (OTP, notificações, auditoria, trilha, links, logs de login, clientes inativas/excluídas, fichas de pedidos não realizados, lista de espera) e esquecimento com pseudonimização, executados por procedures do Postgres; inventário LGPD coluna a coluna conferido por teste.</w:t>
             </w:r>
           </w:p>
         </w:tc>
@@ -2586,7 +2674,7 @@
               <w:rPr>
                 <w:sz w:val="18"/>
               </w:rPr>
-              <w:t>Trilha de auditoria com autor, IP e detalhes mascarados; PII mascarada em logs, API e Sentry (send_default_pii=False).</w:t>
+              <w:t>Trilha de auditoria (log_auditoria) e trilha de dados (historico_alteracao, por trigger) com autor, IP e origem, ambas append-only no banco; PII mascarada em logs e no Sentry (send_default_pii=False).</w:t>
             </w:r>
           </w:p>
         </w:tc>
@@ -2630,7 +2718,7 @@
               <w:rPr>
                 <w:sz w:val="18"/>
               </w:rPr>
-              <w:t>Invariantes no banco: EXCLUDE anti double-booking, UNIQUE parciais, CHECKs, triggers de imutabilidade (ledger, prova de aceite, termo aceito, histórico do prontuário) e FKs PROTECT no histórico clínico/financeiro.</w:t>
+              <w:t>Invariantes no banco: EXCLUDE (atendimento, grade, folgas), UNIQUE parciais, CHECKs, 46 triggers (atualizado_em, imutabilidade de ledgers, prova de aceite, termo aceito, prontuário, anotação, item de pacote, consentimento e link; validação de consumo e de comissão) e FKs PROTECT no histórico clínico/financeiro.</w:t>
             </w:r>
           </w:p>
         </w:tc>
@@ -2674,7 +2762,7 @@
               <w:rPr>
                 <w:sz w:val="18"/>
               </w:rPr>
-              <w:t>Migrações aplicadas numa transação única com lock_timeout no pre-deploy (tudo ou nada); rollback de produção por restauração do backup.</w:t>
+              <w:t>Migrações aplicadas numa transação única com lock_timeout no pre-deploy (tudo ou nada); data migrations com pré-checagem que aborta listando os registros; rollback de produção por restauração do backup.</w:t>
             </w:r>
           </w:p>
         </w:tc>
@@ -2718,7 +2806,7 @@
               <w:rPr>
                 <w:sz w:val="18"/>
               </w:rPr>
-              <w:t>FSM com transições validadas sob lock e auditadas; efeitos idempotentes (1 retorno por origem, 1 consumo e 1 comissão por atendimento, cashback único).</w:t>
+              <w:t>FSM com transições validadas sob lock e auditadas; efeitos explícitos (services/atendimento) na mesma transação do status; efeitos idempotentes (1 retorno por origem, 1 consumo e 1 crédito de comissão por atendimento, cashback único).</w:t>
             </w:r>
           </w:p>
         </w:tc>
@@ -2762,7 +2850,7 @@
               <w:rPr>
                 <w:sz w:val="18"/>
               </w:rPr>
-              <w:t>gunicorn 1 worker × 4 threads com cache local (Redis opcional para escalar); estáticos comprimidos e com hash (WhiteNoise); cache do Branding; índices compostos para agenda e relatórios.</w:t>
+              <w:t>gunicorn 1 worker × 4 threads com cache local (Redis opcional para escalar); estáticos comprimidos e com hash (WhiteNoise); índices das consultas reais, busca trigram sem acento, alertas de saúde em lote, statement_timeout na conexão e consultas lentas pelo pg_stat_statements.</w:t>
             </w:r>
           </w:p>
         </w:tc>
@@ -2806,7 +2894,7 @@
               <w:rPr>
                 <w:sz w:val="18"/>
               </w:rPr>
-              <w:t>Healthchecks /healthz/ (liveness + build do front) e /health/ (banco, cache, front); Sentry opcional; logs JSON em produção.</w:t>
+              <w:t>Healthchecks /healthz/ (liveness + build do front) e /health/ (banco, cache, front); Sentry opcional; logs JSON em produção; jobs devolvem 500 quando falham (o cron alerta).</w:t>
             </w:r>
           </w:p>
         </w:tc>
@@ -2850,7 +2938,7 @@
               <w:rPr>
                 <w:sz w:val="18"/>
               </w:rPr>
-              <w:t>Cerca de 1.060 testes automatizados; CI com SQLite, Postgres 18 (bloqueante), build do front, build da imagem Docker e auditoria de dependências.</w:t>
+              <w:t>Cerca de 1.500 testes automatizados em 77 arquivos; CI com SQLite, Postgres 18 (conformidade do padrão SQL, trilha e paridade das funções com o Python), data migrations em paralelo, build do front, wizard no Chromium (Playwright), imagem Docker e pip-audit bloqueante; ruff, import-linter, mypy nos services e cobertura com catraca (≈ 87 %).</w:t>
             </w:r>
           </w:p>
         </w:tc>
@@ -2894,7 +2982,7 @@
               <w:rPr>
                 <w:sz w:val="18"/>
               </w:rPr>
-              <w:t>Interface pt-BR em tom de estética e bem-estar; contraste AA nos tokens; wizard operável por teclado; tema claro/escuro; PWA instalável para o site e para a equipe.</w:t>
+              <w:t>Interface pt-BR em tom de estética e bem-estar; contraste AA nos tokens, foco visível, formulários acessíveis, diálogos nativos e respeito a prefers-reduced-motion; wizard com botão Continuar operável por teclado; tema claro/escuro automático; fontes locais; PWA instalável para o site e para a equipe.</w:t>
             </w:r>
           </w:p>
         </w:tc>
@@ -2938,7 +3026,7 @@
               <w:rPr>
                 <w:sz w:val="18"/>
               </w:rPr>
-              <w:t>Camadas views → services/utils → models; fontes únicas (SlotService, preços, Branding, termos); componentes cotton e Alpine CSP; documentação viva e requisitos gerados a partir de dados versionados.</w:t>
+              <w:t>Camadas views → services/utils → models verificadas por import-linter; fontes únicas (services/agenda, services/atendimento, SlotService, preços, Branding, termos, consentimentos); recusas tipadas (RegraDeNegocio); Django Forms no painel; componentes cotton e Alpine CSP; documentação viva e requisitos gerados a partir de dados versionados.</w:t>
             </w:r>
           </w:p>
         </w:tc>
@@ -2983,6 +3071,94 @@
                 <w:sz w:val="18"/>
               </w:rPr>
               <w:t>Imagem Docker multi-stage (Node para o front, Python para a app) com dependências fixadas (requirements.lock), usuário não-root e healthcheck; deploy no Railway com pre-deploy de migração e criação do ADMIN.</w:t>
+            </w:r>
+          </w:p>
+        </w:tc>
+      </w:tr>
+      <w:tr>
+        <w:tc>
+          <w:tcPr>
+            <w:tcW w:type="dxa" w:w="864"/>
+          </w:tcPr>
+          <w:p>
+            <w:r/>
+            <w:r>
+              <w:rPr>
+                <w:sz w:val="18"/>
+              </w:rPr>
+              <w:t>RNF22</w:t>
+            </w:r>
+          </w:p>
+        </w:tc>
+        <w:tc>
+          <w:tcPr>
+            <w:tcW w:type="dxa" w:w="1728"/>
+          </w:tcPr>
+          <w:p>
+            <w:r/>
+            <w:r>
+              <w:rPr>
+                <w:sz w:val="18"/>
+              </w:rPr>
+              <w:t>Privacidade</w:t>
+            </w:r>
+          </w:p>
+        </w:tc>
+        <w:tc>
+          <w:tcPr>
+            <w:tcW w:type="dxa" w:w="7056"/>
+          </w:tcPr>
+          <w:p>
+            <w:r/>
+            <w:r>
+              <w:rPr>
+                <w:sz w:val="18"/>
+              </w:rPr>
+              <w:t>Dado de saúde e token OAuth cifrados em repouso na aplicação (Fernet, CHAVES_CIFRAGEM com subchave por finalidade e rotação por comando): dump ou backup sem a chave não expõe a ficha.</w:t>
+            </w:r>
+          </w:p>
+        </w:tc>
+      </w:tr>
+      <w:tr>
+        <w:tc>
+          <w:tcPr>
+            <w:tcW w:type="dxa" w:w="864"/>
+          </w:tcPr>
+          <w:p>
+            <w:r/>
+            <w:r>
+              <w:rPr>
+                <w:sz w:val="18"/>
+              </w:rPr>
+              <w:t>RNF23</w:t>
+            </w:r>
+          </w:p>
+        </w:tc>
+        <w:tc>
+          <w:tcPr>
+            <w:tcW w:type="dxa" w:w="1728"/>
+          </w:tcPr>
+          <w:p>
+            <w:r/>
+            <w:r>
+              <w:rPr>
+                <w:sz w:val="18"/>
+              </w:rPr>
+              <w:t>Manutenibilidade</w:t>
+            </w:r>
+          </w:p>
+        </w:tc>
+        <w:tc>
+          <w:tcPr>
+            <w:tcW w:type="dxa" w:w="7056"/>
+          </w:tcPr>
+          <w:p>
+            <w:r/>
+            <w:r>
+              <w:rPr>
+                <w:sz w:val="18"/>
+              </w:rPr>
+              <w:t>Padrão SQL em todas as tabelas (nomes snake_case PT-BR, prefixos pk_/fk_/uq_/ck_/ix_/ex_/tg_/fn_, ON DELETE real, COMMENT em toda tabela, defaults no banco), conferido por teste no pg_catalog.</w:t>
             </w:r>
           </w:p>
         </w:tc>
@@ -3458,7 +3634,7 @@
               <w:rPr>
                 <w:sz w:val="18"/>
               </w:rPr>
-              <w:t>SlotService (fonte única): slots de 30 min considerando feriado, exceção (folga/horário diferente), expediente semanal, atendimentos ativos sobrepostos na duração inteira + buffer do procedimento, bloqueios pontuais/recorrentes do profissional ou globais, antecedência mínima e máxima.</w:t>
+              <w:t>SlotService (fonte única): slots de 30 min a partir da grade semanal (agenda_horario) e das exceções (agenda_excecao: folga do profissional, feriado/recesso da clínica, horário diferente, bloqueios pontuais e recorrentes do profissional ou de todos), atendimentos ativos sobrepostos na duração inteira + intervalo do procedimento, antecedência mínima e máxima.</w:t>
             </w:r>
           </w:p>
         </w:tc>
@@ -3502,7 +3678,7 @@
               <w:rPr>
                 <w:sz w:val="18"/>
               </w:rPr>
-              <w:t>Um profissional não pode ter dois atendimentos ativos sobrepostos: trava de 30 s no cache, SELECT FOR UPDATE e constraint EXCLUDE no Postgres. Corrida perdida gera a mensagem "Este horário acabou de ser reservado".</w:t>
+              <w:t>Um profissional não pode ter dois atendimentos ativos sobrepostos: trava de 30 s no cache durante a confirmação do site, SELECT FOR UPDATE em services/agenda.reservar e constraint EXCLUDE no Postgres. Corrida perdida vira HorarioIndisponivel com a mensagem "Este horário acabou de ser reservado".</w:t>
             </w:r>
           </w:p>
         </w:tc>
@@ -3590,7 +3766,7 @@
               <w:rPr>
                 <w:sz w:val="18"/>
               </w:rPr>
-              <w:t>A recepção agenda pelo painel (cliente existente ou nova com telefone validado) usando o mesmo SlotService; não há OTP; o atendimento nasce AGENDADO e o valor pode ser ajustado (fica registrado).</w:t>
+              <w:t>A recepção agenda pelo painel (cliente existente ou nova com telefone validado) pela mesma validação do site (services/agenda.validar_horario, com o motivo detalhado para a equipe: conflito, bloqueio, folga, expediente); não há OTP; o atendimento nasce AGENDADO e o valor combinado pode ser registrado.</w:t>
             </w:r>
           </w:p>
         </w:tc>
@@ -3722,7 +3898,7 @@
               <w:rPr>
                 <w:sz w:val="18"/>
               </w:rPr>
-              <w:t>A ficha de anamnese (no wizard ou pelo link público) só é gravada com a caixa de consentimento específica marcada; o texto do consentimento, a data e o IP vão para a auditoria.</w:t>
+              <w:t>A ficha de anamnese (no wizard ou pelo link) só é gravada com a caixa de consentimento específica marcada; o aceite vira AceiteTermo da versão SAUDE vigente (IP, navegador, SHA-256 do texto) e vai também para a auditoria.</w:t>
             </w:r>
           </w:p>
         </w:tc>
@@ -3810,7 +3986,7 @@
               <w:rPr>
                 <w:sz w:val="18"/>
               </w:rPr>
-              <w:t>E-mail marketing, lembrete por WhatsApp e pesquisa por WhatsApp nunca vêm pré-marcados; conceder e revogar gravam data e IP. O descadastro por link desliga marketing e pesquisas e mantém o lembrete D-1 (aviso do serviço).</w:t>
+              <w:t>Três autorizações por finalidade × canal — promoções por e-mail, lembrete/aviso de vaga por WhatsApp e pesquisa de satisfação por WhatsApp —, nunca pré-marcadas. Cada concessão ou revogação é uma linha nova e imutável (texto exibido, IP, navegador, autor, data); vale a mais recente; marcar de novo depois de um descadastro volta a valer. O descadastro por link revoga marketing e pesquisa e mantém o lembrete D-1. A equipe revoga a pedido da cliente e só registra autorização com justificativa.</w:t>
             </w:r>
           </w:p>
         </w:tc>
@@ -3942,7 +4118,7 @@
               <w:rPr>
                 <w:sz w:val="18"/>
               </w:rPr>
-              <w:t>PENDENTE → AGENDADO/CONFIRMADO/CANCELADO/REAGENDADO; AGENDADO → CONFIRMADO/REALIZADO/CANCELADO/FALTOU/REAGENDADO; CONFIRMADO → REALIZADO/CANCELADO/FALTOU/REAGENDADO; REALIZADO, CANCELADO, FALTOU e REAGENDADO são terminais. AGENDADO = horário aprovado; CONFIRMADO = a cliente confirmou.</w:t>
+              <w:t>PENDENTE → AGENDADO/CONFIRMADO/CANCELADO/REAGENDADO; AGENDADO → CONFIRMADO/REALIZADO/CANCELADO/FALTOU/REAGENDADO; CONFIRMADO → REALIZADO/CANCELADO/FALTOU/REAGENDADO; REALIZADO, CANCELADO, FALTOU e REAGENDADO são terminais. AGENDADO = horário aprovado; CONFIRMADO = a cliente confirmou. Os efeitos da transição (pacote, comissão, cashback, faltas, retorno, lista de espera) gravam na mesma transação do status: tudo ou nada.</w:t>
             </w:r>
           </w:p>
         </w:tc>
@@ -3986,7 +4162,7 @@
               <w:rPr>
                 <w:sz w:val="18"/>
               </w:rPr>
-              <w:t>Permitido até 24 h antes. O atendimento antigo vira REAGENDADO antes de o novo entrar; o novo herda preço, promoção, vínculo de retorno e a ficha de anamnese. Fica AGENDADO se o original estava aprovado e a profissional é a mesma; senão volta a PENDENTE.</w:t>
+              <w:t>Pelo portal "Meus agendamentos" (sessão do OTP, só agendamentos do telefone verificado) ou pelo link legado, até 24 h antes. services/agenda.reagendar: o antigo vira REAGENDADO antes de o novo entrar; o novo herda preço, promoção, vínculo de retorno e a ficha. Fica AGENDADO se o original estava aprovado e a profissional é a mesma; senão volta a PENDENTE.</w:t>
             </w:r>
           </w:p>
         </w:tc>
@@ -4030,7 +4206,7 @@
               <w:rPr>
                 <w:sz w:val="18"/>
               </w:rPr>
-              <w:t>Pelo token do atendimento (portal ou link), a qualquer momento antes do início, pela FSM.</w:t>
+              <w:t>Pelo portal (id do atendimento + sessão do OTP) ou pelo link legado, a qualquer momento antes do início, pela FSM; a trilha registra "[pela cliente]". Cancelamento feito pela clínica avisa a cliente por e-mail.</w:t>
             </w:r>
           </w:p>
         </w:tc>
@@ -4074,7 +4250,7 @@
               <w:rPr>
                 <w:sz w:val="18"/>
               </w:rPr>
-              <w:t>Às 08:00 o sistema envia WhatsApp (template aprovado) aos atendimentos AGENDADO do dia seguinte com consentimento de lembrete; o link permite confirmar (→ CONFIRMADO) ou cancelar, uma única vez.</w:t>
+              <w:t>Às 08:00 o sistema envia WhatsApp (template aprovado) aos atendimentos AGENDADO do dia seguinte com autorização de lembrete vigente; o link (link_acesso CONFIRMAR_PRESENCA, válido até o início) permite confirmar (→ CONFIRMADO) ou cancelar, uma única vez.</w:t>
             </w:r>
           </w:p>
         </w:tc>
@@ -4162,7 +4338,7 @@
               <w:rPr>
                 <w:sz w:val="18"/>
               </w:rPr>
-              <w:t>Procedimento com exige_retorno gera, ao REALIZADO, um atendimento de retorno PENDENTE com valor 0 no primeiro horário livre da janela [mínimo, máximo] a partir do meio. Sem horário livre, não cria. No máximo 1 retorno vivo por origem (UNIQUE). Retorno não gera comissão, cashback nem débito de pacote.</w:t>
+              <w:t>Procedimento com retorno obrigatório gera, ao REALIZADO, um atendimento de retorno PENDENTE com valor 0 no primeiro horário livre da janela [mínimo, máximo] a partir do meio, gravado por services/agenda.reservar. Sem horário livre, não cria. No máximo 1 retorno vivo por origem (UNIQUE). Retorno não gera comissão, cashback nem débito de pacote.</w:t>
             </w:r>
           </w:p>
         </w:tc>
@@ -4206,7 +4382,7 @@
               <w:rPr>
                 <w:sz w:val="18"/>
               </w:rPr>
-              <w:t>Sessão REALIZADA de procedimento do pacote debita 1 sessão do pacote que vence primeiro (1 consumo por atendimento). A validade é conferida na data da sessão. Pacote vendido tem nome e itens congelados.</w:t>
+              <w:t>Sessão REALIZADA debita 1 sessão do item congelado (compra_pacote_item) do pacote que vence primeiro (1 consumo por atendimento). A validade é conferida na data da sessão. O banco garante que o consumo é de um item da mesma compra, do mesmo procedimento, nunca de retorno e só com saldo.</w:t>
             </w:r>
           </w:p>
         </w:tc>
@@ -4236,7 +4412,7 @@
               <w:rPr>
                 <w:sz w:val="18"/>
               </w:rPr>
-              <w:t>Pacotes — ciclo de vida</w:t>
+              <w:t>Pacotes — venda e ciclo de vida</w:t>
             </w:r>
           </w:p>
         </w:tc>
@@ -4250,7 +4426,7 @@
               <w:rPr>
                 <w:sz w:val="18"/>
               </w:rPr>
-              <w:t>ATIVO → FINALIZADO (todas as sessões usadas), EXPIRADO (job diário, vencimento &lt; hoje) ou CANCELADO (exige valor devolvido entre 0 e o valor pago e motivo, auditados). Aviso por e-mail 7 e 1 dia antes do vencimento com saldo.</w:t>
+              <w:t>A venda congela o nome e os itens (procedimento, sessões, valor unitário = valor pago ÷ sessões); o catálogo continua editável só para vendas futuras. ATIVO → FINALIZADO (todas as sessões usadas), EXPIRADO (job diário, vencimento &lt; hoje) ou CANCELADO (valor devolvido entre 0 e o valor pago e motivo, auditados). Aviso por e-mail 7 e 1 dia antes do vencimento com saldo.</w:t>
             </w:r>
           </w:p>
         </w:tc>
@@ -4338,7 +4514,7 @@
               <w:rPr>
                 <w:sz w:val="18"/>
               </w:rPr>
-              <w:t>A clínica pode registrar o valor combinado (não em cancelado/faltou/reagendado, retorno ou realizado com comissão lançada). Faturamento = avulsos realizados com valor &gt; 0 + vendas de pacote na data da compra; sessão de pacote e retorno não somam.</w:t>
+              <w:t>A clínica pode registrar o valor combinado (não em cancelado/faltou/reagendado, retorno ou realizado com comissão lançada). Faturamento = avulsos realizados com valor &gt; 0 + vendas de pacote na data da compra (líquidas do reembolso); sessão de pacote e retorno não somam. Ticket médio e LTV pela mesma regra.</w:t>
             </w:r>
           </w:p>
         </w:tc>
@@ -4368,7 +4544,7 @@
               <w:rPr>
                 <w:sz w:val="18"/>
               </w:rPr>
-              <w:t>Comissão</w:t>
+              <w:t>Comissão (livro-razão)</w:t>
             </w:r>
           </w:p>
         </w:tc>
@@ -4382,7 +4558,7 @@
               <w:rPr>
                 <w:sz w:val="18"/>
               </w:rPr>
-              <w:t>Calculada ao REALIZADO (não em retorno) pela regra mais específica (profissional+procedimento &gt; profissional &gt; procedimento &gt; global; empate = mais recente): percentual 0–100 ou valor fixo sobre o valor cobrado, ou, em sessão de pacote, valor pago ÷ total de sessões. 1 comissão ativa por atendimento; cancelamento estorna.</w:t>
+              <w:t>Ao REALIZADO (não em retorno) lança 1 CREDITO pela regra mais específica (profissional+procedimento &gt; profissional &gt; procedimento &gt; global; empate = mais recente): percentual 0–100 ou valor fixo sobre o valor cobrado ou, em sessão de pacote, sobre o valor unitário congelado. A baixa é um PAGAMENTO e o cancelamento um ESTORNO, ambos referenciando o crédito; estornado não se paga; nada é alterado ou apagado. Status e saldo são derivados e o saldo pode ficar negativo. Regra já usada só é desativada.</w:t>
             </w:r>
           </w:p>
         </w:tc>
@@ -4470,7 +4646,7 @@
               <w:rPr>
                 <w:sz w:val="18"/>
               </w:rPr>
-              <w:t>Um pedido ativo por cliente/procedimento/data. Quando um atendimento ativo futuro vira CANCELADO ou REAGENDADO, todos os pedidos compatíveis recebem e-mail e WhatsApp (com consentimento) com link para agendar, sem reserva do horário; notificado só com entrega. O e-mail digitado no formulário anônimo fica só na inscrição.</w:t>
+              <w:t>Um pedido pendente por cliente/procedimento/data. Quando um atendimento ativo vira CANCELADO ou REAGENDADO, os pedidos compatíveis recebem e-mail e WhatsApp (com autorização) com link para agendar, sem reserva do horário; notificado só com entrega. O e-mail digitado no formulário anônimo fica só na inscrição.</w:t>
             </w:r>
           </w:p>
         </w:tc>
@@ -4514,7 +4690,7 @@
               <w:rPr>
                 <w:sz w:val="18"/>
               </w:rPr>
-              <w:t>WhatsApp de NPS entre 24 h e 7 dias após o REALIZADO, com consentimento e sem opt-out geral (até 3 tentativas); link válido por 7 dias; 1 avaliação por atendimento; nota 0–10. Nota ≤ 6 gera alerta por e-mail à clínica.</w:t>
+              <w:t>WhatsApp de NPS entre 24 h e 7 dias após o REALIZADO, com autorização de pesquisa vigente (até 3 tentativas); link válido por 7 dias; 1 avaliação por atendimento; nota 0–10. Nota ≤ 6 gera alerta por e-mail à clínica. O cálculo do NPS é único (arredondamento "meio para cima") no painel, nas views e no banco.</w:t>
             </w:r>
           </w:p>
         </w:tc>
@@ -4646,7 +4822,7 @@
               <w:rPr>
                 <w:sz w:val="18"/>
               </w:rPr>
-              <w:t>Ficha 1:1 com campos clínicos e perguntas configuráveis. Cada edição grava antes a versão anterior (histórico append-only, imutável); edição concorrente é recusada; POST parcial não apaga campos.</w:t>
+              <w:t>Ficha 1:1 com campos clínicos e as perguntas do formulário PRONTUARIO (no máximo 1 ativo). Cada edição grava antes a versão anterior (histórico append-only, imutável); edição concorrente é recusada; POST parcial não apaga campos. Anotações de sessão também são append-only (correção = nova anotação).</w:t>
             </w:r>
           </w:p>
         </w:tc>
@@ -4734,7 +4910,7 @@
               <w:rPr>
                 <w:sz w:val="18"/>
               </w:rPr>
-              <w:t>Alergias, contraindicações, medicamentos e respostas de risco declaradas nas fichas aparecem como texto visível no portal, na agenda do painel e na ficha da cliente; marcador "ficha pendente" quando a ficha obrigatória não foi respondida.</w:t>
+              <w:t>Alergias, contraindicações, medicamentos e respostas marcadas como alerta de saúde nas fichas aparecem como texto visível no portal, na agenda do painel e na ficha da cliente (calculados em lote); marcador "ficha pendente" quando a ficha obrigatória não foi respondida.</w:t>
             </w:r>
           </w:p>
         </w:tc>
@@ -4778,7 +4954,7 @@
               <w:rPr>
                 <w:sz w:val="18"/>
               </w:rPr>
-              <w:t>1 versão ativa por escopo (LGPD global; PROCEDIMENTO geral ou por procedimento). Versão com aceite não pode ser editada (model + trigger): mudar = publicar nova versão. O aceite é imutável e nunca apagado.</w:t>
+              <w:t>1 versão ativa por escopo (LGPD e SAUDE globais; PROCEDIMENTO geral ou por procedimento). Versão com aceite não pode ser editada (model + trigger): mudar = publicar nova versão. O aceite é imutável e nunca apagado.</w:t>
             </w:r>
           </w:p>
         </w:tc>
@@ -4822,7 +4998,7 @@
               <w:rPr>
                 <w:sz w:val="18"/>
               </w:rPr>
-              <w:t>OTP 24 h; texto de notificação 12 meses; auditoria 5 anos; logs de login 90 dias; cliente sem atendimento há 5 anos ou excluída há 30 dias é anonimizada, exceto com prontuário com conteúdo, pacote comprado ou atendimento realizado nos últimos 20 anos; ficha de pedido não realizado apagada após 90 dias; lista de espera vencida apagada.</w:t>
+              <w:t>OTP 24 h; texto de notificação 12 meses; auditoria e trilha de dados 5 anos (prontuário 20 anos); link público vencido ou revogado 90 dias; logs de login 90 dias; cliente sem atendimento há 5 anos ou excluída há 30 dias é anonimizada, exceto com prontuário com conteúdo, pacote comprado ou atendimento realizado nos últimos 20 anos; ficha de pedido não realizado apagada após 90 dias; lista de espera vencida apagada. A escrita é das procedures do Postgres (fonte única).</w:t>
             </w:r>
           </w:p>
         </w:tc>
@@ -4866,7 +5042,7 @@
               <w:rPr>
                 <w:sz w:val="18"/>
               </w:rPr>
-              <w:t>Anonimiza nome ([ANONIMIZADO-pk]), contatos, documentos e consentimentos; soft delete; apaga OTPs, lista de espera, texto de notificações e fichas que não são de atendimento realizado; retira o depoimento e o comentário do NPS; pseudonimiza o nome nos textos da auditoria. Atendimentos, aceites, prontuário e pacotes ficam ligados a titular não identificável.</w:t>
+              <w:t>sp_anonimizar_cliente: anonimiza nome ([ANONIMIZADO-pk]), contatos e documentos; revoga as autorizações vigentes (histórico fica sem IP/navegador); soft delete; apaga OTPs, lista de espera, texto de notificações e fichas que não são de atendimento realizado; retira o depoimento e o comentário do NPS; revoga todos os links públicos; pseudonimiza o nome nos textos da auditoria. Atendimentos, aceites, prontuário e pacotes ficam ligados a titular não identificável.</w:t>
             </w:r>
           </w:p>
         </w:tc>
@@ -4940,7 +5116,7 @@
               <w:rPr>
                 <w:sz w:val="18"/>
               </w:rPr>
-              <w:t>Auditoria</w:t>
+              <w:t>Auditoria e trilha de dados</w:t>
             </w:r>
           </w:p>
         </w:tc>
@@ -4954,7 +5130,7 @@
               <w:rPr>
                 <w:sz w:val="18"/>
               </w:rPr>
-              <w:t>Toda ação sensível grava autor (+ nome), tabela, registro, detalhes com PII mascarada e IP (LGPD art. 37).</w:t>
+              <w:t>Toda ação sensível grava autor (+ nome), tabela, registro, detalhes com PII mascarada e IP (LGPD art. 37), com o Ator da requisição (usuário, IP, origem). Além disso, triggers registram cada alteração das 11 tabelas sensíveis em historico_alteracao. As duas trilhas são append-only no banco.</w:t>
             </w:r>
           </w:p>
         </w:tc>
@@ -4998,7 +5174,7 @@
               <w:rPr>
                 <w:sz w:val="18"/>
               </w:rPr>
-              <w:t>E-mail + senha (mínimo 10, validadores do Django). 2FA TOTP obrigatório para ADMIN (cadastro forçado após o login, conferido a cada request); opcional para PROFISSIONAL. Trocar de aparelho exige o código atual; recuperação por comando setup_2fa --force. Sessão da equipe de 8 h deslizantes; logout só via POST.</w:t>
+              <w:t>E-mail + senha (mínimo 10, validadores do Django). 2FA TOTP obrigatório para ADMIN e PROFISSIONAL em produção (cadastro forçado após o login, conferido a cada request; válvula de emergência por variável de ambiente com aviso). Códigos de backup no painel; trocar de aparelho exige o código atual; recuperação por comando setup_2fa --force. Sessão da equipe de 8 h deslizantes; logout só via POST.</w:t>
             </w:r>
           </w:p>
         </w:tc>
@@ -5043,6 +5219,182 @@
                 <w:sz w:val="18"/>
               </w:rPr>
               <w:t>django-axes bloqueia por 1 h após 5 falhas (IP + usuário); rate-limit no login. Reset de senha com token de 1 h, 3 pedidos/15 min por IP, resposta genérica; sem backend de e-mail real nada é enviado.</w:t>
+            </w:r>
+          </w:p>
+        </w:tc>
+      </w:tr>
+      <w:tr>
+        <w:tc>
+          <w:tcPr>
+            <w:tcW w:type="dxa" w:w="864"/>
+          </w:tcPr>
+          <w:p>
+            <w:r/>
+            <w:r>
+              <w:rPr>
+                <w:sz w:val="18"/>
+              </w:rPr>
+              <w:t>RN46</w:t>
+            </w:r>
+          </w:p>
+        </w:tc>
+        <w:tc>
+          <w:tcPr>
+            <w:tcW w:type="dxa" w:w="2304"/>
+          </w:tcPr>
+          <w:p>
+            <w:r/>
+            <w:r>
+              <w:rPr>
+                <w:sz w:val="18"/>
+              </w:rPr>
+              <w:t>Exceções de agenda</w:t>
+            </w:r>
+          </w:p>
+        </w:tc>
+        <w:tc>
+          <w:tcPr>
+            <w:tcW w:type="dxa" w:w="6480"/>
+          </w:tcPr>
+          <w:p>
+            <w:r/>
+            <w:r>
+              <w:rPr>
+                <w:sz w:val="18"/>
+              </w:rPr>
+              <w:t>Folga (do profissional ou da clínica inteira: feriado nacional/local e recesso, carregados pelo job mensal de feriados), horário diferente (1 por profissional/dia) e bloqueio (pontual ou recorrente por RRULE diária/semanal/mensal). Grade sem janelas sobrepostas e folgas do mesmo profissional sem sobreposição (EXCLUDE). Exceção inativa fica registrada e é ignorada (ex.: feriado em que a clínica abre). Eventos do Google Calendar entram como bloqueio, sem duplicar.</w:t>
+            </w:r>
+          </w:p>
+        </w:tc>
+      </w:tr>
+      <w:tr>
+        <w:tc>
+          <w:tcPr>
+            <w:tcW w:type="dxa" w:w="864"/>
+          </w:tcPr>
+          <w:p>
+            <w:r/>
+            <w:r>
+              <w:rPr>
+                <w:sz w:val="18"/>
+              </w:rPr>
+              <w:t>RN47</w:t>
+            </w:r>
+          </w:p>
+        </w:tc>
+        <w:tc>
+          <w:tcPr>
+            <w:tcW w:type="dxa" w:w="2304"/>
+          </w:tcPr>
+          <w:p>
+            <w:r/>
+            <w:r>
+              <w:rPr>
+                <w:sz w:val="18"/>
+              </w:rPr>
+              <w:t>Links públicos</w:t>
+            </w:r>
+          </w:p>
+        </w:tc>
+        <w:tc>
+          <w:tcPr>
+            <w:tcW w:type="dxa" w:w="6480"/>
+          </w:tcPr>
+          <w:p>
+            <w:r/>
+            <w:r>
+              <w:rPr>
+                <w:sz w:val="18"/>
+              </w:rPr>
+              <w:t>Todo link das mensagens (confirmar presença, NPS, termo, ficha, descadastro, feed iCal) é um link_acesso com finalidade e 1 alvo; o banco guarda só o SHA-256 do token. Validade por finalidade: confirmação até o início, termo até o fim do atendimento, NPS 7 dias, ficha 60 dias, descadastro e feed sem validade. Gerar novo feed revoga o anterior; a URL aparece só na geração.</w:t>
+            </w:r>
+          </w:p>
+        </w:tc>
+      </w:tr>
+      <w:tr>
+        <w:tc>
+          <w:tcPr>
+            <w:tcW w:type="dxa" w:w="864"/>
+          </w:tcPr>
+          <w:p>
+            <w:r/>
+            <w:r>
+              <w:rPr>
+                <w:sz w:val="18"/>
+              </w:rPr>
+              <w:t>RN48</w:t>
+            </w:r>
+          </w:p>
+        </w:tc>
+        <w:tc>
+          <w:tcPr>
+            <w:tcW w:type="dxa" w:w="2304"/>
+          </w:tcPr>
+          <w:p>
+            <w:r/>
+            <w:r>
+              <w:rPr>
+                <w:sz w:val="18"/>
+              </w:rPr>
+              <w:t>Dados de saúde cifrados</w:t>
+            </w:r>
+          </w:p>
+        </w:tc>
+        <w:tc>
+          <w:tcPr>
+            <w:tcW w:type="dxa" w:w="6480"/>
+          </w:tcPr>
+          <w:p>
+            <w:r/>
+            <w:r>
+              <w:rPr>
+                <w:sz w:val="18"/>
+              </w:rPr>
+              <w:t>Campos clínicos e respostas do prontuário, versões do prontuário, anotações de sessão, fichas de anamnese e o token do Google Calendar ficam cifrados em repouso (Fernet, chave por finalidade); a aplicação lê em claro e o banco não busca pelo conteúdo. Rotação de chave por comando.</w:t>
+            </w:r>
+          </w:p>
+        </w:tc>
+      </w:tr>
+      <w:tr>
+        <w:tc>
+          <w:tcPr>
+            <w:tcW w:type="dxa" w:w="864"/>
+          </w:tcPr>
+          <w:p>
+            <w:r/>
+            <w:r>
+              <w:rPr>
+                <w:sz w:val="18"/>
+              </w:rPr>
+              <w:t>RN49</w:t>
+            </w:r>
+          </w:p>
+        </w:tc>
+        <w:tc>
+          <w:tcPr>
+            <w:tcW w:type="dxa" w:w="2304"/>
+          </w:tcPr>
+          <w:p>
+            <w:r/>
+            <w:r>
+              <w:rPr>
+                <w:sz w:val="18"/>
+              </w:rPr>
+              <w:t>Fila de e-mail transacional</w:t>
+            </w:r>
+          </w:p>
+        </w:tc>
+        <w:tc>
+          <w:tcPr>
+            <w:tcW w:type="dxa" w:w="6480"/>
+          </w:tcPr>
+          <w:p>
+            <w:r/>
+            <w:r>
+              <w:rPr>
+                <w:sz w:val="18"/>
+              </w:rPr>
+              <w:t>Confirmação, cancelamento e pedido de aprovação à profissional nascem Notificacao EMAIL PENDENTE na transação de quem pediu e saem no on_commit; se falhar, o job emails reenvia com espera crescente (5/10/20/40 min) até 5 tentativas ou 48 h (→ FALHOU). A fila não guarda cópia de dado pessoal.</w:t>
             </w:r>
           </w:p>
         </w:tc>
@@ -5069,7 +5421,7 @@
       <w:r>
         <w:drawing>
           <wp:inline xmlns:a="http://schemas.openxmlformats.org/drawingml/2006/main" xmlns:pic="http://schemas.openxmlformats.org/drawingml/2006/picture">
-            <wp:extent cx="5852160" cy="5680477"/>
+            <wp:extent cx="5486400" cy="5540855"/>
             <wp:docPr id="1" name="Picture 1"/>
             <wp:cNvGraphicFramePr>
               <a:graphicFrameLocks noChangeAspect="1"/>
@@ -5090,7 +5442,7 @@
                   <pic:spPr>
                     <a:xfrm>
                       <a:off x="0" y="0"/>
-                      <a:ext cx="5852160" cy="5680477"/>
+                      <a:ext cx="5486400" cy="5540855"/>
                     </a:xfrm>
                     <a:prstGeom prst="rect"/>
                   </pic:spPr>
@@ -5121,7 +5473,7 @@
       <w:r>
         <w:drawing>
           <wp:inline xmlns:a="http://schemas.openxmlformats.org/drawingml/2006/main" xmlns:pic="http://schemas.openxmlformats.org/drawingml/2006/picture">
-            <wp:extent cx="5852160" cy="10032274"/>
+            <wp:extent cx="3937105" cy="7498080"/>
             <wp:docPr id="2" name="Picture 2"/>
             <wp:cNvGraphicFramePr>
               <a:graphicFrameLocks noChangeAspect="1"/>
@@ -5142,7 +5494,7 @@
                   <pic:spPr>
                     <a:xfrm>
                       <a:off x="0" y="0"/>
-                      <a:ext cx="5852160" cy="10032274"/>
+                      <a:ext cx="3937105" cy="7498080"/>
                     </a:xfrm>
                     <a:prstGeom prst="rect"/>
                   </pic:spPr>
@@ -5310,7 +5662,7 @@
               <w:rPr>
                 <w:sz w:val="18"/>
               </w:rPr>
-              <w:t>Cliente escolhe procedimento, data/horário e profissional, informa dados, aceita a política e os termos, consente o dado de saúde e responde a ficha; confirma o celular com código SMS (UC02). O servidor revalida slot, habilitação, feriado, idade ≥ 18 e aceites; trava o slot (cache + SELECT FOR UPDATE + EXCLUDE), cria/atualiza a cliente pelo telefone, grava o atendimento PENDENTE com o preço da data, os aceites com prova, a ficha e o consentimento na auditoria; avisa o profissional.</w:t>
+              <w:t>Cliente escolhe procedimento, data/horário e profissional (botão Continuar a cada etapa), informa dados, aceita a política e os termos, consente o dado de saúde, escolhe as autorizações de comunicação e responde a ficha; confirma o celular com código SMS (UC02). O servidor revalida idade ≥ 18, aceites e o horário (services/agenda.validar_horario); trava o slot (cache + SELECT FOR UPDATE + EXCLUDE), cria/atualiza a cliente pelo telefone, registra os consentimentos (histórico), grava o atendimento PENDENTE com o preço da data (services/agenda.reservar), os aceites com prova (LGPD, SAÚDE, procedimento) e a ficha cifrada; o pedido de aprovação à profissional entra na fila de e-mail e o push sai no on_commit.</w:t>
             </w:r>
           </w:p>
         </w:tc>
@@ -5426,7 +5778,7 @@
               <w:rPr>
                 <w:sz w:val="18"/>
               </w:rPr>
-              <w:t>O wizard consulta dias do mês e horários livres; o SlotService calcula os slots de 30 min por profissional considerando expediente, exceções, feriados, bloqueios, atendimentos, buffer e antecedências.</w:t>
+              <w:t>O wizard consulta dias do mês e horários livres; o SlotService calcula os slots de 30 min por profissional a partir da grade semanal e das exceções (folga, feriado/recesso, horário diferente, bloqueios), atendimentos, intervalo do procedimento e antecedências.</w:t>
             </w:r>
           </w:p>
         </w:tc>
@@ -5484,7 +5836,7 @@
               <w:rPr>
                 <w:sz w:val="18"/>
               </w:rPr>
-              <w:t>Pelo token do atendimento: exige ≥ 24 h de antecedência; escolhe novo horário (UC03); o antigo vira REAGENDADO e o novo herda preço, retorno e ficha; fica AGENDADO se já aprovado e com a mesma profissional, senão PENDENTE.</w:t>
+              <w:t>Pelo portal (id + sessão do OTP, só agendamentos do telefone verificado) ou pelo link legado: exige ≥ 24 h de antecedência; escolhe novo horário (UC03); services/agenda.reagendar marca o antigo REAGENDADO e cria o novo com preço, retorno e ficha; fica AGENDADO se já aprovado e com a mesma profissional, senão PENDENTE.</w:t>
             </w:r>
           </w:p>
         </w:tc>
@@ -5542,7 +5894,7 @@
               <w:rPr>
                 <w:sz w:val="18"/>
               </w:rPr>
-              <w:t>Pelo token (portal): atendimento ativo e futuro vai para CANCELADO pela FSM; a vaga é oferecida à lista de espera.</w:t>
+              <w:t>Pelo portal (id + sessão do OTP) ou pelo link legado: atendimento ativo e futuro vai para CANCELADO pela FSM (trilha "[pela cliente]"); a vaga é oferecida à lista de espera.</w:t>
             </w:r>
           </w:p>
         </w:tc>
@@ -5658,7 +6010,7 @@
               <w:rPr>
                 <w:sz w:val="18"/>
               </w:rPr>
-              <w:t>Pelo link do lembrete D-1 (WhatsApp): confirmar (AGENDADO → CONFIRMADO) ou cancelar, uma única vez.</w:t>
+              <w:t>Pelo link do lembrete D-1 (WhatsApp; link_acesso válido até o início): confirmar (AGENDADO → CONFIRMADO) ou cancelar, uma única vez.</w:t>
             </w:r>
           </w:p>
         </w:tc>
@@ -5774,7 +6126,7 @@
               <w:rPr>
                 <w:sz w:val="18"/>
               </w:rPr>
-              <w:t>Pelo token (60 dias): responde a ficha; para ficha de saúde marca o consentimento do art. 11 (auditado); respostas validadas contra o schema; uma resposta por link.</w:t>
+              <w:t>Pelo link (60 dias): responde a ficha; para ficha de saúde marca o consentimento do art. 11 (aceite do termo SAÚDE com prova); respostas validadas contra o schema e gravadas cifradas; uma resposta por link. Rota mantida, hoje sem produtor de link.</w:t>
             </w:r>
           </w:p>
         </w:tc>
@@ -5890,7 +6242,7 @@
               <w:rPr>
                 <w:sz w:val="18"/>
               </w:rPr>
-              <w:t>Pelo link do atendimento (válido até o fim dele): lê e aceita os termos pendentes; o aceite grava IP, navegador e SHA-256 do texto.</w:t>
+              <w:t>Pelo link do atendimento (link_acesso TERMO, válido até o fim dele): lê e aceita os termos pendentes; o aceite grava IP, navegador e SHA-256 do texto.</w:t>
             </w:r>
           </w:p>
         </w:tc>
@@ -5948,7 +6300,7 @@
               <w:rPr>
                 <w:sz w:val="18"/>
               </w:rPr>
-              <w:t>Baixar os dados em JSON após código SMS (DSAR), descadastrar-se por link e registrar o aviso de cookies.</w:t>
+              <w:t>Baixar os dados em JSON após código SMS (DSAR: cadastro, consentimentos com histórico, atendimentos, fichas, prontuário, aceites, NPS, pacotes, carteira), descadastrar-se por link (revoga marketing e pesquisa) e registrar o aviso de cookies.</w:t>
             </w:r>
           </w:p>
         </w:tc>
@@ -6006,7 +6358,7 @@
               <w:rPr>
                 <w:sz w:val="18"/>
               </w:rPr>
-              <w:t>Login por e-mail/senha com rate-limit e django-axes; ADMIN sem 2FA vai ao cadastro obrigatório; com 2FA passa pelo desafio (UC14); reset de senha por link (1 h). Logout só via POST.</w:t>
+              <w:t>Login por e-mail/senha com rate-limit e django-axes; sem 2FA cadastrado vai ao cadastro obrigatório; com 2FA passa pelo desafio (UC14); reset de senha por link (1 h). Logout só via POST.</w:t>
             </w:r>
           </w:p>
         </w:tc>
@@ -6064,7 +6416,7 @@
               <w:rPr>
                 <w:sz w:val="18"/>
               </w:rPr>
-              <w:t>Cadastro por QR (SVG) e confirmação do primeiro código; desafio a cada sessão (TOTP ou código de backup); trocar de aparelho exige o código atual.</w:t>
+              <w:t>Cadastro por QR (SVG) e confirmação do primeiro código; desafio a cada sessão (TOTP ou código de backup); códigos de backup gerados no painel; trocar de aparelho exige o código atual.</w:t>
             </w:r>
           </w:p>
         </w:tc>
@@ -6180,7 +6532,7 @@
               <w:rPr>
                 <w:sz w:val="18"/>
               </w:rPr>
-              <w:t>Lista com filtros e marcadores (termo pendente, ficha pendente, alertas); aprovar/rejeitar individual ou em lote; mudar status pela FSM (409 sem termo, salvo override); calendário com arrastar-e-soltar; valor cobrado; link do termo.</w:t>
+              <w:t>Lista com filtros por dia e marcadores (termo pendente, ficha pendente, alertas); aprovar/rejeitar individual ou em lote (e-mail pela fila); mudar status pela FSM (409 sem termo, salvo override); calendário com arrastar-e-soltar (services/agenda.mover, motivo detalhado da recusa); valor cobrado; link do termo.</w:t>
             </w:r>
           </w:p>
         </w:tc>
@@ -6238,7 +6590,7 @@
               <w:rPr>
                 <w:sz w:val="18"/>
               </w:rPr>
-              <w:t>Ficha da cliente (dados validados, alertas, pacotes, histórico); prontuário com histórico de versões, trava de edição concorrente e trilha de leitura; anotações de sessão.</w:t>
+              <w:t>Ficha da cliente (dados validados, alertas, pacotes, histórico, autorizações de comunicação); prontuário com as perguntas do formulário PRONTUARIO, histórico de versões, trava de edição concorrente e trilha de leitura; anotações de sessão append-only. Conteúdo clínico cifrado.</w:t>
             </w:r>
           </w:p>
         </w:tc>
@@ -6296,7 +6648,7 @@
               <w:rPr>
                 <w:sz w:val="18"/>
               </w:rPr>
-              <w:t>Profissionais (expediente, antecedências, habilitações, preços), exceções, bloqueios (inclusive globais), procedimentos, novo link do feed iCal e conexão com o Google Calendar.</w:t>
+              <w:t>Profissionais (grade semanal, antecedências, habilitações, preços), exceções de agenda (folga, horário diferente, bloqueio pontual ou recorrente, inclusive para todos), feriados e recessos, procedimentos, novo link do feed iCal e conexão com o Google Calendar.</w:t>
             </w:r>
           </w:p>
         </w:tc>
@@ -6354,7 +6706,7 @@
               <w:rPr>
                 <w:sz w:val="18"/>
               </w:rPr>
-              <w:t>Criar/editar pacotes (congelados após a venda), vender a uma cliente, acompanhar saldo/validade e cancelar com valor devolvido.</w:t>
+              <w:t>Criar/editar pacotes do catálogo (vale para vendas futuras), vender a uma cliente (itens congelados com valor unitário), acompanhar saldo/validade e cancelar com valor devolvido.</w:t>
             </w:r>
           </w:p>
         </w:tc>
@@ -6470,7 +6822,7 @@
               <w:rPr>
                 <w:sz w:val="18"/>
               </w:rPr>
-              <w:t>Dashboard e financeiro (faturamento de avulsos + vendas de pacote, faltas, rankings), comissões pendentes/pagas (pagar) e exportação em Excel.</w:t>
+              <w:t>Dashboard e financeiro (faturamento de avulsos + vendas de pacote líquidas, faltas, rankings, ticket médio); comissões em livro-razão (créditos, pagamentos, estornos, saldo por profissional — pode ficar negativo), pagar um crédito e exportar em Excel.</w:t>
             </w:r>
           </w:p>
         </w:tc>
@@ -6586,7 +6938,7 @@
               <w:rPr>
                 <w:sz w:val="18"/>
               </w:rPr>
-              <w:t>Formulários de anamnese (schema JSON; mudar schema com respostas cria nova versão) e termos versionados (1 ativo por escopo; imutáveis após aceite); painel de conformidade dos aceites.</w:t>
+              <w:t>Formulários de anamnese, pesquisa e perguntas do prontuário (lista de perguntas com alerta de saúde; 1 PRONTUARIO ativo) e termos versionados LGPD, SAÚDE e de procedimento (1 ativo por escopo; imutáveis após aceite); painel de conformidade dos aceites.</w:t>
             </w:r>
           </w:p>
         </w:tc>
@@ -6702,7 +7054,7 @@
               <w:rPr>
                 <w:sz w:val="18"/>
               </w:rPr>
-              <w:t>POST /cron/run/&lt;job&gt;/ com X-Cron-Token executa o job (lembrete D-1, NPS, alerta de detrator, pacotes, aniversário, limpeza de status, retenção LGPD, housekeeping, feriados); 500 quando o job falha.</w:t>
+              <w:t>POST /cron/run/&lt;job&gt;/ com X-Cron-Token (ou rodar_job no servidor) executa o job dentro do request: fila de e-mail (15 min), lembrete D-1, NPS, alerta de detrator, pacotes, aniversário, limpeza de status, retenção LGPD e housekeeping (procedures do Postgres), feriados; 500 quando o job falha; trilha com origem cron:&lt;job&gt;.</w:t>
             </w:r>
           </w:p>
         </w:tc>
@@ -6877,6 +7229,122 @@
                 <w:sz w:val="18"/>
               </w:rPr>
               <w:t>No painel de NPS, aprovar (só com opt-in da cliente e comentário) ou retirar depoimentos do site; auditado.</w:t>
+            </w:r>
+          </w:p>
+        </w:tc>
+      </w:tr>
+      <w:tr>
+        <w:tc>
+          <w:tcPr>
+            <w:tcW w:type="dxa" w:w="720"/>
+          </w:tcPr>
+          <w:p>
+            <w:r/>
+            <w:r>
+              <w:rPr>
+                <w:sz w:val="18"/>
+              </w:rPr>
+              <w:t>UC29</w:t>
+            </w:r>
+          </w:p>
+        </w:tc>
+        <w:tc>
+          <w:tcPr>
+            <w:tcW w:type="dxa" w:w="2016"/>
+          </w:tcPr>
+          <w:p>
+            <w:r/>
+            <w:r>
+              <w:rPr>
+                <w:sz w:val="18"/>
+              </w:rPr>
+              <w:t>Gerir autorizações de comunicação</w:t>
+            </w:r>
+          </w:p>
+        </w:tc>
+        <w:tc>
+          <w:tcPr>
+            <w:tcW w:type="dxa" w:w="2160"/>
+          </w:tcPr>
+          <w:p>
+            <w:r/>
+            <w:r>
+              <w:rPr>
+                <w:sz w:val="18"/>
+              </w:rPr>
+              <w:t>Administrador (ADMIN)</w:t>
+            </w:r>
+          </w:p>
+        </w:tc>
+        <w:tc>
+          <w:tcPr>
+            <w:tcW w:type="dxa" w:w="4752"/>
+          </w:tcPr>
+          <w:p>
+            <w:r/>
+            <w:r>
+              <w:rPr>
+                <w:sz w:val="18"/>
+              </w:rPr>
+              <w:t>Na ficha da cliente: ver o estado de cada finalidade × canal, revogar a pedido da cliente e registrar autorização com justificativa (origem PAINEL, autor); o histórico é preservado e o mais recente vale.</w:t>
+            </w:r>
+          </w:p>
+        </w:tc>
+      </w:tr>
+      <w:tr>
+        <w:tc>
+          <w:tcPr>
+            <w:tcW w:type="dxa" w:w="720"/>
+          </w:tcPr>
+          <w:p>
+            <w:r/>
+            <w:r>
+              <w:rPr>
+                <w:sz w:val="18"/>
+              </w:rPr>
+              <w:t>UC30</w:t>
+            </w:r>
+          </w:p>
+        </w:tc>
+        <w:tc>
+          <w:tcPr>
+            <w:tcW w:type="dxa" w:w="2016"/>
+          </w:tcPr>
+          <w:p>
+            <w:r/>
+            <w:r>
+              <w:rPr>
+                <w:sz w:val="18"/>
+              </w:rPr>
+              <w:t>Assinar o feed iCal da agenda</w:t>
+            </w:r>
+          </w:p>
+        </w:tc>
+        <w:tc>
+          <w:tcPr>
+            <w:tcW w:type="dxa" w:w="2160"/>
+          </w:tcPr>
+          <w:p>
+            <w:r/>
+            <w:r>
+              <w:rPr>
+                <w:sz w:val="18"/>
+              </w:rPr>
+              <w:t>Profissional, Administrador (ADMIN)</w:t>
+            </w:r>
+          </w:p>
+        </w:tc>
+        <w:tc>
+          <w:tcPr>
+            <w:tcW w:type="dxa" w:w="4752"/>
+          </w:tcPr>
+          <w:p>
+            <w:r/>
+            <w:r>
+              <w:rPr>
+                <w:sz w:val="18"/>
+              </w:rPr>
+              <w:t>Gerar o link do feed iCal (no portal ou no painel): o link anterior é revogado e a URL aparece uma única vez; o banco guarda só o hash do token.</w:t>
             </w:r>
           </w:p>
         </w:tc>
@@ -6894,6 +7362,14 @@
       </w:pPr>
       <w:r>
         <w:t>7. Modelo de Domínio (Diagrama de Classes)</w:t>
+      </w:r>
+    </w:p>
+    <w:p>
+      <w:r>
+        <w:rPr>
+          <w:sz w:val="21"/>
+        </w:rPr>
+        <w:t>Os atributos seguem os nomes das classes Python; no banco, tabelas e colunas seguem o padrão SQL do projeto (por exemplo, ativo → eh_ativo, buffer_minutos → intervalo_minutos). O nome físico de cada tabela está no dicionário de entidades (7.1).</w:t>
       </w:r>
     </w:p>
     <w:p>
@@ -6914,7 +7390,7 @@
       <w:r>
         <w:drawing>
           <wp:inline xmlns:a="http://schemas.openxmlformats.org/drawingml/2006/main" xmlns:pic="http://schemas.openxmlformats.org/drawingml/2006/picture">
-            <wp:extent cx="8412480" cy="7736477"/>
+            <wp:extent cx="7772400" cy="4979738"/>
             <wp:docPr id="3" name="Picture 3"/>
             <wp:cNvGraphicFramePr>
               <a:graphicFrameLocks noChangeAspect="1"/>
@@ -6935,7 +7411,7 @@
                   <pic:spPr>
                     <a:xfrm>
                       <a:off x="0" y="0"/>
-                      <a:ext cx="8412480" cy="7736477"/>
+                      <a:ext cx="7772400" cy="4979738"/>
                     </a:xfrm>
                     <a:prstGeom prst="rect"/>
                   </pic:spPr>
@@ -6960,24 +7436,9 @@
       </w:r>
     </w:p>
     <w:p>
-      <w:pPr>
-        <w:sectPr>
-          <w:pgSz w:w="15840" w:h="12240" w:orient="landscape"/>
-          <w:pgMar w:top="1440" w:right="1800" w:bottom="1440" w:left="1800" w:header="720" w:footer="720" w:gutter="0"/>
-          <w:cols w:space="720"/>
-          <w:docGrid w:linePitch="360"/>
-        </w:sectPr>
-      </w:pPr>
-    </w:p>
-    <w:p>
-      <w:pPr>
-        <w:sectPr>
-          <w:pgSz w:w="12240" w:h="15840"/>
-          <w:pgMar w:top="1440" w:right="1800" w:bottom="1440" w:left="1800" w:header="720" w:footer="720" w:gutter="0"/>
-          <w:cols w:space="720"/>
-          <w:docGrid w:linePitch="360"/>
-        </w:sectPr>
-      </w:pPr>
+      <w:r>
+        <w:br w:type="page"/>
+      </w:r>
     </w:p>
     <w:p>
       <w:pPr>
@@ -6986,7 +7447,7 @@
       <w:r>
         <w:drawing>
           <wp:inline xmlns:a="http://schemas.openxmlformats.org/drawingml/2006/main" xmlns:pic="http://schemas.openxmlformats.org/drawingml/2006/picture">
-            <wp:extent cx="8412480" cy="1706102"/>
+            <wp:extent cx="7772400" cy="2195790"/>
             <wp:docPr id="4" name="Picture 4"/>
             <wp:cNvGraphicFramePr>
               <a:graphicFrameLocks noChangeAspect="1"/>
@@ -7007,7 +7468,7 @@
                   <pic:spPr>
                     <a:xfrm>
                       <a:off x="0" y="0"/>
-                      <a:ext cx="8412480" cy="1706102"/>
+                      <a:ext cx="7772400" cy="2195790"/>
                     </a:xfrm>
                     <a:prstGeom prst="rect"/>
                   </pic:spPr>
@@ -7028,7 +7489,7 @@
           <w:color w:val="666666"/>
           <w:sz w:val="17"/>
         </w:rPr>
-        <w:t>Figura 4 — Diagrama de Classes (UML): Pacotes, Carteira, Fidelidade e Comissao.</w:t>
+        <w:t>Figura 4 — Diagrama de Classes (UML): Pacotes, Carteira, Fidelidade e Comissão.</w:t>
       </w:r>
     </w:p>
     <w:p>
@@ -7043,22 +7504,12 @@
     </w:p>
     <w:p>
       <w:pPr>
-        <w:sectPr>
-          <w:pgSz w:w="12240" w:h="15840"/>
-          <w:pgMar w:top="1440" w:right="1800" w:bottom="1440" w:left="1800" w:header="720" w:footer="720" w:gutter="0"/>
-          <w:cols w:space="720"/>
-          <w:docGrid w:linePitch="360"/>
-        </w:sectPr>
-      </w:pPr>
-    </w:p>
-    <w:p>
-      <w:pPr>
         <w:jc w:val="center"/>
       </w:pPr>
       <w:r>
         <w:drawing>
           <wp:inline xmlns:a="http://schemas.openxmlformats.org/drawingml/2006/main" xmlns:pic="http://schemas.openxmlformats.org/drawingml/2006/picture">
-            <wp:extent cx="8412480" cy="7693556"/>
+            <wp:extent cx="5486400" cy="6375172"/>
             <wp:docPr id="5" name="Picture 5"/>
             <wp:cNvGraphicFramePr>
               <a:graphicFrameLocks noChangeAspect="1"/>
@@ -7079,7 +7530,7 @@
                   <pic:spPr>
                     <a:xfrm>
                       <a:off x="0" y="0"/>
-                      <a:ext cx="8412480" cy="7693556"/>
+                      <a:ext cx="5486400" cy="6375172"/>
                     </a:xfrm>
                     <a:prstGeom prst="rect"/>
                   </pic:spPr>
@@ -7100,18 +7551,8 @@
           <w:color w:val="666666"/>
           <w:sz w:val="17"/>
         </w:rPr>
-        <w:t>Figura 5 — Diagrama de Classes (UML): Prontuário, Anamnese, NPS, Termos, Acesso e Auditoria.</w:t>
+        <w:t>Figura 5 — Diagrama de Classes (UML): Prontuário, Formulários, NPS, Termos, Consentimentos, Acesso e Trilhas.</w:t>
       </w:r>
-    </w:p>
-    <w:p>
-      <w:pPr>
-        <w:sectPr>
-          <w:pgSz w:w="15840" w:h="12240" w:orient="landscape"/>
-          <w:pgMar w:top="1440" w:right="1800" w:bottom="1440" w:left="1800" w:header="720" w:footer="720" w:gutter="0"/>
-          <w:cols w:space="720"/>
-          <w:docGrid w:linePitch="360"/>
-        </w:sectPr>
-      </w:pPr>
     </w:p>
     <w:p>
       <w:pPr>
@@ -7225,7 +7666,7 @@
               <w:rPr>
                 <w:sz w:val="18"/>
               </w:rPr>
-              <w:t>Cliente da clínica: identidade pelo celular (só dígitos, único entre ativos), e-mail/CPF opcionais, consentimentos granulares com data e IP, contador de faltas e bloqueio online, indicação (cashback) e soft delete.</w:t>
+              <w:t>Cliente da clínica: identidade pelo celular (só dígitos, 10–11, único entre ativas); e-mail, CPF e demais dados pessoais opcionais (ausente = NULL); contador de faltas e bloqueio do agendamento online; indicação (código próprio + indicadora, base do cashback); exclusão lógica (deletado_em). As autorizações de comunicação ficam na tabela consentimento (histórico, 0050).</w:t>
             </w:r>
           </w:p>
         </w:tc>
@@ -7269,7 +7710,7 @@
               <w:rPr>
                 <w:sz w:val="18"/>
               </w:rPr>
-              <w:t>Profissional que atende: antecedência mínima (min_notice_horas) e máxima (max_advance_dias) do agendamento, token do feed iCal (rotacionável) e integração com o Google Calendar.</w:t>
+              <w:t>Profissional que atende: antecedência mínima (0–720 h, padrão 2) e máxima (1–365 dias, padrão 60), dados de vitrine (especialidade, foto, biografia) e integração opcional com o Google Calendar (token de renovação cifrado). O feed iCal usa um link_acesso FEED_ICS.</w:t>
             </w:r>
           </w:p>
         </w:tc>
@@ -7285,7 +7726,7 @@
               <w:rPr>
                 <w:sz w:val="18"/>
               </w:rPr>
-              <w:t>DisponibilidadeProfissional</w:t>
+              <w:t>AgendaHorario</w:t>
             </w:r>
           </w:p>
         </w:tc>
@@ -7299,7 +7740,7 @@
               <w:rPr>
                 <w:sz w:val="18"/>
               </w:rPr>
-              <w:t>disponibilidade_profissional</w:t>
+              <w:t>agenda_horario</w:t>
             </w:r>
           </w:p>
         </w:tc>
@@ -7313,7 +7754,7 @@
               <w:rPr>
                 <w:sz w:val="18"/>
               </w:rPr>
-              <w:t>Expediente semanal recorrente do profissional (1=Dom … 7=Sáb, vários turnos por dia).</w:t>
+              <w:t>Grade semanal de atendimento do profissional: várias janelas por dia, sem sobreposição (EXCLUDE), dia_semana ISO (1 = segunda … 7 = domingo). Substitui disponibilidade_profissional (0048).</w:t>
             </w:r>
           </w:p>
         </w:tc>
@@ -7329,7 +7770,7 @@
               <w:rPr>
                 <w:sz w:val="18"/>
               </w:rPr>
-              <w:t>BloqueioAgenda</w:t>
+              <w:t>AgendaExcecao</w:t>
             </w:r>
           </w:p>
         </w:tc>
@@ -7343,7 +7784,7 @@
               <w:rPr>
                 <w:sz w:val="18"/>
               </w:rPr>
-              <w:t>bloqueio_agenda</w:t>
+              <w:t>agenda_excecao</w:t>
             </w:r>
           </w:p>
         </w:tc>
@@ -7357,7 +7798,7 @@
               <w:rPr>
                 <w:sz w:val="18"/>
               </w:rPr>
-              <w:t>Bloqueio de agenda pontual ou recorrente (RRULE) de um profissional ou global (profissional nulo = todos).</w:t>
+              <w:t>Tudo o que muda a grade numa data (0048 unificou exceção, bloqueio e feriado): FOLGA (intervalo de datas; sem profissional = clínica inteira — feriado nacional/local ou recesso), HORARIO_DIFERENTE (substitui a grade num dia) e BLOQUEIO (instantes, pontual ou recorrente por RRULE DAILY/WEEKLY/MONTHLY; sem profissional = todos). Origem MANUAL, FERIADO_NACIONAL, FERIADO_LOCAL, RECESSO ou GCAL; inativa = registrada e ignorada.</w:t>
             </w:r>
           </w:p>
         </w:tc>
@@ -7373,7 +7814,7 @@
               <w:rPr>
                 <w:sz w:val="18"/>
               </w:rPr>
-              <w:t>ExcecaoDisponibilidade</w:t>
+              <w:t>Procedimento</w:t>
             </w:r>
           </w:p>
         </w:tc>
@@ -7387,7 +7828,7 @@
               <w:rPr>
                 <w:sz w:val="18"/>
               </w:rPr>
-              <w:t>excecao_disponibilidade</w:t>
+              <w:t>procedimento</w:t>
             </w:r>
           </w:p>
         </w:tc>
@@ -7401,7 +7842,7 @@
               <w:rPr>
                 <w:sz w:val="18"/>
               </w:rPr>
-              <w:t>Exceção pontual ao expediente numa data: FOLGA (dia bloqueado) ou HORARIO_DIFERENTE.</w:t>
+              <w:t>Serviço do catálogo: duração, intervalo após a sessão (0–120 min), categoria, modalidade, imagem e regra de retorno obrigatório (janela mínima/máxima em dias e duração do retorno, padrão 30 min).</w:t>
             </w:r>
           </w:p>
         </w:tc>
@@ -7417,7 +7858,7 @@
               <w:rPr>
                 <w:sz w:val="18"/>
               </w:rPr>
-              <w:t>Procedimento</w:t>
+              <w:t>Habilitacao</w:t>
             </w:r>
           </w:p>
         </w:tc>
@@ -7431,7 +7872,7 @@
               <w:rPr>
                 <w:sz w:val="18"/>
               </w:rPr>
-              <w:t>procedimento</w:t>
+              <w:t>habilitacao</w:t>
             </w:r>
           </w:p>
         </w:tc>
@@ -7445,7 +7886,7 @@
               <w:rPr>
                 <w:sz w:val="18"/>
               </w:rPr>
-              <w:t>Serviço do catálogo: duração, buffer (0–120 min), categoria, modalidade e regra de retorno obrigatório (janela em dias e duração do retorno).</w:t>
+              <w:t>Liga profissional e procedimento (M2M through): só profissional habilitado realiza o procedimento; sem nenhuma habilitação cadastrada, todos realizam.</w:t>
             </w:r>
           </w:p>
         </w:tc>
@@ -7461,7 +7902,7 @@
               <w:rPr>
                 <w:sz w:val="18"/>
               </w:rPr>
-              <w:t>Habilitacao</w:t>
+              <w:t>Preco</w:t>
             </w:r>
           </w:p>
         </w:tc>
@@ -7475,7 +7916,7 @@
               <w:rPr>
                 <w:sz w:val="18"/>
               </w:rPr>
-              <w:t>habilitacao</w:t>
+              <w:t>preco</w:t>
             </w:r>
           </w:p>
         </w:tc>
@@ -7489,7 +7930,7 @@
               <w:rPr>
                 <w:sz w:val="18"/>
               </w:rPr>
-              <w:t>Liga profissional e procedimento (M2M through): só profissional habilitado atende o procedimento.</w:t>
+              <w:t>Preço versionado por data de início de vigência (data local), base (sem profissional) ou por profissional; o atendimento usa o preço da data do atendimento (profissional &gt; base).</w:t>
             </w:r>
           </w:p>
         </w:tc>
@@ -7505,7 +7946,7 @@
               <w:rPr>
                 <w:sz w:val="18"/>
               </w:rPr>
-              <w:t>Preco</w:t>
+              <w:t>Promocao</w:t>
             </w:r>
           </w:p>
         </w:tc>
@@ -7519,7 +7960,7 @@
               <w:rPr>
                 <w:sz w:val="18"/>
               </w:rPr>
-              <w:t>preco</w:t>
+              <w:t>promocao</w:t>
             </w:r>
           </w:p>
         </w:tc>
@@ -7533,7 +7974,7 @@
               <w:rPr>
                 <w:sz w:val="18"/>
               </w:rPr>
-              <w:t>Preço versionado por vigência (vigente_desde, data local), base (sem profissional) ou por profissional.</w:t>
+              <w:t>Promoção por período: desconto percentual (0–100) XOR preço fixo; procedimento nulo = promoção geral (só percentual vale). Aplica-se só quando reduz o valor.</w:t>
             </w:r>
           </w:p>
         </w:tc>
@@ -7549,7 +7990,7 @@
               <w:rPr>
                 <w:sz w:val="18"/>
               </w:rPr>
-              <w:t>Promocao</w:t>
+              <w:t>Atendimento</w:t>
             </w:r>
           </w:p>
         </w:tc>
@@ -7563,7 +8004,7 @@
               <w:rPr>
                 <w:sz w:val="18"/>
               </w:rPr>
-              <w:t>promocao</w:t>
+              <w:t>atendimento</w:t>
             </w:r>
           </w:p>
         </w:tc>
@@ -7577,7 +8018,7 @@
               <w:rPr>
                 <w:sz w:val="18"/>
               </w:rPr>
-              <w:t>Promoção por período: desconto percentual (0–100) XOR preço fixo; procedimento nulo = promoção geral (só percentual vale).</w:t>
+              <w:t>Agendamento/sessão: cliente, profissional, procedimento, período, preço gravado (valor cobrado, valor original, promoção e descrição), retorno (eh_retorno + atendimento de origem), atendimento que este substitui (reagendamento) e FSM de 7 estados. Sem token próprio: links públicos em link_acesso.</w:t>
             </w:r>
           </w:p>
         </w:tc>
@@ -7593,7 +8034,7 @@
               <w:rPr>
                 <w:sz w:val="18"/>
               </w:rPr>
-              <w:t>Atendimento</w:t>
+              <w:t>Notificacao</w:t>
             </w:r>
           </w:p>
         </w:tc>
@@ -7607,7 +8048,7 @@
               <w:rPr>
                 <w:sz w:val="18"/>
               </w:rPr>
-              <w:t>atendimento</w:t>
+              <w:t>notificacao</w:t>
             </w:r>
           </w:p>
         </w:tc>
@@ -7621,7 +8062,7 @@
               <w:rPr>
                 <w:sz w:val="18"/>
               </w:rPr>
-              <w:t>Agendamento/sessão: cliente, profissional, procedimento, período, preço gravado (valor_cobrado, valor_original, promoção, descrição), retorno (eh_retorno + origem), reagendado_de e FSM de 7 estados.</w:t>
+              <w:t>Toda mensagem ligada a um atendimento (LEMBRETE, LEMBRETE_2H, CONFIRMACAO, CANCELAMENTO, NPS, PESQUISA, APROVACAO, TERMO) por canal (WhatsApp, SMS, e-mail) e status PENDENTE/ENVIADO/FALHOU. Também é a fila do e-mail transacional (tentativas, próxima tentativa; 0061); não guarda cópia de dado pessoal.</w:t>
             </w:r>
           </w:p>
         </w:tc>
@@ -7637,7 +8078,7 @@
               <w:rPr>
                 <w:sz w:val="18"/>
               </w:rPr>
-              <w:t>Notificacao</w:t>
+              <w:t>LinkAcesso</w:t>
             </w:r>
           </w:p>
         </w:tc>
@@ -7651,7 +8092,7 @@
               <w:rPr>
                 <w:sz w:val="18"/>
               </w:rPr>
-              <w:t>notificacao</w:t>
+              <w:t>link_acesso</w:t>
             </w:r>
           </w:p>
         </w:tc>
@@ -7665,7 +8106,7 @@
               <w:rPr>
                 <w:sz w:val="18"/>
               </w:rPr>
-              <w:t>Mensagem ligada a um atendimento (LEMBRETE D-1, NPS, TERMO, CONFIRMACAO, CANCELAMENTO, APROVACAO...), por canal, com status PENDENTE/ENVIADO/FALHOU e token do link público.</w:t>
+              <w:t>Link público com token (confirmar presença, NPS, termo, ficha, descadastro, feed iCal e o legado gerenciar agendamento): finalidade + exatamente 1 alvo; o banco guarda só o SHA-256 do token, a validade, o uso e a revogação (0049). O token em claro existe só na URL entregue.</w:t>
             </w:r>
           </w:p>
         </w:tc>
@@ -7681,7 +8122,7 @@
               <w:rPr>
                 <w:sz w:val="18"/>
               </w:rPr>
-              <w:t>Pacote</w:t>
+              <w:t>Usuario</w:t>
             </w:r>
           </w:p>
         </w:tc>
@@ -7695,7 +8136,7 @@
               <w:rPr>
                 <w:sz w:val="18"/>
               </w:rPr>
-              <w:t>pacote</w:t>
+              <w:t>usuario</w:t>
             </w:r>
           </w:p>
         </w:tc>
@@ -7709,7 +8150,7 @@
               <w:rPr>
                 <w:sz w:val="18"/>
               </w:rPr>
-              <w:t>Pacote de sessões com preço total e validade em meses; nome e itens congelados após a 1ª venda.</w:t>
+              <w:t>Usuário da equipe (login por e-mail): papel ADMIN, PROFISSIONAL ou RECEPCAO (sem login); is_staff = ADMIN; vínculo opcional 1:1 com Profissional; desativar em vez de excluir.</w:t>
             </w:r>
           </w:p>
         </w:tc>
@@ -7725,7 +8166,7 @@
               <w:rPr>
                 <w:sz w:val="18"/>
               </w:rPr>
-              <w:t>ItemPacote</w:t>
+              <w:t>AssinaturaPush</w:t>
             </w:r>
           </w:p>
         </w:tc>
@@ -7739,7 +8180,7 @@
               <w:rPr>
                 <w:sz w:val="18"/>
               </w:rPr>
-              <w:t>item_pacote</w:t>
+              <w:t>assinatura_push</w:t>
             </w:r>
           </w:p>
         </w:tc>
@@ -7753,7 +8194,7 @@
               <w:rPr>
                 <w:sz w:val="18"/>
               </w:rPr>
-              <w:t>Item do pacote: procedimento e quantidade de sessões.</w:t>
+              <w:t>Inscrição Web Push (VAPID) de um usuário da equipe, para o aviso de novo agendamento.</w:t>
             </w:r>
           </w:p>
         </w:tc>
@@ -7769,7 +8210,7 @@
               <w:rPr>
                 <w:sz w:val="18"/>
               </w:rPr>
-              <w:t>CompraPacote</w:t>
+              <w:t>LogAuditoria</w:t>
             </w:r>
           </w:p>
         </w:tc>
@@ -7783,7 +8224,7 @@
               <w:rPr>
                 <w:sz w:val="18"/>
               </w:rPr>
-              <w:t>compra_pacote</w:t>
+              <w:t>log_auditoria</w:t>
             </w:r>
           </w:p>
         </w:tc>
@@ -7797,7 +8238,7 @@
               <w:rPr>
                 <w:sz w:val="18"/>
               </w:rPr>
-              <w:t>Venda de pacote a uma cliente: valor pago, status ATIVO/FINALIZADO/CANCELADO/EXPIRADO e data de expiração.</w:t>
+              <w:t>Trilha de auditoria das ações (LGPD art. 37): autor + snapshot "Nome &lt;email&gt;", ação, tabela, registro, detalhes com PII mascarada e IP. Append-only no banco (0059): só a purga com 180+ dias, a pseudonimização do esquecimento e o SET NULL do autor.</w:t>
             </w:r>
           </w:p>
         </w:tc>
@@ -7813,7 +8254,7 @@
               <w:rPr>
                 <w:sz w:val="18"/>
               </w:rPr>
-              <w:t>ConsumoSessao</w:t>
+              <w:t>HistoricoAlteracao</w:t>
             </w:r>
           </w:p>
         </w:tc>
@@ -7827,7 +8268,7 @@
               <w:rPr>
                 <w:sz w:val="18"/>
               </w:rPr>
-              <w:t>consumo_sessao</w:t>
+              <w:t>historico_alteracao</w:t>
             </w:r>
           </w:p>
         </w:tc>
@@ -7841,7 +8282,7 @@
               <w:rPr>
                 <w:sz w:val="18"/>
               </w:rPr>
-              <w:t>Consumo de 1 sessão de uma compra de pacote por um atendimento REALIZADO (OneToOne com o atendimento).</w:t>
+              <w:t>Trilha de dados gravada por trigger (0056) nas 11 tabelas sensíveis: operação, colunas alteradas com antes/depois (senha redigida), autor, IP, origem (web, cron, comando, migração) e transação. Append-only; leitura auditada.</w:t>
             </w:r>
           </w:p>
         </w:tc>
@@ -7857,7 +8298,7 @@
               <w:rPr>
                 <w:sz w:val="18"/>
               </w:rPr>
-              <w:t>Prontuario</w:t>
+              <w:t>Consentimento</w:t>
             </w:r>
           </w:p>
         </w:tc>
@@ -7871,7 +8312,7 @@
               <w:rPr>
                 <w:sz w:val="18"/>
               </w:rPr>
-              <w:t>prontuario</w:t>
+              <w:t>consentimento</w:t>
             </w:r>
           </w:p>
         </w:tc>
@@ -7885,7 +8326,7 @@
               <w:rPr>
                 <w:sz w:val="18"/>
               </w:rPr>
-              <w:t>Ficha base 1:1 da cliente: alergias, contraindicações, histórico, medicamentos, observações e perguntas configuráveis (respostas_extras JSONB).</w:t>
+              <w:t>Histórico append-only de autorizações de comunicação por finalidade × canal (MARKETING/E-MAIL, LEMBRETE_AGENDAMENTO/WHATSAPP, PESQUISA_SATISFACAO/WHATSAPP): concedido ou revogado, origem, texto exibido, IP, navegador, autor e data. Vale a linha mais recente do par; sem linha = não concedido (0050).</w:t>
             </w:r>
           </w:p>
         </w:tc>
@@ -7901,7 +8342,7 @@
               <w:rPr>
                 <w:sz w:val="18"/>
               </w:rPr>
-              <w:t>ProntuarioVersao</w:t>
+              <w:t>Prontuario</w:t>
             </w:r>
           </w:p>
         </w:tc>
@@ -7915,7 +8356,7 @@
               <w:rPr>
                 <w:sz w:val="18"/>
               </w:rPr>
-              <w:t>prontuario_versao</w:t>
+              <w:t>prontuario</w:t>
             </w:r>
           </w:p>
         </w:tc>
@@ -7929,7 +8370,7 @@
               <w:rPr>
                 <w:sz w:val="18"/>
               </w:rPr>
-              <w:t>Histórico append-only do prontuário: foto do estado anterior a cada edição, com autor e data (imutável no model e por trigger no PG).</w:t>
+              <w:t>Ficha base 1:1 da cliente preenchida pela equipe: alergias, contraindicações, histórico, medicamentos, observações e respostas do questionário do prontuário (formulário PRONTUARIO, 0051). Conteúdo cifrado em repouso (0060).</w:t>
             </w:r>
           </w:p>
         </w:tc>
@@ -7945,7 +8386,7 @@
               <w:rPr>
                 <w:sz w:val="18"/>
               </w:rPr>
-              <w:t>AnotacaoSessao</w:t>
+              <w:t>ProntuarioVersao</w:t>
             </w:r>
           </w:p>
         </w:tc>
@@ -7959,7 +8400,7 @@
               <w:rPr>
                 <w:sz w:val="18"/>
               </w:rPr>
-              <w:t>anotacao_sessao</w:t>
+              <w:t>prontuario_versao</w:t>
             </w:r>
           </w:p>
         </w:tc>
@@ -7973,7 +8414,7 @@
               <w:rPr>
                 <w:sz w:val="18"/>
               </w:rPr>
-              <w:t>Anotação clínica de um atendimento, com autor preservado (PROTECT + snapshot autor_nome).</w:t>
+              <w:t>Histórico append-only do prontuário: foto do estado anterior a cada edição (cifrada), com autor e data.</w:t>
             </w:r>
           </w:p>
         </w:tc>
@@ -7989,7 +8430,7 @@
               <w:rPr>
                 <w:sz w:val="18"/>
               </w:rPr>
-              <w:t>FormularioAnamnese</w:t>
+              <w:t>AnotacaoSessao</w:t>
             </w:r>
           </w:p>
         </w:tc>
@@ -8003,7 +8444,7 @@
               <w:rPr>
                 <w:sz w:val="18"/>
               </w:rPr>
-              <w:t>formulario_anamnese</w:t>
+              <w:t>anotacao_sessao</w:t>
             </w:r>
           </w:p>
         </w:tc>
@@ -8017,7 +8458,7 @@
               <w:rPr>
                 <w:sz w:val="18"/>
               </w:rPr>
-              <w:t>Modelo de questionário (ANAMNESE pré-atendimento ou PESQUISA) em schema JSON, com escopo (global, categoria, procedimento, modalidade) e flag obrigatório.</w:t>
+              <w:t>Anotação da sessão de um atendimento (texto cifrado), com autor preservado (PROTECT + snapshot do nome). Append-only: correção = nova anotação.</w:t>
             </w:r>
           </w:p>
         </w:tc>
@@ -8033,7 +8474,7 @@
               <w:rPr>
                 <w:sz w:val="18"/>
               </w:rPr>
-              <w:t>RespostaAnamnese</w:t>
+              <w:t>FormularioAnamnese</w:t>
             </w:r>
           </w:p>
         </w:tc>
@@ -8047,7 +8488,7 @@
               <w:rPr>
                 <w:sz w:val="18"/>
               </w:rPr>
-              <w:t>resposta_anamnese</w:t>
+              <w:t>formulario</w:t>
             </w:r>
           </w:p>
         </w:tc>
@@ -8061,7 +8502,7 @@
               <w:rPr>
                 <w:sz w:val="18"/>
               </w:rPr>
-              <w:t>Ficha respondida pela cliente (JSON), ligada ao atendimento; token do link público (60 dias).</w:t>
+              <w:t>Questionário em lista de perguntas (key, tipo, rótulo, obrigatória, opções, alerta de saúde): ANAMNESE e PESQUISA respondidas pela cliente e PRONTUARIO (perguntas extras da ficha, preenchidas pela equipe — no máximo 1 ativo, sempre global e não obrigatório). Escopo global, categoria, procedimento ou modalidade. Tabela formulario.</w:t>
             </w:r>
           </w:p>
         </w:tc>
@@ -8077,7 +8518,7 @@
               <w:rPr>
                 <w:sz w:val="18"/>
               </w:rPr>
-              <w:t>AvaliacaoNPS</w:t>
+              <w:t>RespostaAnamnese</w:t>
             </w:r>
           </w:p>
         </w:tc>
@@ -8091,7 +8532,7 @@
               <w:rPr>
                 <w:sz w:val="18"/>
               </w:rPr>
-              <w:t>avaliacao_nps</w:t>
+              <w:t>resposta_formulario</w:t>
             </w:r>
           </w:p>
         </w:tc>
@@ -8105,7 +8546,7 @@
               <w:rPr>
                 <w:sz w:val="18"/>
               </w:rPr>
-              <w:t>Avaliação NPS 0–10 de um atendimento, comentário, opt-in de publicação da cliente e aprovação da clínica (depoimento).</w:t>
+              <w:t>Ficha respondida pela cliente (respostas cifradas), ligada ao atendimento; o convite por link vive em link_acesso (FORMULARIO, 60 dias). Tabela resposta_formulario.</w:t>
             </w:r>
           </w:p>
         </w:tc>
@@ -8121,7 +8562,7 @@
               <w:rPr>
                 <w:sz w:val="18"/>
               </w:rPr>
-              <w:t>ListaEspera</w:t>
+              <w:t>VersaoTermo</w:t>
             </w:r>
           </w:p>
         </w:tc>
@@ -8135,7 +8576,7 @@
               <w:rPr>
                 <w:sz w:val="18"/>
               </w:rPr>
-              <w:t>lista_espera</w:t>
+              <w:t>versao_termo</w:t>
             </w:r>
           </w:p>
         </w:tc>
@@ -8149,7 +8590,7 @@
               <w:rPr>
                 <w:sz w:val="18"/>
               </w:rPr>
-              <w:t>Pedido de aviso de vaga: procedimento, data, turno, profissional opcional e e-mail de contato da inscrição.</w:t>
+              <w:t>Termo versionado: LGPD (Política de Privacidade), SAUDE (consentimento para dado de saúde, art. 11) ou PROCEDIMENTO (geral ou de um procedimento); 1 versão ativa por escopo; imutável depois do 1º aceite.</w:t>
             </w:r>
           </w:p>
         </w:tc>
@@ -8165,7 +8606,7 @@
               <w:rPr>
                 <w:sz w:val="18"/>
               </w:rPr>
-              <w:t>LogAuditoria</w:t>
+              <w:t>AceiteTermo</w:t>
             </w:r>
           </w:p>
         </w:tc>
@@ -8179,7 +8620,7 @@
               <w:rPr>
                 <w:sz w:val="18"/>
               </w:rPr>
-              <w:t>log_auditoria</w:t>
+              <w:t>aceite_termo</w:t>
             </w:r>
           </w:p>
         </w:tc>
@@ -8193,7 +8634,7 @@
               <w:rPr>
                 <w:sz w:val="18"/>
               </w:rPr>
-              <w:t>Trilha de auditoria (LGPD art. 37): autor + snapshot do nome, ação, tabela, registro, detalhes JSON com PII mascarada e IP.</w:t>
+              <w:t>Prova de aceite de termo: cliente, versão, atendimento, IP, navegador e SHA-256 do texto aceito. Imutável e nunca apagado.</w:t>
             </w:r>
           </w:p>
         </w:tc>
@@ -8209,7 +8650,7 @@
               <w:rPr>
                 <w:sz w:val="18"/>
               </w:rPr>
-              <w:t>Feriado</w:t>
+              <w:t>CodigoOtp</w:t>
             </w:r>
           </w:p>
         </w:tc>
@@ -8223,7 +8664,7 @@
               <w:rPr>
                 <w:sz w:val="18"/>
               </w:rPr>
-              <w:t>feriado</w:t>
+              <w:t>codigo_otp</w:t>
             </w:r>
           </w:p>
         </w:tc>
@@ -8237,7 +8678,7 @@
               <w:rPr>
                 <w:sz w:val="18"/>
               </w:rPr>
-              <w:t>Feriado ou recesso (nacional, local ou da clínica) que pode bloquear o agendamento.</w:t>
+              <w:t>Desafio OTP de 6 dígitos guardado como HMAC-SHA256, preso ao telefone, com propósito AGENDAMENTO, LOGIN_CLIENTE ou DSAR, validade de 10 min e até 5 tentativas.</w:t>
             </w:r>
           </w:p>
         </w:tc>
@@ -8253,7 +8694,7 @@
               <w:rPr>
                 <w:sz w:val="18"/>
               </w:rPr>
-              <w:t>Configuracao</w:t>
+              <w:t>AvaliacaoNPS</w:t>
             </w:r>
           </w:p>
         </w:tc>
@@ -8267,7 +8708,7 @@
               <w:rPr>
                 <w:sz w:val="18"/>
               </w:rPr>
-              <w:t>configuracao</w:t>
+              <w:t>avaliacao_nps</w:t>
             </w:r>
           </w:p>
         </w:tc>
@@ -8281,7 +8722,7 @@
               <w:rPr>
                 <w:sz w:val="18"/>
               </w:rPr>
-              <w:t>Chave-valor editável no painel: campos do Branding, email_admin, prontuario_perguntas e MAX_FALTAS_BLOQUEIO.</w:t>
+              <w:t>Avaliação NPS 0–10 de um atendimento: comentário, autorização de publicação da cliente, aprovação da clínica (só com a autorização) e alerta de detrator enviado.</w:t>
             </w:r>
           </w:p>
         </w:tc>
@@ -8297,7 +8738,7 @@
               <w:rPr>
                 <w:sz w:val="18"/>
               </w:rPr>
-              <w:t>CodigoOtp</w:t>
+              <w:t>ListaEspera</w:t>
             </w:r>
           </w:p>
         </w:tc>
@@ -8311,7 +8752,7 @@
               <w:rPr>
                 <w:sz w:val="18"/>
               </w:rPr>
-              <w:t>codigo_otp</w:t>
+              <w:t>lista_espera</w:t>
             </w:r>
           </w:p>
         </w:tc>
@@ -8325,7 +8766,7 @@
               <w:rPr>
                 <w:sz w:val="18"/>
               </w:rPr>
-              <w:t>Desafio OTP de 6 dígitos (HMAC-SHA256 com a SECRET_KEY), preso ao telefone, com propósito (AGENDAMENTO, LOGIN_CLIENTE, DSAR), validade e tentativas.</w:t>
+              <w:t>Pedido de aviso de vaga: procedimento, data, turno, profissional desejado opcional e e-mail de contato só da inscrição; 1 pedido pendente por cliente/procedimento/data.</w:t>
             </w:r>
           </w:p>
         </w:tc>
@@ -8341,7 +8782,7 @@
               <w:rPr>
                 <w:sz w:val="18"/>
               </w:rPr>
-              <w:t>Usuario</w:t>
+              <w:t>Pacote</w:t>
             </w:r>
           </w:p>
         </w:tc>
@@ -8355,7 +8796,7 @@
               <w:rPr>
                 <w:sz w:val="18"/>
               </w:rPr>
-              <w:t>usuario</w:t>
+              <w:t>pacote</w:t>
             </w:r>
           </w:p>
         </w:tc>
@@ -8369,7 +8810,7 @@
               <w:rPr>
                 <w:sz w:val="18"/>
               </w:rPr>
-              <w:t>Usuário da equipe (login por e-mail): papel ADMIN, PROFISSIONAL ou RECEPCAO (sem login); is_staff = ADMIN.</w:t>
+              <w:t>Catálogo de pacotes de sessões: valor total e validade em meses. Editável a qualquer momento — vale só para vendas futuras (o vendido fica congelado em compra_pacote_item).</w:t>
             </w:r>
           </w:p>
         </w:tc>
@@ -8385,7 +8826,7 @@
               <w:rPr>
                 <w:sz w:val="18"/>
               </w:rPr>
-              <w:t>Carteira</w:t>
+              <w:t>ItemPacote</w:t>
             </w:r>
           </w:p>
         </w:tc>
@@ -8399,7 +8840,7 @@
               <w:rPr>
                 <w:sz w:val="18"/>
               </w:rPr>
-              <w:t>carteira</w:t>
+              <w:t>pacote_item</w:t>
             </w:r>
           </w:p>
         </w:tc>
@@ -8413,7 +8854,7 @@
               <w:rPr>
                 <w:sz w:val="18"/>
               </w:rPr>
-              <w:t>Saldo de crédito da cliente (hoje só cashback de indicação e estorno); CHECK saldo &gt;= 0.</w:t>
+              <w:t>Item do catálogo do pacote: procedimento e quantidade de sessões. Tabela pacote_item.</w:t>
             </w:r>
           </w:p>
         </w:tc>
@@ -8429,7 +8870,7 @@
               <w:rPr>
                 <w:sz w:val="18"/>
               </w:rPr>
-              <w:t>MovimentoCarteira</w:t>
+              <w:t>CompraPacote</w:t>
             </w:r>
           </w:p>
         </w:tc>
@@ -8443,7 +8884,7 @@
               <w:rPr>
                 <w:sz w:val="18"/>
               </w:rPr>
-              <w:t>movimento_carteira</w:t>
+              <w:t>compra_pacote</w:t>
             </w:r>
           </w:p>
         </w:tc>
@@ -8457,7 +8898,7 @@
               <w:rPr>
                 <w:sz w:val="18"/>
               </w:rPr>
-              <w:t>Lançamento do ledger da carteira (crédito/débito, origem, saldo resultante); imutável por trigger.</w:t>
+              <w:t>Venda de pacote a uma cliente: nome do pacote congelado, valor pago, valor reembolsado, status ATIVO/FINALIZADO/CANCELADO/EXPIRADO e data de expiração.</w:t>
             </w:r>
           </w:p>
         </w:tc>
@@ -8473,7 +8914,7 @@
               <w:rPr>
                 <w:sz w:val="18"/>
               </w:rPr>
-              <w:t>RegraComissao</w:t>
+              <w:t>CompraPacoteItem</w:t>
             </w:r>
           </w:p>
         </w:tc>
@@ -8487,7 +8928,7 @@
               <w:rPr>
                 <w:sz w:val="18"/>
               </w:rPr>
-              <w:t>regra_comissao</w:t>
+              <w:t>compra_pacote_item</w:t>
             </w:r>
           </w:p>
         </w:tc>
@@ -8501,7 +8942,7 @@
               <w:rPr>
                 <w:sz w:val="18"/>
               </w:rPr>
-              <w:t>Regra de comissão por profissional e/ou procedimento: percentual (0–100) XOR valor fixo.</w:t>
+              <w:t>O que foi vendido (snapshot imutável, 0052): procedimento, nome, quantidade de sessões e valor unitário (valor pago ÷ sessões — base da comissão da sessão de pacote).</w:t>
             </w:r>
           </w:p>
         </w:tc>
@@ -8517,7 +8958,7 @@
               <w:rPr>
                 <w:sz w:val="18"/>
               </w:rPr>
-              <w:t>MovimentoComissao</w:t>
+              <w:t>ConsumoSessao</w:t>
             </w:r>
           </w:p>
         </w:tc>
@@ -8531,7 +8972,7 @@
               <w:rPr>
                 <w:sz w:val="18"/>
               </w:rPr>
-              <w:t>movimento_comissao</w:t>
+              <w:t>consumo_sessao</w:t>
             </w:r>
           </w:p>
         </w:tc>
@@ -8545,7 +8986,7 @@
               <w:rPr>
                 <w:sz w:val="18"/>
               </w:rPr>
-              <w:t>Comissão de um atendimento realizado: valor, status PENDENTE/PAGA/ESTORNADA.</w:t>
+              <w:t>Consumo de 1 sessão de um item da compra por um atendimento REALIZADO (OneToOne com o atendimento): mesmo procedimento, mesma compra, nunca retorno e só com saldo.</w:t>
             </w:r>
           </w:p>
         </w:tc>
@@ -8561,7 +9002,7 @@
               <w:rPr>
                 <w:sz w:val="18"/>
               </w:rPr>
-              <w:t>VersaoTermo</w:t>
+              <w:t>Carteira</w:t>
             </w:r>
           </w:p>
         </w:tc>
@@ -8575,7 +9016,7 @@
               <w:rPr>
                 <w:sz w:val="18"/>
               </w:rPr>
-              <w:t>versao_termo</w:t>
+              <w:t>carteira</w:t>
             </w:r>
           </w:p>
         </w:tc>
@@ -8589,7 +9030,7 @@
               <w:rPr>
                 <w:sz w:val="18"/>
               </w:rPr>
-              <w:t>Termo versionado (LGPD global ou PROCEDIMENTO); 1 versão ativa por escopo; imutável depois do 1º aceite.</w:t>
+              <w:t>Saldo de crédito da cliente (cashback de indicação e estorno); CHECK saldo ≥ 0.</w:t>
             </w:r>
           </w:p>
         </w:tc>
@@ -8605,7 +9046,7 @@
               <w:rPr>
                 <w:sz w:val="18"/>
               </w:rPr>
-              <w:t>AceiteTermo</w:t>
+              <w:t>MovimentoCarteira</w:t>
             </w:r>
           </w:p>
         </w:tc>
@@ -8619,7 +9060,7 @@
               <w:rPr>
                 <w:sz w:val="18"/>
               </w:rPr>
-              <w:t>aceite_termo</w:t>
+              <w:t>movimento_carteira</w:t>
             </w:r>
           </w:p>
         </w:tc>
@@ -8633,7 +9074,7 @@
               <w:rPr>
                 <w:sz w:val="18"/>
               </w:rPr>
-              <w:t>Prova de aceite de termo: cliente, versão, atendimento, IP, navegador, SHA-256 do texto e data; imutável (trigger no PG).</w:t>
+              <w:t>Lançamento do livro-razão da carteira (crédito/débito, origem, saldo resultante, autor); imutável por trigger; 1 cashback por atendimento.</w:t>
             </w:r>
           </w:p>
         </w:tc>
@@ -8649,7 +9090,7 @@
               <w:rPr>
                 <w:sz w:val="18"/>
               </w:rPr>
-              <w:t>AssinaturaPush</w:t>
+              <w:t>RegraComissao</w:t>
             </w:r>
           </w:p>
         </w:tc>
@@ -8663,7 +9104,7 @@
               <w:rPr>
                 <w:sz w:val="18"/>
               </w:rPr>
-              <w:t>assinatura_push</w:t>
+              <w:t>regra_comissao</w:t>
             </w:r>
           </w:p>
         </w:tc>
@@ -8677,7 +9118,7 @@
               <w:rPr>
                 <w:sz w:val="18"/>
               </w:rPr>
-              <w:t>Inscrição Web Push (VAPID) de um usuário da equipe.</w:t>
+              <w:t>Regra de comissão por profissional e/ou procedimento: percentual (0–100) XOR valor fixo; regra já usada é protegida (só desativa).</w:t>
             </w:r>
           </w:p>
         </w:tc>
@@ -8693,6 +9134,94 @@
               <w:rPr>
                 <w:sz w:val="18"/>
               </w:rPr>
+              <w:t>MovimentoComissao</w:t>
+            </w:r>
+          </w:p>
+        </w:tc>
+        <w:tc>
+          <w:tcPr>
+            <w:tcW w:type="dxa" w:w="2016"/>
+          </w:tcPr>
+          <w:p>
+            <w:r/>
+            <w:r>
+              <w:rPr>
+                <w:sz w:val="18"/>
+              </w:rPr>
+              <w:t>movimento_comissao</w:t>
+            </w:r>
+          </w:p>
+        </w:tc>
+        <w:tc>
+          <w:tcPr>
+            <w:tcW w:type="dxa" w:w="5472"/>
+          </w:tcPr>
+          <w:p>
+            <w:r/>
+            <w:r>
+              <w:rPr>
+                <w:sz w:val="18"/>
+              </w:rPr>
+              <w:t>Livro-razão da comissão (0053): CREDITO (1 por atendimento realizado, com a regra), PAGAMENTO (baixa, com autor) e ESTORNO (cancelamento), os dois últimos referenciando o crédito. Status e saldo são derivados; o saldo pode ficar negativo (comissão paga e depois estornada).</w:t>
+            </w:r>
+          </w:p>
+        </w:tc>
+      </w:tr>
+      <w:tr>
+        <w:tc>
+          <w:tcPr>
+            <w:tcW w:type="dxa" w:w="2160"/>
+          </w:tcPr>
+          <w:p>
+            <w:r/>
+            <w:r>
+              <w:rPr>
+                <w:sz w:val="18"/>
+              </w:rPr>
+              <w:t>Configuracao</w:t>
+            </w:r>
+          </w:p>
+        </w:tc>
+        <w:tc>
+          <w:tcPr>
+            <w:tcW w:type="dxa" w:w="2016"/>
+          </w:tcPr>
+          <w:p>
+            <w:r/>
+            <w:r>
+              <w:rPr>
+                <w:sz w:val="18"/>
+              </w:rPr>
+              <w:t>configuracao</w:t>
+            </w:r>
+          </w:p>
+        </w:tc>
+        <w:tc>
+          <w:tcPr>
+            <w:tcW w:type="dxa" w:w="5472"/>
+          </w:tcPr>
+          <w:p>
+            <w:r/>
+            <w:r>
+              <w:rPr>
+                <w:sz w:val="18"/>
+              </w:rPr>
+              <w:t>Chave-valor editável no painel: campos do Branding, e-mail de alertas da clínica e MAX_FALTAS_BLOQUEIO (opcional).</w:t>
+            </w:r>
+          </w:p>
+        </w:tc>
+      </w:tr>
+      <w:tr>
+        <w:tc>
+          <w:tcPr>
+            <w:tcW w:type="dxa" w:w="2160"/>
+          </w:tcPr>
+          <w:p>
+            <w:r/>
+            <w:r>
+              <w:rPr>
+                <w:sz w:val="18"/>
+              </w:rPr>
               <w:t>TimestampedMixin [ABSTRATO]</w:t>
             </w:r>
           </w:p>
@@ -8721,7 +9250,7 @@
               <w:rPr>
                 <w:sz w:val="18"/>
               </w:rPr>
-              <w:t>ABSTRATO: adiciona criado_em + atualizado_em (usado por Carteira e RegraComissao).</w:t>
+              <w:t>ABSTRATO: adiciona criado_em + atualizado_em com DEFAULT now() no banco (usado por Carteira e RegraComissao).</w:t>
             </w:r>
           </w:p>
         </w:tc>
@@ -8766,7 +9295,7 @@
       <w:r>
         <w:drawing>
           <wp:inline xmlns:a="http://schemas.openxmlformats.org/drawingml/2006/main" xmlns:pic="http://schemas.openxmlformats.org/drawingml/2006/picture">
-            <wp:extent cx="8412480" cy="5847961"/>
+            <wp:extent cx="7091846" cy="5212080"/>
             <wp:docPr id="6" name="Picture 6"/>
             <wp:cNvGraphicFramePr>
               <a:graphicFrameLocks noChangeAspect="1"/>
@@ -8787,7 +9316,7 @@
                   <pic:spPr>
                     <a:xfrm>
                       <a:off x="0" y="0"/>
-                      <a:ext cx="8412480" cy="5847961"/>
+                      <a:ext cx="7091846" cy="5212080"/>
                     </a:xfrm>
                     <a:prstGeom prst="rect"/>
                   </pic:spPr>
@@ -9021,7 +9550,7 @@
               <w:rPr>
                 <w:sz w:val="18"/>
               </w:rPr>
-              <w:t>cancelar() — rejeitar pedido, cliente cancela ou job limpeza_status (vencido há 24 h)</w:t>
+              <w:t>cancelar() — rejeitar pedido, cliente cancela (portal) ou job limpeza_status (vencido há 24 h)</w:t>
             </w:r>
           </w:p>
         </w:tc>
@@ -9065,7 +9594,7 @@
               <w:rPr>
                 <w:sz w:val="18"/>
               </w:rPr>
-              <w:t>marcar_reagendado() — reagendamento</w:t>
+              <w:t>marcar_reagendado() — services/agenda.reagendar</w:t>
             </w:r>
           </w:p>
         </w:tc>
@@ -9285,7 +9814,7 @@
               <w:rPr>
                 <w:sz w:val="18"/>
               </w:rPr>
-              <w:t>marcar_reagendado()</w:t>
+              <w:t>marcar_reagendado() — services/agenda.reagendar</w:t>
             </w:r>
           </w:p>
         </w:tc>
@@ -9461,7 +9990,7 @@
               <w:rPr>
                 <w:sz w:val="18"/>
               </w:rPr>
-              <w:t>marcar_reagendado()</w:t>
+              <w:t>marcar_reagendado() — services/agenda.reagendar</w:t>
             </w:r>
           </w:p>
         </w:tc>
@@ -9473,7 +10002,7 @@
         <w:pStyle w:val="Heading2"/>
       </w:pPr>
       <w:r>
-        <w:t>8.2 Efeitos automáticos (signals / EventBus / jobs)</w:t>
+        <w:t>8.2 Efeitos automáticos (services/atendimento / jobs)</w:t>
       </w:r>
     </w:p>
     <w:p>
@@ -9484,7 +10013,7 @@
         <w:rPr>
           <w:sz w:val="18"/>
         </w:rPr>
-        <w:t>Toda transição: _transicionar trava a linha (select_for_update), valida TRANSICOES contra o status atual do banco, grava status + LogAuditoria na mesma transação (auditoria em savepoint). Transição inválida levanta Atendimento.TransicaoInvalida (a tela mostra a mensagem).</w:t>
+        <w:t>Toda transição: _transicionar trava a linha (select_for_update), valida TRANSICOES contra o status atual do banco, grava status + LogAuditoria e aplica os efeitos (services/atendimento.ao_mudar_status) na MESMA transação: efeito que falha desfaz a transição inteira. Transição inválida levanta Atendimento.TransicaoInvalida (a tela mostra a mensagem).</w:t>
       </w:r>
     </w:p>
     <w:p>
@@ -9495,7 +10024,7 @@
         <w:rPr>
           <w:sz w:val="18"/>
         </w:rPr>
-        <w:t>Criação (post_save): push "Novo agendamento" ao profissional e sync com o Google Calendar, ambos no on_commit e best-effort.</w:t>
+        <w:t>Criação (services/agenda.reservar → ao_criar): push "Novo agendamento" ao profissional e sync com o Google Calendar no on_commit, best-effort.</w:t>
       </w:r>
     </w:p>
     <w:p>
@@ -9506,7 +10035,7 @@
         <w:rPr>
           <w:sz w:val="18"/>
         </w:rPr>
-        <w:t>→ REALIZADO (signals): zera faltas e desbloqueia a cliente; debita 1 sessão do pacote que vence primeiro (nunca em retorno; validade conferida na data da sessão). EventBus AtendimentoRealizado: comissão (base = valor cobrado, ou valor pago do pacote ÷ sessões), cashback da indicadora no 1º atendimento pago, retorno obrigatório (PENDENTE, valor 0) se o procedimento exige.</w:t>
+        <w:t>→ REALIZADO, em ordem: zera faltas e desbloqueia a cliente; debita 1 sessão do item congelado do pacote que vence primeiro (nunca em retorno; validade na data da sessão); lança o CREDITO de comissão (base = valor cobrado, ou valor unitário congelado da sessão de pacote); libera o cashback da indicadora no 1º atendimento pago; cria o retorno obrigatório (PENDENTE, valor 0) se o procedimento exige.</w:t>
       </w:r>
     </w:p>
     <w:p>
@@ -9517,7 +10046,7 @@
         <w:rPr>
           <w:sz w:val="18"/>
         </w:rPr>
-        <w:t>→ FALTOU (signals): registrar_falta — soma falta e bloqueia o agendamento online ao atingir o limite (padrão 3). Evento AtendimentoFaltou sem handler.</w:t>
+        <w:t>→ FALTOU: registrar_falta — soma a falta e suspende o agendamento online no limite (padrão 3).</w:t>
       </w:r>
     </w:p>
     <w:p>
@@ -9528,7 +10057,7 @@
         <w:rPr>
           <w:sz w:val="18"/>
         </w:rPr>
-        <w:t>→ CANCELADO: EventBus AtendimentoCancelado estorna comissão e cashback; signals avisa a lista de espera (se o horário é futuro).</w:t>
+        <w:t>→ CANCELADO: lança o ESTORNO da comissão e estorna o cashback; vindo de um estado ativo, avisa a lista de espera. Cancelado pela clínica: e-mail à cliente (fila de e-mail).</w:t>
       </w:r>
     </w:p>
     <w:p>
@@ -9539,7 +10068,7 @@
         <w:rPr>
           <w:sz w:val="18"/>
         </w:rPr>
-        <w:t>→ REAGENDADO: signals avisa a lista de espera (se o horário é futuro); sem evento de domínio.</w:t>
+        <w:t>→ REAGENDADO: vindo de um estado ativo, avisa a lista de espera.</w:t>
       </w:r>
     </w:p>
     <w:p>
@@ -9550,7 +10079,7 @@
         <w:rPr>
           <w:sz w:val="18"/>
         </w:rPr>
-        <w:t>→ CONFIRMADO: evento AtendimentoConfirmado só registra log.</w:t>
+        <w:t>Lista de espera: seleção dos compatíveis em savepoint na transação de quem liberou a vaga; e-mail e WhatsApp no on_commit; falha no aviso nunca desfaz o cancelamento.</w:t>
       </w:r>
     </w:p>
     <w:p>
@@ -9561,7 +10090,7 @@
         <w:rPr>
           <w:sz w:val="18"/>
         </w:rPr>
-        <w:t>Lista de espera (mecanismo único): a seleção dos pedidos compatíveis roda na transação de quem liberou a vaga; e-mail e WhatsApp saem no on_commit; notificado só com entrega.</w:t>
+        <w:t>Aprovação (PENDENTE → AGENDADO) e rejeição geram e-mail à cliente pela fila de e-mail (Notificacao EMAIL na mesma transação, envio no on_commit, reenvio pelo job emails).</w:t>
       </w:r>
     </w:p>
     <w:p>
@@ -9583,7 +10112,7 @@
         <w:rPr>
           <w:sz w:val="18"/>
         </w:rPr>
-        <w:t>PENDENTE vencido há 24 h → CANCELADO pelo job limpeza_status; AGENDADO/CONFIRMADO sem desfecho só vão para o log (a equipe decide).</w:t>
+        <w:t>PENDENTE vencido há 24 h → CANCELADO pelo job limpeza_status; AGENDADO/CONFIRMADO sem desfecho só vão para o log (a equipe decide falta ou realizado).</w:t>
       </w:r>
     </w:p>
     <w:p>
@@ -9594,7 +10123,7 @@
         <w:rPr>
           <w:sz w:val="18"/>
         </w:rPr>
-        <w:t>EventBus síncrono, in-process e best-effort: falha de handler é logada e não desfaz a transição.</w:t>
+        <w:t>Toda escrita em atendimento entra na trilha historico_alteracao (trigger) com autor, IP e origem.</w:t>
       </w:r>
     </w:p>
     <w:p>
@@ -9620,22 +10149,12 @@
     </w:p>
     <w:p>
       <w:pPr>
-        <w:sectPr>
-          <w:pgSz w:w="12240" w:h="15840"/>
-          <w:pgMar w:top="1440" w:right="1800" w:bottom="1440" w:left="1800" w:header="720" w:footer="720" w:gutter="0"/>
-          <w:cols w:space="720"/>
-          <w:docGrid w:linePitch="360"/>
-        </w:sectPr>
-      </w:pPr>
-    </w:p>
-    <w:p>
-      <w:pPr>
         <w:jc w:val="center"/>
       </w:pPr>
       <w:r>
         <w:drawing>
           <wp:inline xmlns:a="http://schemas.openxmlformats.org/drawingml/2006/main" xmlns:pic="http://schemas.openxmlformats.org/drawingml/2006/picture">
-            <wp:extent cx="8412480" cy="7457492"/>
+            <wp:extent cx="5486400" cy="4975894"/>
             <wp:docPr id="7" name="Picture 7"/>
             <wp:cNvGraphicFramePr>
               <a:graphicFrameLocks noChangeAspect="1"/>
@@ -9656,7 +10175,7 @@
                   <pic:spPr>
                     <a:xfrm>
                       <a:off x="0" y="0"/>
-                      <a:ext cx="8412480" cy="7457492"/>
+                      <a:ext cx="5486400" cy="4975894"/>
                     </a:xfrm>
                     <a:prstGeom prst="rect"/>
                   </pic:spPr>
@@ -9682,16 +10201,6 @@
     </w:p>
     <w:p>
       <w:pPr>
-        <w:sectPr>
-          <w:pgSz w:w="15840" w:h="12240" w:orient="landscape"/>
-          <w:pgMar w:top="1440" w:right="1800" w:bottom="1440" w:left="1800" w:header="720" w:footer="720" w:gutter="0"/>
-          <w:cols w:space="720"/>
-          <w:docGrid w:linePitch="360"/>
-        </w:sectPr>
-      </w:pPr>
-    </w:p>
-    <w:p>
-      <w:pPr>
         <w:pStyle w:val="Heading2"/>
       </w:pPr>
       <w:r>
@@ -9706,7 +10215,7 @@
         <w:rPr>
           <w:sz w:val="18"/>
         </w:rPr>
-        <w:t>1. Cliente abre /agendamento/ (GET agendamento_publico) e recebe o wizard com procedimentos (preço com a promoção da data), fichas de anamnese aplicáveis, termos e a chave do Turnstile.</w:t>
+        <w:t>A cliente abre /agendamento/; o wizard recebe o catálogo com o preço da data (promoção), os termos e as fichas aplicáveis.</w:t>
       </w:r>
     </w:p>
     <w:p>
@@ -9717,7 +10226,7 @@
         <w:rPr>
           <w:sz w:val="18"/>
         </w:rPr>
-        <w:t>2. Ao escolher procedimento e data, o wizard.js consulta /ajax/dias-disponiveis/ e /ajax/horarios-disponiveis/; o SlotService devolve os horários livres por profissional.</w:t>
+        <w:t>Escolhe procedimento e data; o wizard consulta /ajax/dias-disponiveis/ e /ajax/horarios-disponiveis/ (SlotService sobre agenda_horario, agenda_excecao e atendimentos ativos).</w:t>
       </w:r>
     </w:p>
     <w:p>
@@ -9728,7 +10237,7 @@
         <w:rPr>
           <w:sz w:val="18"/>
         </w:rPr>
-        <w:t>3. Cliente preenche nome, celular, nascimento, e-mail (opcional), escolhe os consentimentos de comunicação (desmarcados), aceita a Política de Privacidade e os termos do procedimento e responde a ficha (com o consentimento do art. 11).</w:t>
+        <w:t>Escolhe o horário e o profissional e avança com o botão Continuar.</w:t>
       </w:r>
     </w:p>
     <w:p>
@@ -9739,7 +10248,7 @@
         <w:rPr>
           <w:sz w:val="18"/>
         </w:rPr>
-        <w:t>4. Pede o código: POST solicitar_otp_agendamento (5/min por IP) valida o Turnstile, recusa telefone fixo, checa intervalo de 60 s e cotas de SMS antes de gerar o código (HMAC) e envia pela Zenvia (válido 10 min). A resposta não revela se o telefone é cadastrado.</w:t>
+        <w:t>Informa nome, celular, nascimento e e-mail opcional; marca (nunca pré-marcadas) as autorizações de comunicação; aceita a Política de Privacidade e os termos; responde a ficha e o consentimento de saúde.</w:t>
       </w:r>
     </w:p>
     <w:p>
@@ -9750,7 +10259,7 @@
         <w:rPr>
           <w:sz w:val="18"/>
         </w:rPr>
-        <w:t>5. Digita o código: POST verificar_otp_agendamento confere (5 tentativas), troca o id da sessão e grava o telefone verificado (30 min); devolve o pré-preenchimento do cadastro daquele telefone.</w:t>
+        <w:t>Pede o código: o servidor valida o Turnstile, recusa fixo, confere intervalo de 60 s e cotas de SMS e grava o CodigoOtp (HMAC-SHA256); a Zenvia entrega o SMS.</w:t>
       </w:r>
     </w:p>
     <w:p>
@@ -9761,7 +10270,7 @@
         <w:rPr>
           <w:sz w:val="18"/>
         </w:rPr>
-        <w:t>6. Confirma: POST confirmar_agendamento (10/min por IP) checa honeypot, campos obrigatórios, aceite da política e se o telefone do formulário é o verificado na sessão.</w:t>
+        <w:t>Digita o código: até 5 tentativas; o telefone fica verificado na sessão por 30 min e o cadastro daquele telefone pré-preenche o formulário.</w:t>
       </w:r>
     </w:p>
     <w:p>
@@ -9772,7 +10281,7 @@
         <w:rPr>
           <w:sz w:val="18"/>
         </w:rPr>
-        <w:t>7. O servidor valida e-mail, idade ≥ 18, procedimento/profissional ativos e habilitação, data futura, feriado, slot livre (SlotService), ficha contra o schema + consentimento art. 11, termos de procedimento aceitos e e-mail que não pertença a outro cadastro.</w:t>
+        <w:t>Confirma: o servidor exige o telefone do formulário = o verificado, o aceite da política e idade ≥ 18.</w:t>
       </w:r>
     </w:p>
     <w:p>
@@ -9783,7 +10292,7 @@
         <w:rPr>
           <w:sz w:val="18"/>
         </w:rPr>
-        <w:t>8. Trava o slot no cache (30 s) para serializar confirmações simultâneas.</w:t>
+        <w:t>services/agenda.validar_horario revalida habilitação, horário futuro, feriado/recesso e o slot.</w:t>
       </w:r>
     </w:p>
     <w:p>
@@ -9794,7 +10303,7 @@
         <w:rPr>
           <w:sz w:val="18"/>
         </w:rPr>
-        <w:t>9. Em transaction.atomic: get_or_create da cliente pelo telefone com SELECT FOR UPDATE (bloqueada online é recusada), atualiza nome, e-mail e consentimentos (data + IP), confere conflito com SELECT FOR UPDATE, calcula preço + promoção da data e cria o atendimento PENDENTE.</w:t>
+        <w:t>Trava do horário no cache (30 s) e transaction.atomic: cliente pelo telefone (SELECT FOR UPDATE), recusa se bloqueada online.</w:t>
       </w:r>
     </w:p>
     <w:p>
@@ -9805,7 +10314,7 @@
         <w:rPr>
           <w:sz w:val="18"/>
         </w:rPr>
-        <w:t>10. Na mesma transação grava os aceites (AceiteTermo.registrar: LGPD vigente + termos, com IP, navegador e SHA-256), as fichas respondidas e a auditoria do consentimento de saúde.</w:t>
+        <w:t>services/consentimentos.registrar_do_wizard grava as concessões/revogações (histórico append-only).</w:t>
       </w:r>
     </w:p>
     <w:p>
@@ -9816,7 +10325,7 @@
         <w:rPr>
           <w:sz w:val="18"/>
         </w:rPr>
-        <w:t>11. Se outro pedido ganhou a corrida, a constraint EXCLUDE (23P01) vira a mensagem "horário acabou de ser reservado" e o wizard é reidratado.</w:t>
+        <w:t>services/agenda.reservar: conflito com SELECT FOR UPDATE, preço da data e INSERT do atendimento PENDENTE num savepoint (corrida perdida para o EXCLUDE vira HorarioIndisponivel).</w:t>
       </w:r>
     </w:p>
     <w:p>
@@ -9827,7 +10336,7 @@
         <w:rPr>
           <w:sz w:val="18"/>
         </w:rPr>
-        <w:t>12. Após o commit: e-mail ao profissional com link para a agenda do dia, push ao profissional e sync do Google Calendar (on_commit).</w:t>
+        <w:t>Na mesma transação: Notificacao EMAIL de aprovação à profissional (fila), AceiteTermo LGPD, de procedimento e SAÚDE (IP, navegador, SHA-256), fichas cifradas e LogAuditoria do consentimento art. 11; a trilha historico_alteracao registra o atendimento.</w:t>
       </w:r>
     </w:p>
     <w:p>
@@ -9838,7 +10347,7 @@
         <w:rPr>
           <w:sz w:val="18"/>
         </w:rPr>
-        <w:t>13. A sessão de OTP é limpa e a página de sucesso mostra o resumo (valor com promoção) e que o pedido aguarda a aprovação da clínica.</w:t>
+        <w:t>Após o commit: e-mail à profissional, push e Google Calendar (best-effort); a trava do cache é liberada.</w:t>
       </w:r>
     </w:p>
     <w:p>
@@ -9849,7 +10358,7 @@
         <w:rPr>
           <w:sz w:val="18"/>
         </w:rPr>
-        <w:t>14. Depois, a clínica aprova (AGENDADO + e-mail de confirmação) ou rejeita (CANCELADO + e-mail) pelo painel ou pelo portal do profissional.</w:t>
+        <w:t>A cliente vê a página de sucesso (aguardando aprovação da clínica); a clínica aprova (AGENDADO + e-mail) ou rejeita.</w:t>
       </w:r>
     </w:p>
     <w:p>
@@ -9882,7 +10391,7 @@
       <w:r>
         <w:drawing>
           <wp:inline xmlns:a="http://schemas.openxmlformats.org/drawingml/2006/main" xmlns:pic="http://schemas.openxmlformats.org/drawingml/2006/picture">
-            <wp:extent cx="8412480" cy="2950806"/>
+            <wp:extent cx="7772400" cy="3537662"/>
             <wp:docPr id="8" name="Picture 8"/>
             <wp:cNvGraphicFramePr>
               <a:graphicFrameLocks noChangeAspect="1"/>
@@ -9903,7 +10412,7 @@
                   <pic:spPr>
                     <a:xfrm>
                       <a:off x="0" y="0"/>
-                      <a:ext cx="8412480" cy="2950806"/>
+                      <a:ext cx="7772400" cy="3537662"/>
                     </a:xfrm>
                     <a:prstGeom prst="rect"/>
                   </pic:spPr>
@@ -10003,7 +10512,7 @@
               <w:rPr>
                 <w:sz w:val="18"/>
               </w:rPr>
-              <w:t>Django App (gunicorn)</w:t>
+              <w:t>Navegador (site público + wizard)</w:t>
             </w:r>
           </w:p>
         </w:tc>
@@ -10017,7 +10526,7 @@
               <w:rPr>
                 <w:sz w:val="18"/>
               </w:rPr>
-              <w:t>Aplicação monolítica Django 5.2 (app aranha_estetica + projeto clinica), server-render, servida por gunicorn com 1 worker × 4 threads (timeout 120 s, access log com tokens redigidos). Site público, portal do profissional, painel, API REST somente leitura, cron HTTP, webhooks e healthchecks.</w:t>
+              <w:t>Páginas server-render com Vite, Tailwind CSS v4, Alpine.js (build CSP) e componentes django-cotton; uma entrada JS por tela; fontes locais; PWA com service worker (só páginas públicas).</w:t>
             </w:r>
           </w:p>
         </w:tc>
@@ -10033,7 +10542,7 @@
               <w:rPr>
                 <w:sz w:val="18"/>
               </w:rPr>
-              <w:t>Middlewares de segurança</w:t>
+              <w:t>Navegador (painel ADMIN + portal do profissional)</w:t>
             </w:r>
           </w:p>
         </w:tc>
@@ -10047,7 +10556,7 @@
               <w:rPr>
                 <w:sz w:val="18"/>
               </w:rPr>
-              <w:t>ContentSecurityPolicyMiddleware (CSP com nonce), SecurityHeadersMiddleware (no-store nas áreas privadas, no-referrer nas rotas com token, COOP/CORP/Permissions-Policy), Enforce2FAMiddleware (2FA da equipe a cada request), django-axes e django-ratelimit.</w:t>
+              <w:t>App-shell PWA da equipe com 2FA, Django Forms, calendário (FullCalendar) e Web Push.</w:t>
             </w:r>
           </w:p>
         </w:tc>
@@ -10063,7 +10572,7 @@
               <w:rPr>
                 <w:sz w:val="18"/>
               </w:rPr>
-              <w:t>Serviços, FSM, signals e EventBus</w:t>
+              <w:t>Django App (gunicorn)</w:t>
             </w:r>
           </w:p>
         </w:tc>
@@ -10077,7 +10586,7 @@
               <w:rPr>
                 <w:sz w:val="18"/>
               </w:rPr>
-              <w:t>Regras em services/ e utils/ (SlotService, OTP, preços, termos, LGPD, alertas, comissão, cashback, retorno, lista de espera). FSM do atendimento no model; signals para faltas, pacote, lista de espera e push; EventBus síncrono para comissão, cashback e retorno.</w:t>
+              <w:t>Monólito Django 5.2: views (validação + permissão) → services/utils (regra de negócio) → models (FSM, managers, constraints). Middlewares de CSP com nonce, headers, 2FA, axes, rate-limit e ContextoBancoMiddleware (Ator da requisição).</w:t>
             </w:r>
           </w:p>
         </w:tc>
@@ -10093,7 +10602,7 @@
               <w:rPr>
                 <w:sz w:val="18"/>
               </w:rPr>
-              <w:t>Celery (eager) + cron HTTP</w:t>
+              <w:t>services/agenda e services/atendimento</w:t>
             </w:r>
           </w:p>
         </w:tc>
@@ -10107,7 +10616,7 @@
               <w:rPr>
                 <w:sz w:val="18"/>
               </w:rPr>
-              <w:t>Tasks Celery rodam em modo eager em produção (sem worker e sem retry síncrono); jobs periódicos chamados por cron externo em /cron/run/&lt;job&gt;/. Worker real opcional (CELERY_WORKER_ENABLED).</w:t>
+              <w:t>Fonte única das regras de horário (validar_horario, reservar, reagendar, mover) e dos efeitos de criar/mudar status do atendimento, chamados explicitamente na transação da FSM.</w:t>
             </w:r>
           </w:p>
         </w:tc>
@@ -10123,7 +10632,7 @@
               <w:rPr>
                 <w:sz w:val="18"/>
               </w:rPr>
-              <w:t>PostgreSQL 18</w:t>
+              <w:t>Jobs (jobs.py, jobs_manutencao.py)</w:t>
             </w:r>
           </w:p>
         </w:tc>
@@ -10137,7 +10646,7 @@
               <w:rPr>
                 <w:sz w:val="18"/>
               </w:rPr>
-              <w:t>Banco principal (34 tabelas de domínio) com EXCLUDE anti double-booking, UNIQUE parciais, CHECKs, triggers de imutabilidade e collation pt_br. SQLite em desenvolvimento e testes rápidos.</w:t>
+              <w:t>Funções chamadas pelo cron HTTP /cron/run/&lt;job&gt;/ (X-Cron-Token) ou por manage.py rodar_job; sem Celery nem worker de fila.</w:t>
             </w:r>
           </w:p>
         </w:tc>
@@ -10153,7 +10662,7 @@
               <w:rPr>
                 <w:sz w:val="18"/>
               </w:rPr>
-              <w:t>Cache e sessão</w:t>
+              <w:t>Fila de e-mail (notificacao)</w:t>
             </w:r>
           </w:p>
         </w:tc>
@@ -10167,7 +10676,7 @@
               <w:rPr>
                 <w:sz w:val="18"/>
               </w:rPr>
-              <w:t>LocMemCache + sessão no banco (1 worker): rate-limit, axes, trava de slot e cotas de SMS. REDIS_URL opcional troca para Redis (necessário com mais de um worker).</w:t>
+              <w:t>E-mail transacional gravado como Notificacao PENDENTE na transação, enviado no on_commit e reenviado pelo job emails com espera crescente.</w:t>
             </w:r>
           </w:p>
         </w:tc>
@@ -10183,7 +10692,7 @@
               <w:rPr>
                 <w:sz w:val="18"/>
               </w:rPr>
-              <w:t>Front-end (Vite + Tailwind + Alpine + cotton)</w:t>
+              <w:t>PostgreSQL 18</w:t>
             </w:r>
           </w:p>
         </w:tc>
@@ -10197,7 +10706,7 @@
               <w:rPr>
                 <w:sz w:val="18"/>
               </w:rPr>
-              <w:t>Bundle Vite com Tailwind v4 e Alpine CSP servido pelo django-vite; componentes django-cotton; JS estático do wizard; estáticos com hash e compressão pelo WhiteNoise.</w:t>
+              <w:t>36 tabelas de domínio no padrão SQL; invariantes por EXCLUDE, CHECK, UNIQUE parciais e 46 triggers; trilha historico_alteracao; 23 funções fn_*, 9 views vw_* de relatório e 4 procedures sp_* (retenção/LGPD, expiração de pacotes); extensões btree_gist, pg_trgm e unaccent.</w:t>
             </w:r>
           </w:p>
         </w:tc>
@@ -10213,7 +10722,7 @@
               <w:rPr>
                 <w:sz w:val="18"/>
               </w:rPr>
-              <w:t>PWA e Web Push</w:t>
+              <w:t>Cache e sessão</w:t>
             </w:r>
           </w:p>
         </w:tc>
@@ -10227,7 +10736,7 @@
               <w:rPr>
                 <w:sz w:val="18"/>
               </w:rPr>
-              <w:t>Manifest do site e da equipe, service worker v7 (só páginas públicas em cache), push VAPID ao profissional.</w:t>
+              <w:t>LocMemCache + sessão no banco (1 worker); REDIS_URL troca para django-redis.</w:t>
             </w:r>
           </w:p>
         </w:tc>
@@ -10243,7 +10752,7 @@
               <w:rPr>
                 <w:sz w:val="18"/>
               </w:rPr>
-              <w:t>Railway (Docker)</w:t>
+              <w:t>WhiteNoise</w:t>
             </w:r>
           </w:p>
         </w:tc>
@@ -10257,7 +10766,37 @@
               <w:rPr>
                 <w:sz w:val="18"/>
               </w:rPr>
-              <w:t>Imagem multi-stage (Node 22 → Python 3.12), pre-deploy com migrate_atomico + bootstrap_admin, healthcheck /healthz/, 1 réplica.</w:t>
+              <w:t>Estáticos comprimidos e com hash servidos pelo próprio processo.</w:t>
+            </w:r>
+          </w:p>
+        </w:tc>
+      </w:tr>
+      <w:tr>
+        <w:tc>
+          <w:tcPr>
+            <w:tcW w:type="dxa" w:w="2592"/>
+          </w:tcPr>
+          <w:p>
+            <w:r/>
+            <w:r>
+              <w:rPr>
+                <w:sz w:val="18"/>
+              </w:rPr>
+              <w:t>Pre-deploy (Railway)</w:t>
+            </w:r>
+          </w:p>
+        </w:tc>
+        <w:tc>
+          <w:tcPr>
+            <w:tcW w:type="dxa" w:w="7056"/>
+          </w:tcPr>
+          <w:p>
+            <w:r/>
+            <w:r>
+              <w:rPr>
+                <w:sz w:val="18"/>
+              </w:rPr>
+              <w:t>migrate_atomico (todas as migrations numa transação, com lock_timeout) + bootstrap_admin; imagem Docker multi-stage com usuário não-root e healthcheck.</w:t>
             </w:r>
           </w:p>
         </w:tc>
@@ -10297,7 +10836,7 @@
                 <w:color w:val="FFFFFF"/>
                 <w:sz w:val="19"/>
               </w:rPr>
-              <w:t>Servico</w:t>
+              <w:t>Serviço</w:t>
             </w:r>
           </w:p>
         </w:tc>
@@ -10344,7 +10883,7 @@
               <w:rPr>
                 <w:sz w:val="18"/>
               </w:rPr>
-              <w:t>Único canal de OTP (agendamento, Meus agendamentos, DSAR), só para celular, com cotas por telefone/IP/global. Sem provedor: falha fechada e o site orienta o WhatsApp. Webhook de status com IP permitido e/ou HMAC.</w:t>
+              <w:t>OTP do agendamento, do "Meus agendamentos" e do DSAR (só celular), com cotas; webhook de status autenticado. Sem configuração o agendamento online fecha e o botão Agendar leva ao WhatsApp.</w:t>
             </w:r>
           </w:p>
         </w:tc>
@@ -10374,7 +10913,7 @@
               <w:rPr>
                 <w:sz w:val="18"/>
               </w:rPr>
-              <w:t>Templates aprovados: lembrete D-1 com links de confirmar/cancelar, NPS pós-atendimento e aviso de vaga da lista de espera; sempre com consentimento. Webhook com handshake e assinatura X-Hub-Signature-256 captura a nota de NPS.</w:t>
+              <w:t>Templates de lembrete D-1, NPS e aviso de vaga; webhook assinado (X-Hub-Signature-256) captura a nota do NPS.</w:t>
             </w:r>
           </w:p>
         </w:tc>
@@ -10390,7 +10929,7 @@
               <w:rPr>
                 <w:sz w:val="18"/>
               </w:rPr>
-              <w:t>Provedor de e-mail</w:t>
+              <w:t>E-mail (backend Django)</w:t>
             </w:r>
           </w:p>
         </w:tc>
@@ -10404,7 +10943,7 @@
               <w:rPr>
                 <w:sz w:val="18"/>
               </w:rPr>
-              <w:t>Backend Django configurável (SMTP ou HTTP): aprovação/rejeição, cancelamento, termos, lista de espera, pacote expirando, aviso ao profissional, reset/convite de senha, contato, aniversário e promoções (com List-Unsubscribe e HTML sanitizado). Sem backend real nada é enviado.</w:t>
+              <w:t>Transacional pela fila (aprovação, rejeição, cancelamento, aviso à profissional), termos, pacote expirando, reset/convite de senha e marketing com List-Unsubscribe.</w:t>
             </w:r>
           </w:p>
         </w:tc>
@@ -10420,7 +10959,7 @@
               <w:rPr>
                 <w:sz w:val="18"/>
               </w:rPr>
-              <w:t>Cloudflare Turnstile</w:t>
+              <w:t>Web Push (VAPID)</w:t>
             </w:r>
           </w:p>
         </w:tc>
@@ -10434,7 +10973,7 @@
               <w:rPr>
                 <w:sz w:val="18"/>
               </w:rPr>
-              <w:t>Captcha no pedido de código SMS (wizard e Meus agendamentos), verificado no servidor com o IP da cliente.</w:t>
+              <w:t>Aviso de novo agendamento ao profissional.</w:t>
             </w:r>
           </w:p>
         </w:tc>
@@ -10450,7 +10989,7 @@
               <w:rPr>
                 <w:sz w:val="18"/>
               </w:rPr>
-              <w:t>Google Calendar (opcional)</w:t>
+              <w:t>Google Calendar</w:t>
             </w:r>
           </w:p>
         </w:tc>
@@ -10464,7 +11003,7 @@
               <w:rPr>
                 <w:sz w:val="18"/>
               </w:rPr>
-              <w:t>OAuth por profissional: envio do atendimento novo e leitura de eventos; feed iCal próprio com token rotacionável.</w:t>
+              <w:t>Push do atendimento novo e importação de eventos como bloqueio (OAuth por profissional, token cifrado; opcional).</w:t>
             </w:r>
           </w:p>
         </w:tc>
@@ -10480,7 +11019,7 @@
               <w:rPr>
                 <w:sz w:val="18"/>
               </w:rPr>
-              <w:t>Sentry (opcional)</w:t>
+              <w:t>Cloudflare Turnstile</w:t>
             </w:r>
           </w:p>
         </w:tc>
@@ -10494,7 +11033,7 @@
               <w:rPr>
                 <w:sz w:val="18"/>
               </w:rPr>
-              <w:t>Monitoramento de erros com PII e tokens removidos antes do envio.</w:t>
+              <w:t>Captcha no pedido de código OTP.</w:t>
             </w:r>
           </w:p>
         </w:tc>
@@ -10510,7 +11049,7 @@
               <w:rPr>
                 <w:sz w:val="18"/>
               </w:rPr>
-              <w:t>Railway</w:t>
+              <w:t>Sentry</w:t>
             </w:r>
           </w:p>
         </w:tc>
@@ -10524,7 +11063,1534 @@
               <w:rPr>
                 <w:sz w:val="18"/>
               </w:rPr>
-              <w:t>Hospedagem (Docker), Postgres gerenciado, variáveis de ambiente e agendamento (Railway Cron, opcional).</w:t>
+              <w:t>Erros e transações amostradas sem PII (scrubber de contato, saúde e tokens); opcional.</w:t>
+            </w:r>
+          </w:p>
+        </w:tc>
+      </w:tr>
+    </w:tbl>
+    <w:p/>
+    <w:p>
+      <w:pPr>
+        <w:pStyle w:val="Heading2"/>
+      </w:pPr>
+      <w:r>
+        <w:t>10.3 Rotas</w:t>
+      </w:r>
+    </w:p>
+    <w:tbl>
+      <w:tblPr>
+        <w:tblStyle w:val="LightGrid-Accent1"/>
+        <w:tblW w:type="auto" w:w="0"/>
+        <w:jc w:val="center"/>
+        <w:tblLook w:firstColumn="1" w:firstRow="1" w:lastColumn="0" w:lastRow="0" w:noHBand="0" w:noVBand="1" w:val="04A0"/>
+      </w:tblPr>
+      <w:tblGrid>
+        <w:gridCol w:w="2880"/>
+        <w:gridCol w:w="2880"/>
+        <w:gridCol w:w="2880"/>
+      </w:tblGrid>
+      <w:tr>
+        <w:tc>
+          <w:tcPr>
+            <w:tcW w:type="dxa" w:w="1440"/>
+            <w:shd w:val="clear" w:fill="7A5F1F"/>
+          </w:tcPr>
+          <w:p>
+            <w:r/>
+            <w:r>
+              <w:rPr>
+                <w:b/>
+                <w:color w:val="FFFFFF"/>
+                <w:sz w:val="19"/>
+              </w:rPr>
+              <w:t>Área</w:t>
+            </w:r>
+          </w:p>
+        </w:tc>
+        <w:tc>
+          <w:tcPr>
+            <w:tcW w:type="dxa" w:w="4176"/>
+            <w:shd w:val="clear" w:fill="7A5F1F"/>
+          </w:tcPr>
+          <w:p>
+            <w:r/>
+            <w:r>
+              <w:rPr>
+                <w:b/>
+                <w:color w:val="FFFFFF"/>
+                <w:sz w:val="19"/>
+              </w:rPr>
+              <w:t>Rota</w:t>
+            </w:r>
+          </w:p>
+        </w:tc>
+        <w:tc>
+          <w:tcPr>
+            <w:tcW w:type="dxa" w:w="4032"/>
+            <w:shd w:val="clear" w:fill="7A5F1F"/>
+          </w:tcPr>
+          <w:p>
+            <w:r/>
+            <w:r>
+              <w:rPr>
+                <w:b/>
+                <w:color w:val="FFFFFF"/>
+                <w:sz w:val="19"/>
+              </w:rPr>
+              <w:t>Função</w:t>
+            </w:r>
+          </w:p>
+        </w:tc>
+      </w:tr>
+      <w:tr>
+        <w:tc>
+          <w:tcPr>
+            <w:tcW w:type="dxa" w:w="1440"/>
+          </w:tcPr>
+          <w:p>
+            <w:r/>
+            <w:r>
+              <w:rPr>
+                <w:sz w:val="18"/>
+              </w:rPr>
+              <w:t>Site público</w:t>
+            </w:r>
+          </w:p>
+        </w:tc>
+        <w:tc>
+          <w:tcPr>
+            <w:tcW w:type="dxa" w:w="4176"/>
+          </w:tcPr>
+          <w:p>
+            <w:r/>
+            <w:r>
+              <w:rPr>
+                <w:sz w:val="18"/>
+              </w:rPr>
+              <w:t>/, /quem-somos/, /equipe/, /especialidades/, /galeria/, /depoimentos/, /promocoes/</w:t>
+            </w:r>
+          </w:p>
+        </w:tc>
+        <w:tc>
+          <w:tcPr>
+            <w:tcW w:type="dxa" w:w="4032"/>
+          </w:tcPr>
+          <w:p>
+            <w:r/>
+            <w:r>
+              <w:rPr>
+                <w:sz w:val="18"/>
+              </w:rPr>
+              <w:t>Páginas institucionais; depoimentos só com autorização + aprovação; promoções com o mesmo preço do agendamento</w:t>
+            </w:r>
+          </w:p>
+        </w:tc>
+      </w:tr>
+      <w:tr>
+        <w:tc>
+          <w:tcPr>
+            <w:tcW w:type="dxa" w:w="1440"/>
+          </w:tcPr>
+          <w:p>
+            <w:r/>
+            <w:r>
+              <w:rPr>
+                <w:sz w:val="18"/>
+              </w:rPr>
+              <w:t>Site público</w:t>
+            </w:r>
+          </w:p>
+        </w:tc>
+        <w:tc>
+          <w:tcPr>
+            <w:tcW w:type="dxa" w:w="4176"/>
+          </w:tcPr>
+          <w:p>
+            <w:r/>
+            <w:r>
+              <w:rPr>
+                <w:sz w:val="18"/>
+              </w:rPr>
+              <w:t>/servicos/faciais/, /servicos/corporais/, /servicos/detalhe/&lt;slug&gt;/</w:t>
+            </w:r>
+          </w:p>
+        </w:tc>
+        <w:tc>
+          <w:tcPr>
+            <w:tcW w:type="dxa" w:w="4032"/>
+          </w:tcPr>
+          <w:p>
+            <w:r/>
+            <w:r>
+              <w:rPr>
+                <w:sz w:val="18"/>
+              </w:rPr>
+              <w:t>Catálogo de serviços</w:t>
+            </w:r>
+          </w:p>
+        </w:tc>
+      </w:tr>
+      <w:tr>
+        <w:tc>
+          <w:tcPr>
+            <w:tcW w:type="dxa" w:w="1440"/>
+          </w:tcPr>
+          <w:p>
+            <w:r/>
+            <w:r>
+              <w:rPr>
+                <w:sz w:val="18"/>
+              </w:rPr>
+              <w:t>Site público</w:t>
+            </w:r>
+          </w:p>
+        </w:tc>
+        <w:tc>
+          <w:tcPr>
+            <w:tcW w:type="dxa" w:w="4176"/>
+          </w:tcPr>
+          <w:p>
+            <w:r/>
+            <w:r>
+              <w:rPr>
+                <w:sz w:val="18"/>
+              </w:rPr>
+              <w:t>/contato/, /termos-de-uso/, /politica-de-privacidade/</w:t>
+            </w:r>
+          </w:p>
+        </w:tc>
+        <w:tc>
+          <w:tcPr>
+            <w:tcW w:type="dxa" w:w="4032"/>
+          </w:tcPr>
+          <w:p>
+            <w:r/>
+            <w:r>
+              <w:rPr>
+                <w:sz w:val="18"/>
+              </w:rPr>
+              <w:t>Contato (e-mail do Branding) e textos legais</w:t>
+            </w:r>
+          </w:p>
+        </w:tc>
+      </w:tr>
+      <w:tr>
+        <w:tc>
+          <w:tcPr>
+            <w:tcW w:type="dxa" w:w="1440"/>
+          </w:tcPr>
+          <w:p>
+            <w:r/>
+            <w:r>
+              <w:rPr>
+                <w:sz w:val="18"/>
+              </w:rPr>
+              <w:t>Site público</w:t>
+            </w:r>
+          </w:p>
+        </w:tc>
+        <w:tc>
+          <w:tcPr>
+            <w:tcW w:type="dxa" w:w="4176"/>
+          </w:tcPr>
+          <w:p>
+            <w:r/>
+            <w:r>
+              <w:rPr>
+                <w:sz w:val="18"/>
+              </w:rPr>
+              <w:t>/lista-espera/ (+ sucesso/)</w:t>
+            </w:r>
+          </w:p>
+        </w:tc>
+        <w:tc>
+          <w:tcPr>
+            <w:tcW w:type="dxa" w:w="4032"/>
+          </w:tcPr>
+          <w:p>
+            <w:r/>
+            <w:r>
+              <w:rPr>
+                <w:sz w:val="18"/>
+              </w:rPr>
+              <w:t>Pedido de aviso de vaga</w:t>
+            </w:r>
+          </w:p>
+        </w:tc>
+      </w:tr>
+      <w:tr>
+        <w:tc>
+          <w:tcPr>
+            <w:tcW w:type="dxa" w:w="1440"/>
+          </w:tcPr>
+          <w:p>
+            <w:r/>
+            <w:r>
+              <w:rPr>
+                <w:sz w:val="18"/>
+              </w:rPr>
+              <w:t>Site público</w:t>
+            </w:r>
+          </w:p>
+        </w:tc>
+        <w:tc>
+          <w:tcPr>
+            <w:tcW w:type="dxa" w:w="4176"/>
+          </w:tcPr>
+          <w:p>
+            <w:r/>
+            <w:r>
+              <w:rPr>
+                <w:sz w:val="18"/>
+              </w:rPr>
+              <w:t>/sitemap.xml, /robots.txt, /manifest.json, /sw.js, /favicon.ico</w:t>
+            </w:r>
+          </w:p>
+        </w:tc>
+        <w:tc>
+          <w:tcPr>
+            <w:tcW w:type="dxa" w:w="4032"/>
+          </w:tcPr>
+          <w:p>
+            <w:r/>
+            <w:r>
+              <w:rPr>
+                <w:sz w:val="18"/>
+              </w:rPr>
+              <w:t>SEO e PWA</w:t>
+            </w:r>
+          </w:p>
+        </w:tc>
+      </w:tr>
+      <w:tr>
+        <w:tc>
+          <w:tcPr>
+            <w:tcW w:type="dxa" w:w="1440"/>
+          </w:tcPr>
+          <w:p>
+            <w:r/>
+            <w:r>
+              <w:rPr>
+                <w:sz w:val="18"/>
+              </w:rPr>
+              <w:t>Agendamento</w:t>
+            </w:r>
+          </w:p>
+        </w:tc>
+        <w:tc>
+          <w:tcPr>
+            <w:tcW w:type="dxa" w:w="4176"/>
+          </w:tcPr>
+          <w:p>
+            <w:r/>
+            <w:r>
+              <w:rPr>
+                <w:sz w:val="18"/>
+              </w:rPr>
+              <w:t>/agendamento/, /agendar/&lt;slug&gt;/, /embed/agendar/</w:t>
+            </w:r>
+          </w:p>
+        </w:tc>
+        <w:tc>
+          <w:tcPr>
+            <w:tcW w:type="dxa" w:w="4032"/>
+          </w:tcPr>
+          <w:p>
+            <w:r/>
+            <w:r>
+              <w:rPr>
+                <w:sz w:val="18"/>
+              </w:rPr>
+              <w:t>Wizard (geral, direto por profissional, widget para iframe)</w:t>
+            </w:r>
+          </w:p>
+        </w:tc>
+      </w:tr>
+      <w:tr>
+        <w:tc>
+          <w:tcPr>
+            <w:tcW w:type="dxa" w:w="1440"/>
+          </w:tcPr>
+          <w:p>
+            <w:r/>
+            <w:r>
+              <w:rPr>
+                <w:sz w:val="18"/>
+              </w:rPr>
+              <w:t>Agendamento</w:t>
+            </w:r>
+          </w:p>
+        </w:tc>
+        <w:tc>
+          <w:tcPr>
+            <w:tcW w:type="dxa" w:w="4176"/>
+          </w:tcPr>
+          <w:p>
+            <w:r/>
+            <w:r>
+              <w:rPr>
+                <w:sz w:val="18"/>
+              </w:rPr>
+              <w:t>/ajax/dias-disponiveis/, /ajax/horarios-disponiveis/</w:t>
+            </w:r>
+          </w:p>
+        </w:tc>
+        <w:tc>
+          <w:tcPr>
+            <w:tcW w:type="dxa" w:w="4032"/>
+          </w:tcPr>
+          <w:p>
+            <w:r/>
+            <w:r>
+              <w:rPr>
+                <w:sz w:val="18"/>
+              </w:rPr>
+              <w:t>Dias do mês e horários livres (SlotService)</w:t>
+            </w:r>
+          </w:p>
+        </w:tc>
+      </w:tr>
+      <w:tr>
+        <w:tc>
+          <w:tcPr>
+            <w:tcW w:type="dxa" w:w="1440"/>
+          </w:tcPr>
+          <w:p>
+            <w:r/>
+            <w:r>
+              <w:rPr>
+                <w:sz w:val="18"/>
+              </w:rPr>
+              <w:t>Agendamento</w:t>
+            </w:r>
+          </w:p>
+        </w:tc>
+        <w:tc>
+          <w:tcPr>
+            <w:tcW w:type="dxa" w:w="4176"/>
+          </w:tcPr>
+          <w:p>
+            <w:r/>
+            <w:r>
+              <w:rPr>
+                <w:sz w:val="18"/>
+              </w:rPr>
+              <w:t>POST /agendamento/otp/solicitar/, POST /agendamento/otp/verificar/</w:t>
+            </w:r>
+          </w:p>
+        </w:tc>
+        <w:tc>
+          <w:tcPr>
+            <w:tcW w:type="dxa" w:w="4032"/>
+          </w:tcPr>
+          <w:p>
+            <w:r/>
+            <w:r>
+              <w:rPr>
+                <w:sz w:val="18"/>
+              </w:rPr>
+              <w:t>Código OTP do celular (Turnstile quando configurado)</w:t>
+            </w:r>
+          </w:p>
+        </w:tc>
+      </w:tr>
+      <w:tr>
+        <w:tc>
+          <w:tcPr>
+            <w:tcW w:type="dxa" w:w="1440"/>
+          </w:tcPr>
+          <w:p>
+            <w:r/>
+            <w:r>
+              <w:rPr>
+                <w:sz w:val="18"/>
+              </w:rPr>
+              <w:t>Agendamento</w:t>
+            </w:r>
+          </w:p>
+        </w:tc>
+        <w:tc>
+          <w:tcPr>
+            <w:tcW w:type="dxa" w:w="4176"/>
+          </w:tcPr>
+          <w:p>
+            <w:r/>
+            <w:r>
+              <w:rPr>
+                <w:sz w:val="18"/>
+              </w:rPr>
+              <w:t>POST /agendamento/confirmar/, /agendamento/sucesso/</w:t>
+            </w:r>
+          </w:p>
+        </w:tc>
+        <w:tc>
+          <w:tcPr>
+            <w:tcW w:type="dxa" w:w="4032"/>
+          </w:tcPr>
+          <w:p>
+            <w:r/>
+            <w:r>
+              <w:rPr>
+                <w:sz w:val="18"/>
+              </w:rPr>
+              <w:t>Grava o atendimento PENDENTE</w:t>
+            </w:r>
+          </w:p>
+        </w:tc>
+      </w:tr>
+      <w:tr>
+        <w:tc>
+          <w:tcPr>
+            <w:tcW w:type="dxa" w:w="1440"/>
+          </w:tcPr>
+          <w:p>
+            <w:r/>
+            <w:r>
+              <w:rPr>
+                <w:sz w:val="18"/>
+              </w:rPr>
+              <w:t>Cliente</w:t>
+            </w:r>
+          </w:p>
+        </w:tc>
+        <w:tc>
+          <w:tcPr>
+            <w:tcW w:type="dxa" w:w="4176"/>
+          </w:tcPr>
+          <w:p>
+            <w:r/>
+            <w:r>
+              <w:rPr>
+                <w:sz w:val="18"/>
+              </w:rPr>
+              <w:t>/meus-agendamentos/ (+ otp/enviar/, otp/verificar/, sair/)</w:t>
+            </w:r>
+          </w:p>
+        </w:tc>
+        <w:tc>
+          <w:tcPr>
+            <w:tcW w:type="dxa" w:w="4032"/>
+          </w:tcPr>
+          <w:p>
+            <w:r/>
+            <w:r>
+              <w:rPr>
+                <w:sz w:val="18"/>
+              </w:rPr>
+              <w:t>Portal da cliente (código sempre ao celular)</w:t>
+            </w:r>
+          </w:p>
+        </w:tc>
+      </w:tr>
+      <w:tr>
+        <w:tc>
+          <w:tcPr>
+            <w:tcW w:type="dxa" w:w="1440"/>
+          </w:tcPr>
+          <w:p>
+            <w:r/>
+            <w:r>
+              <w:rPr>
+                <w:sz w:val="18"/>
+              </w:rPr>
+              <w:t>Cliente</w:t>
+            </w:r>
+          </w:p>
+        </w:tc>
+        <w:tc>
+          <w:tcPr>
+            <w:tcW w:type="dxa" w:w="4176"/>
+          </w:tcPr>
+          <w:p>
+            <w:r/>
+            <w:r>
+              <w:rPr>
+                <w:sz w:val="18"/>
+              </w:rPr>
+              <w:t>/meus-agendamentos/&lt;id&gt;/reagendar/ (+ &lt;id&gt;/horarios/), POST /ajax/cancelar-agendamento/</w:t>
+            </w:r>
+          </w:p>
+        </w:tc>
+        <w:tc>
+          <w:tcPr>
+            <w:tcW w:type="dxa" w:w="4032"/>
+          </w:tcPr>
+          <w:p>
+            <w:r/>
+            <w:r>
+              <w:rPr>
+                <w:sz w:val="18"/>
+              </w:rPr>
+              <w:t>Reagendar e cancelar pela sessão do portal</w:t>
+            </w:r>
+          </w:p>
+        </w:tc>
+      </w:tr>
+      <w:tr>
+        <w:tc>
+          <w:tcPr>
+            <w:tcW w:type="dxa" w:w="1440"/>
+          </w:tcPr>
+          <w:p>
+            <w:r/>
+            <w:r>
+              <w:rPr>
+                <w:sz w:val="18"/>
+              </w:rPr>
+              <w:t>Cliente</w:t>
+            </w:r>
+          </w:p>
+        </w:tc>
+        <w:tc>
+          <w:tcPr>
+            <w:tcW w:type="dxa" w:w="4176"/>
+          </w:tcPr>
+          <w:p>
+            <w:r/>
+            <w:r>
+              <w:rPr>
+                <w:sz w:val="18"/>
+              </w:rPr>
+              <w:t>/reagendar/&lt;token&gt;/ (+ horarios/)</w:t>
+            </w:r>
+          </w:p>
+        </w:tc>
+        <w:tc>
+          <w:tcPr>
+            <w:tcW w:type="dxa" w:w="4032"/>
+          </w:tcPr>
+          <w:p>
+            <w:r/>
+            <w:r>
+              <w:rPr>
+                <w:sz w:val="18"/>
+              </w:rPr>
+              <w:t>Reagendar pelo link legado (nenhum link novo é emitido)</w:t>
+            </w:r>
+          </w:p>
+        </w:tc>
+      </w:tr>
+      <w:tr>
+        <w:tc>
+          <w:tcPr>
+            <w:tcW w:type="dxa" w:w="1440"/>
+          </w:tcPr>
+          <w:p>
+            <w:r/>
+            <w:r>
+              <w:rPr>
+                <w:sz w:val="18"/>
+              </w:rPr>
+              <w:t>Cliente</w:t>
+            </w:r>
+          </w:p>
+        </w:tc>
+        <w:tc>
+          <w:tcPr>
+            <w:tcW w:type="dxa" w:w="4176"/>
+          </w:tcPr>
+          <w:p>
+            <w:r/>
+            <w:r>
+              <w:rPr>
+                <w:sz w:val="18"/>
+              </w:rPr>
+              <w:t>/confirmar/&lt;token&gt;/, /termo/&lt;token&gt;/, /nps/&lt;token&gt;/</w:t>
+            </w:r>
+          </w:p>
+        </w:tc>
+        <w:tc>
+          <w:tcPr>
+            <w:tcW w:type="dxa" w:w="4032"/>
+          </w:tcPr>
+          <w:p>
+            <w:r/>
+            <w:r>
+              <w:rPr>
+                <w:sz w:val="18"/>
+              </w:rPr>
+              <w:t>Confirmar presença (D-1), aceitar termos, responder NPS</w:t>
+            </w:r>
+          </w:p>
+        </w:tc>
+      </w:tr>
+      <w:tr>
+        <w:tc>
+          <w:tcPr>
+            <w:tcW w:type="dxa" w:w="1440"/>
+          </w:tcPr>
+          <w:p>
+            <w:r/>
+            <w:r>
+              <w:rPr>
+                <w:sz w:val="18"/>
+              </w:rPr>
+              <w:t>Cliente</w:t>
+            </w:r>
+          </w:p>
+        </w:tc>
+        <w:tc>
+          <w:tcPr>
+            <w:tcW w:type="dxa" w:w="4176"/>
+          </w:tcPr>
+          <w:p>
+            <w:r/>
+            <w:r>
+              <w:rPr>
+                <w:sz w:val="18"/>
+              </w:rPr>
+              <w:t>/anamnese/&lt;token&gt;/, /pesquisa/&lt;token&gt;/ (+ obrigado/)</w:t>
+            </w:r>
+          </w:p>
+        </w:tc>
+        <w:tc>
+          <w:tcPr>
+            <w:tcW w:type="dxa" w:w="4032"/>
+          </w:tcPr>
+          <w:p>
+            <w:r/>
+            <w:r>
+              <w:rPr>
+                <w:sz w:val="18"/>
+              </w:rPr>
+              <w:t>Ficha e pesquisa por link (mantidas, hoje sem produtor de link)</w:t>
+            </w:r>
+          </w:p>
+        </w:tc>
+      </w:tr>
+      <w:tr>
+        <w:tc>
+          <w:tcPr>
+            <w:tcW w:type="dxa" w:w="1440"/>
+          </w:tcPr>
+          <w:p>
+            <w:r/>
+            <w:r>
+              <w:rPr>
+                <w:sz w:val="18"/>
+              </w:rPr>
+              <w:t>Cliente</w:t>
+            </w:r>
+          </w:p>
+        </w:tc>
+        <w:tc>
+          <w:tcPr>
+            <w:tcW w:type="dxa" w:w="4176"/>
+          </w:tcPr>
+          <w:p>
+            <w:r/>
+            <w:r>
+              <w:rPr>
+                <w:sz w:val="18"/>
+              </w:rPr>
+              <w:t>/lgpd/meus-dados/, /lgpd/unsubscribe/&lt;token&gt;/, /lgpd/aceitar-cookies/</w:t>
+            </w:r>
+          </w:p>
+        </w:tc>
+        <w:tc>
+          <w:tcPr>
+            <w:tcW w:type="dxa" w:w="4032"/>
+          </w:tcPr>
+          <w:p>
+            <w:r/>
+            <w:r>
+              <w:rPr>
+                <w:sz w:val="18"/>
+              </w:rPr>
+              <w:t>DSAR com OTP, descadastro, aviso de cookies</w:t>
+            </w:r>
+          </w:p>
+        </w:tc>
+      </w:tr>
+      <w:tr>
+        <w:tc>
+          <w:tcPr>
+            <w:tcW w:type="dxa" w:w="1440"/>
+          </w:tcPr>
+          <w:p>
+            <w:r/>
+            <w:r>
+              <w:rPr>
+                <w:sz w:val="18"/>
+              </w:rPr>
+              <w:t>Equipe</w:t>
+            </w:r>
+          </w:p>
+        </w:tc>
+        <w:tc>
+          <w:tcPr>
+            <w:tcW w:type="dxa" w:w="4176"/>
+          </w:tcPr>
+          <w:p>
+            <w:r/>
+            <w:r>
+              <w:rPr>
+                <w:sz w:val="18"/>
+              </w:rPr>
+              <w:t>/admin-login/, /admin-logout/, /admin-login/recuperar/…</w:t>
+            </w:r>
+          </w:p>
+        </w:tc>
+        <w:tc>
+          <w:tcPr>
+            <w:tcW w:type="dxa" w:w="4032"/>
+          </w:tcPr>
+          <w:p>
+            <w:r/>
+            <w:r>
+              <w:rPr>
+                <w:sz w:val="18"/>
+              </w:rPr>
+              <w:t>Login da equipe (logout só via POST) e reset de senha</w:t>
+            </w:r>
+          </w:p>
+        </w:tc>
+      </w:tr>
+      <w:tr>
+        <w:tc>
+          <w:tcPr>
+            <w:tcW w:type="dxa" w:w="1440"/>
+          </w:tcPr>
+          <w:p>
+            <w:r/>
+            <w:r>
+              <w:rPr>
+                <w:sz w:val="18"/>
+              </w:rPr>
+              <w:t>Equipe</w:t>
+            </w:r>
+          </w:p>
+        </w:tc>
+        <w:tc>
+          <w:tcPr>
+            <w:tcW w:type="dxa" w:w="4176"/>
+          </w:tcPr>
+          <w:p>
+            <w:r/>
+            <w:r>
+              <w:rPr>
+                <w:sz w:val="18"/>
+              </w:rPr>
+              <w:t>/painel/seguranca/2fa/ (+ verificar/, challenge/)</w:t>
+            </w:r>
+          </w:p>
+        </w:tc>
+        <w:tc>
+          <w:tcPr>
+            <w:tcW w:type="dxa" w:w="4032"/>
+          </w:tcPr>
+          <w:p>
+            <w:r/>
+            <w:r>
+              <w:rPr>
+                <w:sz w:val="18"/>
+              </w:rPr>
+              <w:t>Cadastro e desafio TOTP</w:t>
+            </w:r>
+          </w:p>
+        </w:tc>
+      </w:tr>
+      <w:tr>
+        <w:tc>
+          <w:tcPr>
+            <w:tcW w:type="dxa" w:w="1440"/>
+          </w:tcPr>
+          <w:p>
+            <w:r/>
+            <w:r>
+              <w:rPr>
+                <w:sz w:val="18"/>
+              </w:rPr>
+              <w:t>Equipe</w:t>
+            </w:r>
+          </w:p>
+        </w:tc>
+        <w:tc>
+          <w:tcPr>
+            <w:tcW w:type="dxa" w:w="4176"/>
+          </w:tcPr>
+          <w:p>
+            <w:r/>
+            <w:r>
+              <w:rPr>
+                <w:sz w:val="18"/>
+              </w:rPr>
+              <w:t>/profissional/ (+ atendimento/&lt;pk&gt;/{realizado,anotar,aprovar,rejeitar}/, calendario/novo-link/)</w:t>
+            </w:r>
+          </w:p>
+        </w:tc>
+        <w:tc>
+          <w:tcPr>
+            <w:tcW w:type="dxa" w:w="4032"/>
+          </w:tcPr>
+          <w:p>
+            <w:r/>
+            <w:r>
+              <w:rPr>
+                <w:sz w:val="18"/>
+              </w:rPr>
+              <w:t>Portal do profissional e link do próprio feed iCal</w:t>
+            </w:r>
+          </w:p>
+        </w:tc>
+      </w:tr>
+      <w:tr>
+        <w:tc>
+          <w:tcPr>
+            <w:tcW w:type="dxa" w:w="1440"/>
+          </w:tcPr>
+          <w:p>
+            <w:r/>
+            <w:r>
+              <w:rPr>
+                <w:sz w:val="18"/>
+              </w:rPr>
+              <w:t>Equipe</w:t>
+            </w:r>
+          </w:p>
+        </w:tc>
+        <w:tc>
+          <w:tcPr>
+            <w:tcW w:type="dxa" w:w="4176"/>
+          </w:tcPr>
+          <w:p>
+            <w:r/>
+            <w:r>
+              <w:rPr>
+                <w:sz w:val="18"/>
+              </w:rPr>
+              <w:t>/agenda/&lt;slug&gt;/feed.ics?token=</w:t>
+            </w:r>
+          </w:p>
+        </w:tc>
+        <w:tc>
+          <w:tcPr>
+            <w:tcW w:type="dxa" w:w="4032"/>
+          </w:tcPr>
+          <w:p>
+            <w:r/>
+            <w:r>
+              <w:rPr>
+                <w:sz w:val="18"/>
+              </w:rPr>
+              <w:t>Feed iCal do profissional</w:t>
+            </w:r>
+          </w:p>
+        </w:tc>
+      </w:tr>
+      <w:tr>
+        <w:tc>
+          <w:tcPr>
+            <w:tcW w:type="dxa" w:w="1440"/>
+          </w:tcPr>
+          <w:p>
+            <w:r/>
+            <w:r>
+              <w:rPr>
+                <w:sz w:val="18"/>
+              </w:rPr>
+              <w:t>Painel</w:t>
+            </w:r>
+          </w:p>
+        </w:tc>
+        <w:tc>
+          <w:tcPr>
+            <w:tcW w:type="dxa" w:w="4176"/>
+          </w:tcPr>
+          <w:p>
+            <w:r/>
+            <w:r>
+              <w:rPr>
+                <w:sz w:val="18"/>
+              </w:rPr>
+              <w:t>/painel/, /painel/overview/</w:t>
+            </w:r>
+          </w:p>
+        </w:tc>
+        <w:tc>
+          <w:tcPr>
+            <w:tcW w:type="dxa" w:w="4032"/>
+          </w:tcPr>
+          <w:p>
+            <w:r/>
+            <w:r>
+              <w:rPr>
+                <w:sz w:val="18"/>
+              </w:rPr>
+              <w:t>Dashboard</w:t>
+            </w:r>
+          </w:p>
+        </w:tc>
+      </w:tr>
+      <w:tr>
+        <w:tc>
+          <w:tcPr>
+            <w:tcW w:type="dxa" w:w="1440"/>
+          </w:tcPr>
+          <w:p>
+            <w:r/>
+            <w:r>
+              <w:rPr>
+                <w:sz w:val="18"/>
+              </w:rPr>
+              <w:t>Painel</w:t>
+            </w:r>
+          </w:p>
+        </w:tc>
+        <w:tc>
+          <w:tcPr>
+            <w:tcW w:type="dxa" w:w="4176"/>
+          </w:tcPr>
+          <w:p>
+            <w:r/>
+            <w:r>
+              <w:rPr>
+                <w:sz w:val="18"/>
+              </w:rPr>
+              <w:t>/painel/agendamentos/ (+ novo/, bulk/, &lt;pk&gt;/aprovar|rejeitar|termo-link|valor/), /painel/atualizar-status/</w:t>
+            </w:r>
+          </w:p>
+        </w:tc>
+        <w:tc>
+          <w:tcPr>
+            <w:tcW w:type="dxa" w:w="4032"/>
+          </w:tcPr>
+          <w:p>
+            <w:r/>
+            <w:r>
+              <w:rPr>
+                <w:sz w:val="18"/>
+              </w:rPr>
+              <w:t>Agenda em lista, agendamento interno, aprovação, link do termo, valor cobrado, mudança de status</w:t>
+            </w:r>
+          </w:p>
+        </w:tc>
+      </w:tr>
+      <w:tr>
+        <w:tc>
+          <w:tcPr>
+            <w:tcW w:type="dxa" w:w="1440"/>
+          </w:tcPr>
+          <w:p>
+            <w:r/>
+            <w:r>
+              <w:rPr>
+                <w:sz w:val="18"/>
+              </w:rPr>
+              <w:t>Painel</w:t>
+            </w:r>
+          </w:p>
+        </w:tc>
+        <w:tc>
+          <w:tcPr>
+            <w:tcW w:type="dxa" w:w="4176"/>
+          </w:tcPr>
+          <w:p>
+            <w:r/>
+            <w:r>
+              <w:rPr>
+                <w:sz w:val="18"/>
+              </w:rPr>
+              <w:t>/painel/calendario/ (+ eventos/, mover/)</w:t>
+            </w:r>
+          </w:p>
+        </w:tc>
+        <w:tc>
+          <w:tcPr>
+            <w:tcW w:type="dxa" w:w="4032"/>
+          </w:tcPr>
+          <w:p>
+            <w:r/>
+            <w:r>
+              <w:rPr>
+                <w:sz w:val="18"/>
+              </w:rPr>
+              <w:t>Calendário com arrastar-e-soltar</w:t>
+            </w:r>
+          </w:p>
+        </w:tc>
+      </w:tr>
+      <w:tr>
+        <w:tc>
+          <w:tcPr>
+            <w:tcW w:type="dxa" w:w="1440"/>
+          </w:tcPr>
+          <w:p>
+            <w:r/>
+            <w:r>
+              <w:rPr>
+                <w:sz w:val="18"/>
+              </w:rPr>
+              <w:t>Painel</w:t>
+            </w:r>
+          </w:p>
+        </w:tc>
+        <w:tc>
+          <w:tcPr>
+            <w:tcW w:type="dxa" w:w="4176"/>
+          </w:tcPr>
+          <w:p>
+            <w:r/>
+            <w:r>
+              <w:rPr>
+                <w:sz w:val="18"/>
+              </w:rPr>
+              <w:t>/painel/clientes/, /painel/clientes/&lt;pk&gt;/</w:t>
+            </w:r>
+          </w:p>
+        </w:tc>
+        <w:tc>
+          <w:tcPr>
+            <w:tcW w:type="dxa" w:w="4032"/>
+          </w:tcPr>
+          <w:p>
+            <w:r/>
+            <w:r>
+              <w:rPr>
+                <w:sz w:val="18"/>
+              </w:rPr>
+              <w:t>Clientes e ficha (pacotes, alertas, autorizações de comunicação, histórico)</w:t>
+            </w:r>
+          </w:p>
+        </w:tc>
+      </w:tr>
+      <w:tr>
+        <w:tc>
+          <w:tcPr>
+            <w:tcW w:type="dxa" w:w="1440"/>
+          </w:tcPr>
+          <w:p>
+            <w:r/>
+            <w:r>
+              <w:rPr>
+                <w:sz w:val="18"/>
+              </w:rPr>
+              <w:t>Painel</w:t>
+            </w:r>
+          </w:p>
+        </w:tc>
+        <w:tc>
+          <w:tcPr>
+            <w:tcW w:type="dxa" w:w="4176"/>
+          </w:tcPr>
+          <w:p>
+            <w:r/>
+            <w:r>
+              <w:rPr>
+                <w:sz w:val="18"/>
+              </w:rPr>
+              <w:t>/painel/prontuario/ (+ &lt;cliente_id&gt;/, salvar/), /painel/anotacao/&lt;id&gt;/salvar/</w:t>
+            </w:r>
+          </w:p>
+        </w:tc>
+        <w:tc>
+          <w:tcPr>
+            <w:tcW w:type="dxa" w:w="4032"/>
+          </w:tcPr>
+          <w:p>
+            <w:r/>
+            <w:r>
+              <w:rPr>
+                <w:sz w:val="18"/>
+              </w:rPr>
+              <w:t>Prontuário com histórico de versões e anotações</w:t>
+            </w:r>
+          </w:p>
+        </w:tc>
+      </w:tr>
+      <w:tr>
+        <w:tc>
+          <w:tcPr>
+            <w:tcW w:type="dxa" w:w="1440"/>
+          </w:tcPr>
+          <w:p>
+            <w:r/>
+            <w:r>
+              <w:rPr>
+                <w:sz w:val="18"/>
+              </w:rPr>
+              <w:t>Painel</w:t>
+            </w:r>
+          </w:p>
+        </w:tc>
+        <w:tc>
+          <w:tcPr>
+            <w:tcW w:type="dxa" w:w="4176"/>
+          </w:tcPr>
+          <w:p>
+            <w:r/>
+            <w:r>
+              <w:rPr>
+                <w:sz w:val="18"/>
+              </w:rPr>
+              <w:t>/painel/profissionais/… (+ excecoes/, ics/novo-token/), /painel/bloqueios/…</w:t>
+            </w:r>
+          </w:p>
+        </w:tc>
+        <w:tc>
+          <w:tcPr>
+            <w:tcW w:type="dxa" w:w="4032"/>
+          </w:tcPr>
+          <w:p>
+            <w:r/>
+            <w:r>
+              <w:rPr>
+                <w:sz w:val="18"/>
+              </w:rPr>
+              <w:t>Profissionais, exceções de agenda, bloqueios e link do feed iCal</w:t>
+            </w:r>
+          </w:p>
+        </w:tc>
+      </w:tr>
+      <w:tr>
+        <w:tc>
+          <w:tcPr>
+            <w:tcW w:type="dxa" w:w="1440"/>
+          </w:tcPr>
+          <w:p>
+            <w:r/>
+            <w:r>
+              <w:rPr>
+                <w:sz w:val="18"/>
+              </w:rPr>
+              <w:t>Painel</w:t>
+            </w:r>
+          </w:p>
+        </w:tc>
+        <w:tc>
+          <w:tcPr>
+            <w:tcW w:type="dxa" w:w="4176"/>
+          </w:tcPr>
+          <w:p>
+            <w:r/>
+            <w:r>
+              <w:rPr>
+                <w:sz w:val="18"/>
+              </w:rPr>
+              <w:t>/painel/procedimentos/…, /painel/pacotes/… (+ vender/, compras/&lt;pk&gt;/cancelar/), /painel/promocoes/… (+ disparar/)</w:t>
+            </w:r>
+          </w:p>
+        </w:tc>
+        <w:tc>
+          <w:tcPr>
+            <w:tcW w:type="dxa" w:w="4032"/>
+          </w:tcPr>
+          <w:p>
+            <w:r/>
+            <w:r>
+              <w:rPr>
+                <w:sz w:val="18"/>
+              </w:rPr>
+              <w:t>Catálogo, pacotes e promoções</w:t>
+            </w:r>
+          </w:p>
+        </w:tc>
+      </w:tr>
+      <w:tr>
+        <w:tc>
+          <w:tcPr>
+            <w:tcW w:type="dxa" w:w="1440"/>
+          </w:tcPr>
+          <w:p>
+            <w:r/>
+            <w:r>
+              <w:rPr>
+                <w:sz w:val="18"/>
+              </w:rPr>
+              <w:t>Painel</w:t>
+            </w:r>
+          </w:p>
+        </w:tc>
+        <w:tc>
+          <w:tcPr>
+            <w:tcW w:type="dxa" w:w="4176"/>
+          </w:tcPr>
+          <w:p>
+            <w:r/>
+            <w:r>
+              <w:rPr>
+                <w:sz w:val="18"/>
+              </w:rPr>
+              <w:t>/painel/financeiro/, /painel/comissoes/ (+ &lt;pk&gt;/pagar/), /painel/nps/ (+ publicacao/), /painel/exportar-relatorio/</w:t>
+            </w:r>
+          </w:p>
+        </w:tc>
+        <w:tc>
+          <w:tcPr>
+            <w:tcW w:type="dxa" w:w="4032"/>
+          </w:tcPr>
+          <w:p>
+            <w:r/>
+            <w:r>
+              <w:rPr>
+                <w:sz w:val="18"/>
+              </w:rPr>
+              <w:t>Relatórios, comissões, NPS e moderação de depoimentos, Excel</w:t>
+            </w:r>
+          </w:p>
+        </w:tc>
+      </w:tr>
+      <w:tr>
+        <w:tc>
+          <w:tcPr>
+            <w:tcW w:type="dxa" w:w="1440"/>
+          </w:tcPr>
+          <w:p>
+            <w:r/>
+            <w:r>
+              <w:rPr>
+                <w:sz w:val="18"/>
+              </w:rPr>
+              <w:t>Painel</w:t>
+            </w:r>
+          </w:p>
+        </w:tc>
+        <w:tc>
+          <w:tcPr>
+            <w:tcW w:type="dxa" w:w="4176"/>
+          </w:tcPr>
+          <w:p>
+            <w:r/>
+            <w:r>
+              <w:rPr>
+                <w:sz w:val="18"/>
+              </w:rPr>
+              <w:t>/painel/lista-espera/ (+ notificar/), /painel/anamneses/…, /painel/termos/ (+ criar/, compliance/)</w:t>
+            </w:r>
+          </w:p>
+        </w:tc>
+        <w:tc>
+          <w:tcPr>
+            <w:tcW w:type="dxa" w:w="4032"/>
+          </w:tcPr>
+          <w:p>
+            <w:r/>
+            <w:r>
+              <w:rPr>
+                <w:sz w:val="18"/>
+              </w:rPr>
+              <w:t>Lista de espera, formulários e termos</w:t>
+            </w:r>
+          </w:p>
+        </w:tc>
+      </w:tr>
+      <w:tr>
+        <w:tc>
+          <w:tcPr>
+            <w:tcW w:type="dxa" w:w="1440"/>
+          </w:tcPr>
+          <w:p>
+            <w:r/>
+            <w:r>
+              <w:rPr>
+                <w:sz w:val="18"/>
+              </w:rPr>
+              <w:t>Painel</w:t>
+            </w:r>
+          </w:p>
+        </w:tc>
+        <w:tc>
+          <w:tcPr>
+            <w:tcW w:type="dxa" w:w="4176"/>
+          </w:tcPr>
+          <w:p>
+            <w:r/>
+            <w:r>
+              <w:rPr>
+                <w:sz w:val="18"/>
+              </w:rPr>
+              <w:t>/painel/notificacoes/, /painel/auditoria/, /painel/usuarios/…, /painel/configuracoes/…, /painel/branding/, /painel/email-preview/</w:t>
+            </w:r>
+          </w:p>
+        </w:tc>
+        <w:tc>
+          <w:tcPr>
+            <w:tcW w:type="dxa" w:w="4032"/>
+          </w:tcPr>
+          <w:p>
+            <w:r/>
+            <w:r>
+              <w:rPr>
+                <w:sz w:val="18"/>
+              </w:rPr>
+              <w:t>Sistema</w:t>
+            </w:r>
+          </w:p>
+        </w:tc>
+      </w:tr>
+      <w:tr>
+        <w:tc>
+          <w:tcPr>
+            <w:tcW w:type="dxa" w:w="1440"/>
+          </w:tcPr>
+          <w:p>
+            <w:r/>
+            <w:r>
+              <w:rPr>
+                <w:sz w:val="18"/>
+              </w:rPr>
+              <w:t>Painel</w:t>
+            </w:r>
+          </w:p>
+        </w:tc>
+        <w:tc>
+          <w:tcPr>
+            <w:tcW w:type="dxa" w:w="4176"/>
+          </w:tcPr>
+          <w:p>
+            <w:r/>
+            <w:r>
+              <w:rPr>
+                <w:sz w:val="18"/>
+              </w:rPr>
+              <w:t>/painel/integrations/google/{connect,callback,pull}/…, /webpush/…, /django-admin-sv/</w:t>
+            </w:r>
+          </w:p>
+        </w:tc>
+        <w:tc>
+          <w:tcPr>
+            <w:tcW w:type="dxa" w:w="4032"/>
+          </w:tcPr>
+          <w:p>
+            <w:r/>
+            <w:r>
+              <w:rPr>
+                <w:sz w:val="18"/>
+              </w:rPr>
+              <w:t>Google Calendar, Web Push e Django admin (só ADMIN com 2FA verificado)</w:t>
+            </w:r>
+          </w:p>
+        </w:tc>
+      </w:tr>
+      <w:tr>
+        <w:tc>
+          <w:tcPr>
+            <w:tcW w:type="dxa" w:w="1440"/>
+          </w:tcPr>
+          <w:p>
+            <w:r/>
+            <w:r>
+              <w:rPr>
+                <w:sz w:val="18"/>
+              </w:rPr>
+              <w:t>Infraestrutura</w:t>
+            </w:r>
+          </w:p>
+        </w:tc>
+        <w:tc>
+          <w:tcPr>
+            <w:tcW w:type="dxa" w:w="4176"/>
+          </w:tcPr>
+          <w:p>
+            <w:r/>
+            <w:r>
+              <w:rPr>
+                <w:sz w:val="18"/>
+              </w:rPr>
+              <w:t>GET/POST /api/whatsapp/webhook/, POST /api/zenvia/webhook/</w:t>
+            </w:r>
+          </w:p>
+        </w:tc>
+        <w:tc>
+          <w:tcPr>
+            <w:tcW w:type="dxa" w:w="4032"/>
+          </w:tcPr>
+          <w:p>
+            <w:r/>
+            <w:r>
+              <w:rPr>
+                <w:sz w:val="18"/>
+              </w:rPr>
+              <w:t>Webhooks autenticados (Meta e Zenvia)</w:t>
+            </w:r>
+          </w:p>
+        </w:tc>
+      </w:tr>
+      <w:tr>
+        <w:tc>
+          <w:tcPr>
+            <w:tcW w:type="dxa" w:w="1440"/>
+          </w:tcPr>
+          <w:p>
+            <w:r/>
+            <w:r>
+              <w:rPr>
+                <w:sz w:val="18"/>
+              </w:rPr>
+              <w:t>Infraestrutura</w:t>
+            </w:r>
+          </w:p>
+        </w:tc>
+        <w:tc>
+          <w:tcPr>
+            <w:tcW w:type="dxa" w:w="4176"/>
+          </w:tcPr>
+          <w:p>
+            <w:r/>
+            <w:r>
+              <w:rPr>
+                <w:sz w:val="18"/>
+              </w:rPr>
+              <w:t>POST /cron/run/&lt;job&gt;/</w:t>
+            </w:r>
+          </w:p>
+        </w:tc>
+        <w:tc>
+          <w:tcPr>
+            <w:tcW w:type="dxa" w:w="4032"/>
+          </w:tcPr>
+          <w:p>
+            <w:r/>
+            <w:r>
+              <w:rPr>
+                <w:sz w:val="18"/>
+              </w:rPr>
+              <w:t>Jobs periódicos (header X-Cron-Token)</w:t>
+            </w:r>
+          </w:p>
+        </w:tc>
+      </w:tr>
+      <w:tr>
+        <w:tc>
+          <w:tcPr>
+            <w:tcW w:type="dxa" w:w="1440"/>
+          </w:tcPr>
+          <w:p>
+            <w:r/>
+            <w:r>
+              <w:rPr>
+                <w:sz w:val="18"/>
+              </w:rPr>
+              <w:t>Infraestrutura</w:t>
+            </w:r>
+          </w:p>
+        </w:tc>
+        <w:tc>
+          <w:tcPr>
+            <w:tcW w:type="dxa" w:w="4176"/>
+          </w:tcPr>
+          <w:p>
+            <w:r/>
+            <w:r>
+              <w:rPr>
+                <w:sz w:val="18"/>
+              </w:rPr>
+              <w:t>/healthz/, /health/</w:t>
+            </w:r>
+          </w:p>
+        </w:tc>
+        <w:tc>
+          <w:tcPr>
+            <w:tcW w:type="dxa" w:w="4032"/>
+          </w:tcPr>
+          <w:p>
+            <w:r/>
+            <w:r>
+              <w:rPr>
+                <w:sz w:val="18"/>
+              </w:rPr>
+              <w:t>Liveness e readiness</w:t>
             </w:r>
           </w:p>
         </w:tc>
@@ -10697,6 +12763,50 @@
           </w:p>
         </w:tc>
       </w:tr>
+      <w:tr>
+        <w:tc>
+          <w:tcPr>
+            <w:tcW w:type="dxa" w:w="1296"/>
+          </w:tcPr>
+          <w:p>
+            <w:r/>
+            <w:r>
+              <w:rPr>
+                <w:sz w:val="18"/>
+              </w:rPr>
+              <w:t>2.3</w:t>
+            </w:r>
+          </w:p>
+        </w:tc>
+        <w:tc>
+          <w:tcPr>
+            <w:tcW w:type="dxa" w:w="1728"/>
+          </w:tcPr>
+          <w:p>
+            <w:r/>
+            <w:r>
+              <w:rPr>
+                <w:sz w:val="18"/>
+              </w:rPr>
+              <w:t>28/10/2026</w:t>
+            </w:r>
+          </w:p>
+        </w:tc>
+        <w:tc>
+          <w:tcPr>
+            <w:tcW w:type="dxa" w:w="6624"/>
+          </w:tcPr>
+          <w:p>
+            <w:r/>
+            <w:r>
+              <w:rPr>
+                <w:sz w:val="18"/>
+              </w:rPr>
+              <w:t>Atualização pós-revisão de outubro/2026 (migrations 0047–0061): termo de saúde, agenda unificada (agenda_horario + agenda_excecao), links públicos em hash (link_acesso), consentimentos com histórico, questionário do prontuário como formulário PRONTUARIO, pacote congelado na venda (compra_pacote_item), comissão como livro-razão, padrão SQL de nomes, lógica no banco (triggers, funções, views e procedures), trilhas imutáveis, cifragem do dado de saúde, fila de e-mail na notificação e saída do Celery (jobs.py/rodar_job); services/agenda e services/atendimento, Ator da requisição, Django Forms no painel, wizard com botão Continuar e PWA. Diagramas UML revisados e tabela de rotas.</w:t>
+            </w:r>
+          </w:p>
+        </w:tc>
+      </w:tr>
     </w:tbl>
     <w:p/>
     <w:sectPr>
@@ -10720,7 +12830,7 @@
       <w:rPr>
         <w:sz w:val="16"/>
       </w:rPr>
-      <w:t xml:space="preserve">Shiva Zen — Requisitos v2.2   |   Pág. </w:t>
+      <w:t xml:space="preserve">Shiva Zen — Requisitos v2.3   |   Pág. </w:t>
       <w:fldChar w:fldCharType="begin"/>
       <w:instrText xml:space="preserve">PAGE</w:instrText>
       <w:fldChar w:fldCharType="end"/>

</xml_diff>